<commit_message>
docs: add semanal lesson plan for Rafael Martins for Sep 28 to Oct 02, 2026
</commit_message>
<xml_diff>
--- a/docs/semanarios/2026-09/semanario-rafael-martins-2026-09-28-a-10-02-semana-a.docx
+++ b/docs/semanarios/2026-09/semanario-rafael-martins-2026-09-28-a-10-02-semana-a.docx
@@ -1,31 +1,49 @@
 
 <file path=word/document.xml><?xml version="1.0" encoding="utf-8"?>
-<w:document xmlns:w="http://schemas.openxmlformats.org/wordprocessingml/2006/main" xmlns:m="http://schemas.openxmlformats.org/officeDocument/2006/math" xmlns:r="http://schemas.openxmlformats.org/officeDocument/2006/relationships" xmlns:o="urn:schemas-microsoft-com:office:office" xmlns:v="urn:schemas-microsoft-com:vml" xmlns:w10="urn:schemas-microsoft-com:office:word" xmlns:a="http://schemas.openxmlformats.org/drawingml/2006/main" xmlns:pic="http://schemas.openxmlformats.org/drawingml/2006/picture" xmlns:wp="http://schemas.openxmlformats.org/drawingml/2006/wordprocessingDrawing">
+<w:document xmlns:mc="http://schemas.openxmlformats.org/markup-compatibility/2006" xmlns:o="urn:schemas-microsoft-com:office:office" xmlns:r="http://schemas.openxmlformats.org/officeDocument/2006/relationships" xmlns:m="http://schemas.openxmlformats.org/officeDocument/2006/math" xmlns:v="urn:schemas-microsoft-com:vml" xmlns:wp="http://schemas.openxmlformats.org/drawingml/2006/wordprocessingDrawing" xmlns:w10="urn:schemas-microsoft-com:office:word" xmlns:w="http://schemas.openxmlformats.org/wordprocessingml/2006/main" xmlns:wne="http://schemas.microsoft.com/office/word/2006/wordml" xmlns:sl="http://schemas.openxmlformats.org/schemaLibrary/2006/main" xmlns:a="http://schemas.openxmlformats.org/drawingml/2006/main" xmlns:pic="http://schemas.openxmlformats.org/drawingml/2006/picture" xmlns:c="http://schemas.openxmlformats.org/drawingml/2006/chart" xmlns:lc="http://schemas.openxmlformats.org/drawingml/2006/lockedCanvas" xmlns:dgm="http://schemas.openxmlformats.org/drawingml/2006/diagram" xmlns:wps="http://schemas.microsoft.com/office/word/2010/wordprocessingShape" xmlns:wpg="http://schemas.microsoft.com/office/word/2010/wordprocessingGroup" xmlns:w14="http://schemas.microsoft.com/office/word/2010/wordml" xmlns:w15="http://schemas.microsoft.com/office/word/2012/wordml" xmlns:w16="http://schemas.microsoft.com/office/word/2018/wordml" xmlns:w16cex="http://schemas.microsoft.com/office/word/2018/wordml/cex" xmlns:w16cid="http://schemas.microsoft.com/office/word/2016/wordml/cid" xmlns="http://schemas.microsoft.com/office/tasks/2019/documenttasks" xmlns:cr="http://schemas.microsoft.com/office/comments/2020/reactions">
   <w:body>
-    <w:bookmarkStart w:id="15" w:name="Xbdd31da4a1d389fca65a7bf2c9f308f09538d82"/>
     <w:p>
       <w:pPr>
         <w:pStyle w:val="Heading1"/>
+        <w:rPr/>
       </w:pPr>
       <w:r>
+        <w:rPr>
+          <w:rtl w:val="0"/>
+        </w:rPr>
+        <w:t xml:space="preserve">S</w:t>
+      </w:r>
+      <w:bookmarkStart w:colFirst="0" w:colLast="0" w:name="bookmark=id.a4oyzz15im26" w:id="0"/>
+      <w:bookmarkEnd w:id="0"/>
+      <w:r>
+        <w:rPr>
+          <w:rtl w:val="0"/>
+        </w:rPr>
         <w:t xml:space="preserve">Semanário — Rafael Martins — 28/09 a 02/10/2026 — Semana A</w:t>
       </w:r>
     </w:p>
-    <w:bookmarkStart w:id="9" w:name="visão-da-semana"/>
+    <w:bookmarkStart w:colFirst="0" w:colLast="0" w:name="bookmark=id.4n771buyq6p2" w:id="1"/>
+    <w:bookmarkEnd w:id="1"/>
     <w:p>
       <w:pPr>
         <w:pStyle w:val="Heading2"/>
+        <w:rPr/>
       </w:pPr>
       <w:r>
+        <w:rPr>
+          <w:rtl w:val="0"/>
+        </w:rPr>
         <w:t xml:space="preserve">Visão da semana</w:t>
       </w:r>
     </w:p>
     <w:tbl>
       <w:tblPr>
-        <w:tblStyle w:val="Table"/>
-        <w:tblW w:type="pct" w:w="5000"/>
+        <w:tblStyle w:val="Table1"/>
+        <w:tblW w:w="7920.0" w:type="dxa"/>
+        <w:jc w:val="left"/>
+        <w:tblInd w:w="-108.0" w:type="dxa"/>
         <w:tblLayout w:type="fixed"/>
-        <w:tblLook w:firstRow="1" w:lastRow="0" w:firstColumn="0" w:lastColumn="0" w:noHBand="0" w:noVBand="0" w:val="0020"/>
+        <w:tblLook w:val="0020"/>
       </w:tblPr>
       <w:tblGrid>
         <w:gridCol w:w="1320"/>
@@ -34,18 +52,74 @@
         <w:gridCol w:w="1320"/>
         <w:gridCol w:w="1320"/>
         <w:gridCol w:w="1320"/>
+        <w:tblGridChange w:id="0">
+          <w:tblGrid>
+            <w:gridCol w:w="1320"/>
+            <w:gridCol w:w="1320"/>
+            <w:gridCol w:w="1320"/>
+            <w:gridCol w:w="1320"/>
+            <w:gridCol w:w="1320"/>
+            <w:gridCol w:w="1320"/>
+          </w:tblGrid>
+        </w:tblGridChange>
       </w:tblGrid>
       <w:tr>
         <w:trPr>
-          <w:tblHeader w:val="on"/>
+          <w:cantSplit w:val="0"/>
+          <w:tblHeader w:val="1"/>
         </w:trPr>
         <w:tc>
           <w:tcPr/>
           <w:p>
             <w:pPr>
-              <w:pStyle w:val="Compact"/>
+              <w:keepNext w:val="0"/>
+              <w:keepLines w:val="0"/>
+              <w:pageBreakBefore w:val="0"/>
+              <w:widowControl w:val="1"/>
+              <w:pBdr>
+                <w:top w:space="0" w:sz="0" w:val="nil"/>
+                <w:left w:space="0" w:sz="0" w:val="nil"/>
+                <w:bottom w:space="0" w:sz="0" w:val="nil"/>
+                <w:right w:space="0" w:sz="0" w:val="nil"/>
+                <w:between w:space="0" w:sz="0" w:val="nil"/>
+              </w:pBdr>
+              <w:shd w:fill="auto" w:val="clear"/>
+              <w:spacing w:after="36" w:before="36" w:line="240" w:lineRule="auto"/>
+              <w:ind w:left="0" w:right="0" w:firstLine="0"/>
+              <w:jc w:val="left"/>
+              <w:rPr>
+                <w:rFonts w:ascii="Aptos" w:cs="Aptos" w:eastAsia="Aptos" w:hAnsi="Aptos"/>
+                <w:b w:val="0"/>
+                <w:bCs w:val="0"/>
+                <w:i w:val="0"/>
+                <w:iCs w:val="0"/>
+                <w:smallCaps w:val="0"/>
+                <w:strike w:val="0"/>
+                <w:color w:val="000000"/>
+                <w:sz w:val="24"/>
+                <w:szCs w:val="24"/>
+                <w:u w:val="none"/>
+                <w:shd w:fill="auto" w:val="clear"/>
+                <w:vertAlign w:val="baseline"/>
+              </w:rPr>
             </w:pPr>
             <w:r>
+              <w:rPr>
+                <w:rFonts w:ascii="Aptos" w:cs="Aptos" w:eastAsia="Aptos" w:hAnsi="Aptos"/>
+                <w:b w:val="0"/>
+                <w:bCs w:val="0"/>
+                <w:i w:val="0"/>
+                <w:iCs w:val="0"/>
+                <w:smallCaps w:val="0"/>
+                <w:strike w:val="0"/>
+                <w:color w:val="000000"/>
+                <w:sz w:val="24"/>
+                <w:szCs w:val="24"/>
+                <w:u w:val="none"/>
+                <w:shd w:fill="auto" w:val="clear"/>
+                <w:vertAlign w:val="baseline"/>
+                <w:rtl w:val="0"/>
+              </w:rPr>
               <w:t xml:space="preserve">Turma</w:t>
             </w:r>
           </w:p>
@@ -54,9 +128,54 @@
           <w:tcPr/>
           <w:p>
             <w:pPr>
-              <w:pStyle w:val="Compact"/>
+              <w:keepNext w:val="0"/>
+              <w:keepLines w:val="0"/>
+              <w:pageBreakBefore w:val="0"/>
+              <w:widowControl w:val="1"/>
+              <w:pBdr>
+                <w:top w:space="0" w:sz="0" w:val="nil"/>
+                <w:left w:space="0" w:sz="0" w:val="nil"/>
+                <w:bottom w:space="0" w:sz="0" w:val="nil"/>
+                <w:right w:space="0" w:sz="0" w:val="nil"/>
+                <w:between w:space="0" w:sz="0" w:val="nil"/>
+              </w:pBdr>
+              <w:shd w:fill="auto" w:val="clear"/>
+              <w:spacing w:after="36" w:before="36" w:line="240" w:lineRule="auto"/>
+              <w:ind w:left="0" w:right="0" w:firstLine="0"/>
+              <w:jc w:val="left"/>
+              <w:rPr>
+                <w:rFonts w:ascii="Aptos" w:cs="Aptos" w:eastAsia="Aptos" w:hAnsi="Aptos"/>
+                <w:b w:val="0"/>
+                <w:bCs w:val="0"/>
+                <w:i w:val="0"/>
+                <w:iCs w:val="0"/>
+                <w:smallCaps w:val="0"/>
+                <w:strike w:val="0"/>
+                <w:color w:val="000000"/>
+                <w:sz w:val="24"/>
+                <w:szCs w:val="24"/>
+                <w:u w:val="none"/>
+                <w:shd w:fill="auto" w:val="clear"/>
+                <w:vertAlign w:val="baseline"/>
+              </w:rPr>
             </w:pPr>
             <w:r>
+              <w:rPr>
+                <w:rFonts w:ascii="Aptos" w:cs="Aptos" w:eastAsia="Aptos" w:hAnsi="Aptos"/>
+                <w:b w:val="0"/>
+                <w:bCs w:val="0"/>
+                <w:i w:val="0"/>
+                <w:iCs w:val="0"/>
+                <w:smallCaps w:val="0"/>
+                <w:strike w:val="0"/>
+                <w:color w:val="000000"/>
+                <w:sz w:val="24"/>
+                <w:szCs w:val="24"/>
+                <w:u w:val="none"/>
+                <w:shd w:fill="auto" w:val="clear"/>
+                <w:vertAlign w:val="baseline"/>
+                <w:rtl w:val="0"/>
+              </w:rPr>
               <w:t xml:space="preserve">Data / horário</w:t>
             </w:r>
           </w:p>
@@ -65,9 +184,54 @@
           <w:tcPr/>
           <w:p>
             <w:pPr>
-              <w:pStyle w:val="Compact"/>
+              <w:keepNext w:val="0"/>
+              <w:keepLines w:val="0"/>
+              <w:pageBreakBefore w:val="0"/>
+              <w:widowControl w:val="1"/>
+              <w:pBdr>
+                <w:top w:space="0" w:sz="0" w:val="nil"/>
+                <w:left w:space="0" w:sz="0" w:val="nil"/>
+                <w:bottom w:space="0" w:sz="0" w:val="nil"/>
+                <w:right w:space="0" w:sz="0" w:val="nil"/>
+                <w:between w:space="0" w:sz="0" w:val="nil"/>
+              </w:pBdr>
+              <w:shd w:fill="auto" w:val="clear"/>
+              <w:spacing w:after="36" w:before="36" w:line="240" w:lineRule="auto"/>
+              <w:ind w:left="0" w:right="0" w:firstLine="0"/>
+              <w:jc w:val="left"/>
+              <w:rPr>
+                <w:rFonts w:ascii="Aptos" w:cs="Aptos" w:eastAsia="Aptos" w:hAnsi="Aptos"/>
+                <w:b w:val="0"/>
+                <w:bCs w:val="0"/>
+                <w:i w:val="0"/>
+                <w:iCs w:val="0"/>
+                <w:smallCaps w:val="0"/>
+                <w:strike w:val="0"/>
+                <w:color w:val="000000"/>
+                <w:sz w:val="24"/>
+                <w:szCs w:val="24"/>
+                <w:u w:val="none"/>
+                <w:shd w:fill="auto" w:val="clear"/>
+                <w:vertAlign w:val="baseline"/>
+              </w:rPr>
             </w:pPr>
             <w:r>
+              <w:rPr>
+                <w:rFonts w:ascii="Aptos" w:cs="Aptos" w:eastAsia="Aptos" w:hAnsi="Aptos"/>
+                <w:b w:val="0"/>
+                <w:bCs w:val="0"/>
+                <w:i w:val="0"/>
+                <w:iCs w:val="0"/>
+                <w:smallCaps w:val="0"/>
+                <w:strike w:val="0"/>
+                <w:color w:val="000000"/>
+                <w:sz w:val="24"/>
+                <w:szCs w:val="24"/>
+                <w:u w:val="none"/>
+                <w:shd w:fill="auto" w:val="clear"/>
+                <w:vertAlign w:val="baseline"/>
+                <w:rtl w:val="0"/>
+              </w:rPr>
               <w:t xml:space="preserve">Conteúdo de partida</w:t>
             </w:r>
           </w:p>
@@ -76,9 +240,54 @@
           <w:tcPr/>
           <w:p>
             <w:pPr>
-              <w:pStyle w:val="Compact"/>
+              <w:keepNext w:val="0"/>
+              <w:keepLines w:val="0"/>
+              <w:pageBreakBefore w:val="0"/>
+              <w:widowControl w:val="1"/>
+              <w:pBdr>
+                <w:top w:space="0" w:sz="0" w:val="nil"/>
+                <w:left w:space="0" w:sz="0" w:val="nil"/>
+                <w:bottom w:space="0" w:sz="0" w:val="nil"/>
+                <w:right w:space="0" w:sz="0" w:val="nil"/>
+                <w:between w:space="0" w:sz="0" w:val="nil"/>
+              </w:pBdr>
+              <w:shd w:fill="auto" w:val="clear"/>
+              <w:spacing w:after="36" w:before="36" w:line="240" w:lineRule="auto"/>
+              <w:ind w:left="0" w:right="0" w:firstLine="0"/>
+              <w:jc w:val="left"/>
+              <w:rPr>
+                <w:rFonts w:ascii="Aptos" w:cs="Aptos" w:eastAsia="Aptos" w:hAnsi="Aptos"/>
+                <w:b w:val="0"/>
+                <w:bCs w:val="0"/>
+                <w:i w:val="0"/>
+                <w:iCs w:val="0"/>
+                <w:smallCaps w:val="0"/>
+                <w:strike w:val="0"/>
+                <w:color w:val="000000"/>
+                <w:sz w:val="24"/>
+                <w:szCs w:val="24"/>
+                <w:u w:val="none"/>
+                <w:shd w:fill="auto" w:val="clear"/>
+                <w:vertAlign w:val="baseline"/>
+              </w:rPr>
             </w:pPr>
             <w:r>
+              <w:rPr>
+                <w:rFonts w:ascii="Aptos" w:cs="Aptos" w:eastAsia="Aptos" w:hAnsi="Aptos"/>
+                <w:b w:val="0"/>
+                <w:bCs w:val="0"/>
+                <w:i w:val="0"/>
+                <w:iCs w:val="0"/>
+                <w:smallCaps w:val="0"/>
+                <w:strike w:val="0"/>
+                <w:color w:val="000000"/>
+                <w:sz w:val="24"/>
+                <w:szCs w:val="24"/>
+                <w:u w:val="none"/>
+                <w:shd w:fill="auto" w:val="clear"/>
+                <w:vertAlign w:val="baseline"/>
+                <w:rtl w:val="0"/>
+              </w:rPr>
               <w:t xml:space="preserve">Aula oficial</w:t>
             </w:r>
           </w:p>
@@ -87,9 +296,54 @@
           <w:tcPr/>
           <w:p>
             <w:pPr>
-              <w:pStyle w:val="Compact"/>
+              <w:keepNext w:val="0"/>
+              <w:keepLines w:val="0"/>
+              <w:pageBreakBefore w:val="0"/>
+              <w:widowControl w:val="1"/>
+              <w:pBdr>
+                <w:top w:space="0" w:sz="0" w:val="nil"/>
+                <w:left w:space="0" w:sz="0" w:val="nil"/>
+                <w:bottom w:space="0" w:sz="0" w:val="nil"/>
+                <w:right w:space="0" w:sz="0" w:val="nil"/>
+                <w:between w:space="0" w:sz="0" w:val="nil"/>
+              </w:pBdr>
+              <w:shd w:fill="auto" w:val="clear"/>
+              <w:spacing w:after="36" w:before="36" w:line="240" w:lineRule="auto"/>
+              <w:ind w:left="0" w:right="0" w:firstLine="0"/>
+              <w:jc w:val="left"/>
+              <w:rPr>
+                <w:rFonts w:ascii="Aptos" w:cs="Aptos" w:eastAsia="Aptos" w:hAnsi="Aptos"/>
+                <w:b w:val="0"/>
+                <w:bCs w:val="0"/>
+                <w:i w:val="0"/>
+                <w:iCs w:val="0"/>
+                <w:smallCaps w:val="0"/>
+                <w:strike w:val="0"/>
+                <w:color w:val="000000"/>
+                <w:sz w:val="24"/>
+                <w:szCs w:val="24"/>
+                <w:u w:val="none"/>
+                <w:shd w:fill="auto" w:val="clear"/>
+                <w:vertAlign w:val="baseline"/>
+              </w:rPr>
             </w:pPr>
             <w:r>
+              <w:rPr>
+                <w:rFonts w:ascii="Aptos" w:cs="Aptos" w:eastAsia="Aptos" w:hAnsi="Aptos"/>
+                <w:b w:val="0"/>
+                <w:bCs w:val="0"/>
+                <w:i w:val="0"/>
+                <w:iCs w:val="0"/>
+                <w:smallCaps w:val="0"/>
+                <w:strike w:val="0"/>
+                <w:color w:val="000000"/>
+                <w:sz w:val="24"/>
+                <w:szCs w:val="24"/>
+                <w:u w:val="none"/>
+                <w:shd w:fill="auto" w:val="clear"/>
+                <w:vertAlign w:val="baseline"/>
+                <w:rtl w:val="0"/>
+              </w:rPr>
               <w:t xml:space="preserve">Professor</w:t>
             </w:r>
           </w:p>
@@ -98,22 +352,116 @@
           <w:tcPr/>
           <w:p>
             <w:pPr>
-              <w:pStyle w:val="Compact"/>
+              <w:keepNext w:val="0"/>
+              <w:keepLines w:val="0"/>
+              <w:pageBreakBefore w:val="0"/>
+              <w:widowControl w:val="1"/>
+              <w:pBdr>
+                <w:top w:space="0" w:sz="0" w:val="nil"/>
+                <w:left w:space="0" w:sz="0" w:val="nil"/>
+                <w:bottom w:space="0" w:sz="0" w:val="nil"/>
+                <w:right w:space="0" w:sz="0" w:val="nil"/>
+                <w:between w:space="0" w:sz="0" w:val="nil"/>
+              </w:pBdr>
+              <w:shd w:fill="auto" w:val="clear"/>
+              <w:spacing w:after="36" w:before="36" w:line="240" w:lineRule="auto"/>
+              <w:ind w:left="0" w:right="0" w:firstLine="0"/>
+              <w:jc w:val="left"/>
+              <w:rPr>
+                <w:rFonts w:ascii="Aptos" w:cs="Aptos" w:eastAsia="Aptos" w:hAnsi="Aptos"/>
+                <w:b w:val="0"/>
+                <w:bCs w:val="0"/>
+                <w:i w:val="0"/>
+                <w:iCs w:val="0"/>
+                <w:smallCaps w:val="0"/>
+                <w:strike w:val="0"/>
+                <w:color w:val="000000"/>
+                <w:sz w:val="24"/>
+                <w:szCs w:val="24"/>
+                <w:u w:val="none"/>
+                <w:shd w:fill="auto" w:val="clear"/>
+                <w:vertAlign w:val="baseline"/>
+              </w:rPr>
             </w:pPr>
             <w:r>
+              <w:rPr>
+                <w:rFonts w:ascii="Aptos" w:cs="Aptos" w:eastAsia="Aptos" w:hAnsi="Aptos"/>
+                <w:b w:val="0"/>
+                <w:bCs w:val="0"/>
+                <w:i w:val="0"/>
+                <w:iCs w:val="0"/>
+                <w:smallCaps w:val="0"/>
+                <w:strike w:val="0"/>
+                <w:color w:val="000000"/>
+                <w:sz w:val="24"/>
+                <w:szCs w:val="24"/>
+                <w:u w:val="none"/>
+                <w:shd w:fill="auto" w:val="clear"/>
+                <w:vertAlign w:val="baseline"/>
+                <w:rtl w:val="0"/>
+              </w:rPr>
               <w:t xml:space="preserve">Aluno</w:t>
             </w:r>
           </w:p>
         </w:tc>
       </w:tr>
       <w:tr>
+        <w:trPr>
+          <w:cantSplit w:val="0"/>
+          <w:tblHeader w:val="0"/>
+        </w:trPr>
         <w:tc>
           <w:tcPr/>
           <w:p>
             <w:pPr>
-              <w:pStyle w:val="Compact"/>
+              <w:keepNext w:val="0"/>
+              <w:keepLines w:val="0"/>
+              <w:pageBreakBefore w:val="0"/>
+              <w:widowControl w:val="1"/>
+              <w:pBdr>
+                <w:top w:space="0" w:sz="0" w:val="nil"/>
+                <w:left w:space="0" w:sz="0" w:val="nil"/>
+                <w:bottom w:space="0" w:sz="0" w:val="nil"/>
+                <w:right w:space="0" w:sz="0" w:val="nil"/>
+                <w:between w:space="0" w:sz="0" w:val="nil"/>
+              </w:pBdr>
+              <w:shd w:fill="auto" w:val="clear"/>
+              <w:spacing w:after="36" w:before="36" w:line="240" w:lineRule="auto"/>
+              <w:ind w:left="0" w:right="0" w:firstLine="0"/>
+              <w:jc w:val="left"/>
+              <w:rPr>
+                <w:rFonts w:ascii="Aptos" w:cs="Aptos" w:eastAsia="Aptos" w:hAnsi="Aptos"/>
+                <w:b w:val="0"/>
+                <w:bCs w:val="0"/>
+                <w:i w:val="0"/>
+                <w:iCs w:val="0"/>
+                <w:smallCaps w:val="0"/>
+                <w:strike w:val="0"/>
+                <w:color w:val="000000"/>
+                <w:sz w:val="24"/>
+                <w:szCs w:val="24"/>
+                <w:u w:val="none"/>
+                <w:shd w:fill="auto" w:val="clear"/>
+                <w:vertAlign w:val="baseline"/>
+              </w:rPr>
             </w:pPr>
             <w:r>
+              <w:rPr>
+                <w:rFonts w:ascii="Aptos" w:cs="Aptos" w:eastAsia="Aptos" w:hAnsi="Aptos"/>
+                <w:b w:val="0"/>
+                <w:bCs w:val="0"/>
+                <w:i w:val="0"/>
+                <w:iCs w:val="0"/>
+                <w:smallCaps w:val="0"/>
+                <w:strike w:val="0"/>
+                <w:color w:val="000000"/>
+                <w:sz w:val="24"/>
+                <w:szCs w:val="24"/>
+                <w:u w:val="none"/>
+                <w:shd w:fill="auto" w:val="clear"/>
+                <w:vertAlign w:val="baseline"/>
+                <w:rtl w:val="0"/>
+              </w:rPr>
               <w:t xml:space="preserve">3ºC</w:t>
             </w:r>
           </w:p>
@@ -122,10 +470,55 @@
           <w:tcPr/>
           <w:p>
             <w:pPr>
-              <w:pStyle w:val="Compact"/>
+              <w:keepNext w:val="0"/>
+              <w:keepLines w:val="0"/>
+              <w:pageBreakBefore w:val="0"/>
+              <w:widowControl w:val="1"/>
+              <w:pBdr>
+                <w:top w:space="0" w:sz="0" w:val="nil"/>
+                <w:left w:space="0" w:sz="0" w:val="nil"/>
+                <w:bottom w:space="0" w:sz="0" w:val="nil"/>
+                <w:right w:space="0" w:sz="0" w:val="nil"/>
+                <w:between w:space="0" w:sz="0" w:val="nil"/>
+              </w:pBdr>
+              <w:shd w:fill="auto" w:val="clear"/>
+              <w:spacing w:after="36" w:before="36" w:line="240" w:lineRule="auto"/>
+              <w:ind w:left="0" w:right="0" w:firstLine="0"/>
+              <w:jc w:val="left"/>
+              <w:rPr>
+                <w:rFonts w:ascii="Aptos" w:cs="Aptos" w:eastAsia="Aptos" w:hAnsi="Aptos"/>
+                <w:b w:val="0"/>
+                <w:bCs w:val="0"/>
+                <w:i w:val="0"/>
+                <w:iCs w:val="0"/>
+                <w:smallCaps w:val="0"/>
+                <w:strike w:val="0"/>
+                <w:color w:val="000000"/>
+                <w:sz w:val="24"/>
+                <w:szCs w:val="24"/>
+                <w:u w:val="none"/>
+                <w:shd w:fill="auto" w:val="clear"/>
+                <w:vertAlign w:val="baseline"/>
+              </w:rPr>
             </w:pPr>
             <w:r>
-              <w:t xml:space="preserve">28/09, 12:55–14:35</w:t>
+              <w:rPr>
+                <w:rFonts w:ascii="Aptos" w:cs="Aptos" w:eastAsia="Aptos" w:hAnsi="Aptos"/>
+                <w:b w:val="0"/>
+                <w:bCs w:val="0"/>
+                <w:i w:val="0"/>
+                <w:iCs w:val="0"/>
+                <w:smallCaps w:val="0"/>
+                <w:strike w:val="0"/>
+                <w:color w:val="000000"/>
+                <w:sz w:val="24"/>
+                <w:szCs w:val="24"/>
+                <w:u w:val="none"/>
+                <w:shd w:fill="auto" w:val="clear"/>
+                <w:vertAlign w:val="baseline"/>
+                <w:rtl w:val="0"/>
+              </w:rPr>
+              <w:t xml:space="preserve">29/09, 12:55–14:35</w:t>
             </w:r>
           </w:p>
         </w:tc>
@@ -133,9 +526,54 @@
           <w:tcPr/>
           <w:p>
             <w:pPr>
-              <w:pStyle w:val="Compact"/>
+              <w:keepNext w:val="0"/>
+              <w:keepLines w:val="0"/>
+              <w:pageBreakBefore w:val="0"/>
+              <w:widowControl w:val="1"/>
+              <w:pBdr>
+                <w:top w:space="0" w:sz="0" w:val="nil"/>
+                <w:left w:space="0" w:sz="0" w:val="nil"/>
+                <w:bottom w:space="0" w:sz="0" w:val="nil"/>
+                <w:right w:space="0" w:sz="0" w:val="nil"/>
+                <w:between w:space="0" w:sz="0" w:val="nil"/>
+              </w:pBdr>
+              <w:shd w:fill="auto" w:val="clear"/>
+              <w:spacing w:after="36" w:before="36" w:line="240" w:lineRule="auto"/>
+              <w:ind w:left="0" w:right="0" w:firstLine="0"/>
+              <w:jc w:val="left"/>
+              <w:rPr>
+                <w:rFonts w:ascii="Aptos" w:cs="Aptos" w:eastAsia="Aptos" w:hAnsi="Aptos"/>
+                <w:b w:val="0"/>
+                <w:bCs w:val="0"/>
+                <w:i w:val="0"/>
+                <w:iCs w:val="0"/>
+                <w:smallCaps w:val="0"/>
+                <w:strike w:val="0"/>
+                <w:color w:val="000000"/>
+                <w:sz w:val="24"/>
+                <w:szCs w:val="24"/>
+                <w:u w:val="none"/>
+                <w:shd w:fill="auto" w:val="clear"/>
+                <w:vertAlign w:val="baseline"/>
+              </w:rPr>
             </w:pPr>
             <w:r>
+              <w:rPr>
+                <w:rFonts w:ascii="Aptos" w:cs="Aptos" w:eastAsia="Aptos" w:hAnsi="Aptos"/>
+                <w:b w:val="0"/>
+                <w:bCs w:val="0"/>
+                <w:i w:val="0"/>
+                <w:iCs w:val="0"/>
+                <w:smallCaps w:val="0"/>
+                <w:strike w:val="0"/>
+                <w:color w:val="000000"/>
+                <w:sz w:val="24"/>
+                <w:szCs w:val="24"/>
+                <w:u w:val="none"/>
+                <w:shd w:fill="auto" w:val="clear"/>
+                <w:vertAlign w:val="baseline"/>
+                <w:rtl w:val="0"/>
+              </w:rPr>
               <w:t xml:space="preserve">Cores na natureza e Cores na arte</w:t>
             </w:r>
           </w:p>
@@ -144,9 +582,54 @@
           <w:tcPr/>
           <w:p>
             <w:pPr>
-              <w:pStyle w:val="Compact"/>
+              <w:keepNext w:val="0"/>
+              <w:keepLines w:val="0"/>
+              <w:pageBreakBefore w:val="0"/>
+              <w:widowControl w:val="1"/>
+              <w:pBdr>
+                <w:top w:space="0" w:sz="0" w:val="nil"/>
+                <w:left w:space="0" w:sz="0" w:val="nil"/>
+                <w:bottom w:space="0" w:sz="0" w:val="nil"/>
+                <w:right w:space="0" w:sz="0" w:val="nil"/>
+                <w:between w:space="0" w:sz="0" w:val="nil"/>
+              </w:pBdr>
+              <w:shd w:fill="auto" w:val="clear"/>
+              <w:spacing w:after="36" w:before="36" w:line="240" w:lineRule="auto"/>
+              <w:ind w:left="0" w:right="0" w:firstLine="0"/>
+              <w:jc w:val="left"/>
+              <w:rPr>
+                <w:rFonts w:ascii="Aptos" w:cs="Aptos" w:eastAsia="Aptos" w:hAnsi="Aptos"/>
+                <w:b w:val="0"/>
+                <w:bCs w:val="0"/>
+                <w:i w:val="0"/>
+                <w:iCs w:val="0"/>
+                <w:smallCaps w:val="0"/>
+                <w:strike w:val="0"/>
+                <w:color w:val="000000"/>
+                <w:sz w:val="24"/>
+                <w:szCs w:val="24"/>
+                <w:u w:val="none"/>
+                <w:shd w:fill="auto" w:val="clear"/>
+                <w:vertAlign w:val="baseline"/>
+              </w:rPr>
             </w:pPr>
             <w:r>
+              <w:rPr>
+                <w:rFonts w:ascii="Aptos" w:cs="Aptos" w:eastAsia="Aptos" w:hAnsi="Aptos"/>
+                <w:b w:val="0"/>
+                <w:bCs w:val="0"/>
+                <w:i w:val="0"/>
+                <w:iCs w:val="0"/>
+                <w:smallCaps w:val="0"/>
+                <w:strike w:val="0"/>
+                <w:color w:val="000000"/>
+                <w:sz w:val="24"/>
+                <w:szCs w:val="24"/>
+                <w:u w:val="none"/>
+                <w:shd w:fill="auto" w:val="clear"/>
+                <w:vertAlign w:val="baseline"/>
+                <w:rtl w:val="0"/>
+              </w:rPr>
               <w:t xml:space="preserve">Desafio de Cores + Robô batedor de asas</w:t>
             </w:r>
           </w:p>
@@ -155,9 +638,54 @@
           <w:tcPr/>
           <w:p>
             <w:pPr>
-              <w:pStyle w:val="Compact"/>
+              <w:keepNext w:val="0"/>
+              <w:keepLines w:val="0"/>
+              <w:pageBreakBefore w:val="0"/>
+              <w:widowControl w:val="1"/>
+              <w:pBdr>
+                <w:top w:space="0" w:sz="0" w:val="nil"/>
+                <w:left w:space="0" w:sz="0" w:val="nil"/>
+                <w:bottom w:space="0" w:sz="0" w:val="nil"/>
+                <w:right w:space="0" w:sz="0" w:val="nil"/>
+                <w:between w:space="0" w:sz="0" w:val="nil"/>
+              </w:pBdr>
+              <w:shd w:fill="auto" w:val="clear"/>
+              <w:spacing w:after="36" w:before="36" w:line="240" w:lineRule="auto"/>
+              <w:ind w:left="0" w:right="0" w:firstLine="0"/>
+              <w:jc w:val="left"/>
+              <w:rPr>
+                <w:rFonts w:ascii="Aptos" w:cs="Aptos" w:eastAsia="Aptos" w:hAnsi="Aptos"/>
+                <w:b w:val="0"/>
+                <w:bCs w:val="0"/>
+                <w:i w:val="0"/>
+                <w:iCs w:val="0"/>
+                <w:smallCaps w:val="0"/>
+                <w:strike w:val="0"/>
+                <w:color w:val="000000"/>
+                <w:sz w:val="24"/>
+                <w:szCs w:val="24"/>
+                <w:u w:val="none"/>
+                <w:shd w:fill="auto" w:val="clear"/>
+                <w:vertAlign w:val="baseline"/>
+              </w:rPr>
             </w:pPr>
             <w:r>
+              <w:rPr>
+                <w:rFonts w:ascii="Aptos" w:cs="Aptos" w:eastAsia="Aptos" w:hAnsi="Aptos"/>
+                <w:b w:val="0"/>
+                <w:bCs w:val="0"/>
+                <w:i w:val="0"/>
+                <w:iCs w:val="0"/>
+                <w:smallCaps w:val="0"/>
+                <w:strike w:val="0"/>
+                <w:color w:val="000000"/>
+                <w:sz w:val="24"/>
+                <w:szCs w:val="24"/>
+                <w:u w:val="none"/>
+                <w:shd w:fill="auto" w:val="clear"/>
+                <w:vertAlign w:val="baseline"/>
+                <w:rtl w:val="0"/>
+              </w:rPr>
               <w:t xml:space="preserve">pp. 140 e 164</w:t>
             </w:r>
           </w:p>
@@ -166,22 +694,116 @@
           <w:tcPr/>
           <w:p>
             <w:pPr>
-              <w:pStyle w:val="Compact"/>
+              <w:keepNext w:val="0"/>
+              <w:keepLines w:val="0"/>
+              <w:pageBreakBefore w:val="0"/>
+              <w:widowControl w:val="1"/>
+              <w:pBdr>
+                <w:top w:space="0" w:sz="0" w:val="nil"/>
+                <w:left w:space="0" w:sz="0" w:val="nil"/>
+                <w:bottom w:space="0" w:sz="0" w:val="nil"/>
+                <w:right w:space="0" w:sz="0" w:val="nil"/>
+                <w:between w:space="0" w:sz="0" w:val="nil"/>
+              </w:pBdr>
+              <w:shd w:fill="auto" w:val="clear"/>
+              <w:spacing w:after="36" w:before="36" w:line="240" w:lineRule="auto"/>
+              <w:ind w:left="0" w:right="0" w:firstLine="0"/>
+              <w:jc w:val="left"/>
+              <w:rPr>
+                <w:rFonts w:ascii="Aptos" w:cs="Aptos" w:eastAsia="Aptos" w:hAnsi="Aptos"/>
+                <w:b w:val="0"/>
+                <w:bCs w:val="0"/>
+                <w:i w:val="0"/>
+                <w:iCs w:val="0"/>
+                <w:smallCaps w:val="0"/>
+                <w:strike w:val="0"/>
+                <w:color w:val="000000"/>
+                <w:sz w:val="24"/>
+                <w:szCs w:val="24"/>
+                <w:u w:val="none"/>
+                <w:shd w:fill="auto" w:val="clear"/>
+                <w:vertAlign w:val="baseline"/>
+              </w:rPr>
             </w:pPr>
             <w:r>
+              <w:rPr>
+                <w:rFonts w:ascii="Aptos" w:cs="Aptos" w:eastAsia="Aptos" w:hAnsi="Aptos"/>
+                <w:b w:val="0"/>
+                <w:bCs w:val="0"/>
+                <w:i w:val="0"/>
+                <w:iCs w:val="0"/>
+                <w:smallCaps w:val="0"/>
+                <w:strike w:val="0"/>
+                <w:color w:val="000000"/>
+                <w:sz w:val="24"/>
+                <w:szCs w:val="24"/>
+                <w:u w:val="none"/>
+                <w:shd w:fill="auto" w:val="clear"/>
+                <w:vertAlign w:val="baseline"/>
+                <w:rtl w:val="0"/>
+              </w:rPr>
               <w:t xml:space="preserve">pp. 111 e 131</w:t>
             </w:r>
           </w:p>
         </w:tc>
       </w:tr>
       <w:tr>
+        <w:trPr>
+          <w:cantSplit w:val="0"/>
+          <w:tblHeader w:val="0"/>
+        </w:trPr>
         <w:tc>
           <w:tcPr/>
           <w:p>
             <w:pPr>
-              <w:pStyle w:val="Compact"/>
+              <w:keepNext w:val="0"/>
+              <w:keepLines w:val="0"/>
+              <w:pageBreakBefore w:val="0"/>
+              <w:widowControl w:val="1"/>
+              <w:pBdr>
+                <w:top w:space="0" w:sz="0" w:val="nil"/>
+                <w:left w:space="0" w:sz="0" w:val="nil"/>
+                <w:bottom w:space="0" w:sz="0" w:val="nil"/>
+                <w:right w:space="0" w:sz="0" w:val="nil"/>
+                <w:between w:space="0" w:sz="0" w:val="nil"/>
+              </w:pBdr>
+              <w:shd w:fill="auto" w:val="clear"/>
+              <w:spacing w:after="36" w:before="36" w:line="240" w:lineRule="auto"/>
+              <w:ind w:left="0" w:right="0" w:firstLine="0"/>
+              <w:jc w:val="left"/>
+              <w:rPr>
+                <w:rFonts w:ascii="Aptos" w:cs="Aptos" w:eastAsia="Aptos" w:hAnsi="Aptos"/>
+                <w:b w:val="0"/>
+                <w:bCs w:val="0"/>
+                <w:i w:val="0"/>
+                <w:iCs w:val="0"/>
+                <w:smallCaps w:val="0"/>
+                <w:strike w:val="0"/>
+                <w:color w:val="000000"/>
+                <w:sz w:val="24"/>
+                <w:szCs w:val="24"/>
+                <w:u w:val="none"/>
+                <w:shd w:fill="auto" w:val="clear"/>
+                <w:vertAlign w:val="baseline"/>
+              </w:rPr>
             </w:pPr>
             <w:r>
+              <w:rPr>
+                <w:rFonts w:ascii="Aptos" w:cs="Aptos" w:eastAsia="Aptos" w:hAnsi="Aptos"/>
+                <w:b w:val="0"/>
+                <w:bCs w:val="0"/>
+                <w:i w:val="0"/>
+                <w:iCs w:val="0"/>
+                <w:smallCaps w:val="0"/>
+                <w:strike w:val="0"/>
+                <w:color w:val="000000"/>
+                <w:sz w:val="24"/>
+                <w:szCs w:val="24"/>
+                <w:u w:val="none"/>
+                <w:shd w:fill="auto" w:val="clear"/>
+                <w:vertAlign w:val="baseline"/>
+                <w:rtl w:val="0"/>
+              </w:rPr>
               <w:t xml:space="preserve">1ºB</w:t>
             </w:r>
           </w:p>
@@ -190,9 +812,54 @@
           <w:tcPr/>
           <w:p>
             <w:pPr>
-              <w:pStyle w:val="Compact"/>
+              <w:keepNext w:val="0"/>
+              <w:keepLines w:val="0"/>
+              <w:pageBreakBefore w:val="0"/>
+              <w:widowControl w:val="1"/>
+              <w:pBdr>
+                <w:top w:space="0" w:sz="0" w:val="nil"/>
+                <w:left w:space="0" w:sz="0" w:val="nil"/>
+                <w:bottom w:space="0" w:sz="0" w:val="nil"/>
+                <w:right w:space="0" w:sz="0" w:val="nil"/>
+                <w:between w:space="0" w:sz="0" w:val="nil"/>
+              </w:pBdr>
+              <w:shd w:fill="auto" w:val="clear"/>
+              <w:spacing w:after="36" w:before="36" w:line="240" w:lineRule="auto"/>
+              <w:ind w:left="0" w:right="0" w:firstLine="0"/>
+              <w:jc w:val="left"/>
+              <w:rPr>
+                <w:rFonts w:ascii="Aptos" w:cs="Aptos" w:eastAsia="Aptos" w:hAnsi="Aptos"/>
+                <w:b w:val="0"/>
+                <w:bCs w:val="0"/>
+                <w:i w:val="0"/>
+                <w:iCs w:val="0"/>
+                <w:smallCaps w:val="0"/>
+                <w:strike w:val="0"/>
+                <w:color w:val="000000"/>
+                <w:sz w:val="24"/>
+                <w:szCs w:val="24"/>
+                <w:u w:val="none"/>
+                <w:shd w:fill="auto" w:val="clear"/>
+                <w:vertAlign w:val="baseline"/>
+              </w:rPr>
             </w:pPr>
             <w:r>
+              <w:rPr>
+                <w:rFonts w:ascii="Aptos" w:cs="Aptos" w:eastAsia="Aptos" w:hAnsi="Aptos"/>
+                <w:b w:val="0"/>
+                <w:bCs w:val="0"/>
+                <w:i w:val="0"/>
+                <w:iCs w:val="0"/>
+                <w:smallCaps w:val="0"/>
+                <w:strike w:val="0"/>
+                <w:color w:val="000000"/>
+                <w:sz w:val="24"/>
+                <w:szCs w:val="24"/>
+                <w:u w:val="none"/>
+                <w:shd w:fill="auto" w:val="clear"/>
+                <w:vertAlign w:val="baseline"/>
+                <w:rtl w:val="0"/>
+              </w:rPr>
               <w:t xml:space="preserve">29/09, 15:45–17:25</w:t>
             </w:r>
           </w:p>
@@ -201,9 +868,54 @@
           <w:tcPr/>
           <w:p>
             <w:pPr>
-              <w:pStyle w:val="Compact"/>
+              <w:keepNext w:val="0"/>
+              <w:keepLines w:val="0"/>
+              <w:pageBreakBefore w:val="0"/>
+              <w:widowControl w:val="1"/>
+              <w:pBdr>
+                <w:top w:space="0" w:sz="0" w:val="nil"/>
+                <w:left w:space="0" w:sz="0" w:val="nil"/>
+                <w:bottom w:space="0" w:sz="0" w:val="nil"/>
+                <w:right w:space="0" w:sz="0" w:val="nil"/>
+                <w:between w:space="0" w:sz="0" w:val="nil"/>
+              </w:pBdr>
+              <w:shd w:fill="auto" w:val="clear"/>
+              <w:spacing w:after="36" w:before="36" w:line="240" w:lineRule="auto"/>
+              <w:ind w:left="0" w:right="0" w:firstLine="0"/>
+              <w:jc w:val="left"/>
+              <w:rPr>
+                <w:rFonts w:ascii="Aptos" w:cs="Aptos" w:eastAsia="Aptos" w:hAnsi="Aptos"/>
+                <w:b w:val="0"/>
+                <w:bCs w:val="0"/>
+                <w:i w:val="0"/>
+                <w:iCs w:val="0"/>
+                <w:smallCaps w:val="0"/>
+                <w:strike w:val="0"/>
+                <w:color w:val="000000"/>
+                <w:sz w:val="24"/>
+                <w:szCs w:val="24"/>
+                <w:u w:val="none"/>
+                <w:shd w:fill="auto" w:val="clear"/>
+                <w:vertAlign w:val="baseline"/>
+              </w:rPr>
             </w:pPr>
             <w:r>
+              <w:rPr>
+                <w:rFonts w:ascii="Aptos" w:cs="Aptos" w:eastAsia="Aptos" w:hAnsi="Aptos"/>
+                <w:b w:val="0"/>
+                <w:bCs w:val="0"/>
+                <w:i w:val="0"/>
+                <w:iCs w:val="0"/>
+                <w:smallCaps w:val="0"/>
+                <w:strike w:val="0"/>
+                <w:color w:val="000000"/>
+                <w:sz w:val="24"/>
+                <w:szCs w:val="24"/>
+                <w:u w:val="none"/>
+                <w:shd w:fill="auto" w:val="clear"/>
+                <w:vertAlign w:val="baseline"/>
+                <w:rtl w:val="0"/>
+              </w:rPr>
               <w:t xml:space="preserve">Arraiá de robôs + Caça ao tesouro</w:t>
             </w:r>
           </w:p>
@@ -212,9 +924,54 @@
           <w:tcPr/>
           <w:p>
             <w:pPr>
-              <w:pStyle w:val="Compact"/>
+              <w:keepNext w:val="0"/>
+              <w:keepLines w:val="0"/>
+              <w:pageBreakBefore w:val="0"/>
+              <w:widowControl w:val="1"/>
+              <w:pBdr>
+                <w:top w:space="0" w:sz="0" w:val="nil"/>
+                <w:left w:space="0" w:sz="0" w:val="nil"/>
+                <w:bottom w:space="0" w:sz="0" w:val="nil"/>
+                <w:right w:space="0" w:sz="0" w:val="nil"/>
+                <w:between w:space="0" w:sz="0" w:val="nil"/>
+              </w:pBdr>
+              <w:shd w:fill="auto" w:val="clear"/>
+              <w:spacing w:after="36" w:before="36" w:line="240" w:lineRule="auto"/>
+              <w:ind w:left="0" w:right="0" w:firstLine="0"/>
+              <w:jc w:val="left"/>
+              <w:rPr>
+                <w:rFonts w:ascii="Aptos" w:cs="Aptos" w:eastAsia="Aptos" w:hAnsi="Aptos"/>
+                <w:b w:val="0"/>
+                <w:bCs w:val="0"/>
+                <w:i w:val="0"/>
+                <w:iCs w:val="0"/>
+                <w:smallCaps w:val="0"/>
+                <w:strike w:val="0"/>
+                <w:color w:val="000000"/>
+                <w:sz w:val="24"/>
+                <w:szCs w:val="24"/>
+                <w:u w:val="none"/>
+                <w:shd w:fill="auto" w:val="clear"/>
+                <w:vertAlign w:val="baseline"/>
+              </w:rPr>
             </w:pPr>
             <w:r>
+              <w:rPr>
+                <w:rFonts w:ascii="Aptos" w:cs="Aptos" w:eastAsia="Aptos" w:hAnsi="Aptos"/>
+                <w:b w:val="0"/>
+                <w:bCs w:val="0"/>
+                <w:i w:val="0"/>
+                <w:iCs w:val="0"/>
+                <w:smallCaps w:val="0"/>
+                <w:strike w:val="0"/>
+                <w:color w:val="000000"/>
+                <w:sz w:val="24"/>
+                <w:szCs w:val="24"/>
+                <w:u w:val="none"/>
+                <w:shd w:fill="auto" w:val="clear"/>
+                <w:vertAlign w:val="baseline"/>
+                <w:rtl w:val="0"/>
+              </w:rPr>
               <w:t xml:space="preserve">Carros malucos + Desfile de carros malucos</w:t>
             </w:r>
           </w:p>
@@ -223,9 +980,54 @@
           <w:tcPr/>
           <w:p>
             <w:pPr>
-              <w:pStyle w:val="Compact"/>
+              <w:keepNext w:val="0"/>
+              <w:keepLines w:val="0"/>
+              <w:pageBreakBefore w:val="0"/>
+              <w:widowControl w:val="1"/>
+              <w:pBdr>
+                <w:top w:space="0" w:sz="0" w:val="nil"/>
+                <w:left w:space="0" w:sz="0" w:val="nil"/>
+                <w:bottom w:space="0" w:sz="0" w:val="nil"/>
+                <w:right w:space="0" w:sz="0" w:val="nil"/>
+                <w:between w:space="0" w:sz="0" w:val="nil"/>
+              </w:pBdr>
+              <w:shd w:fill="auto" w:val="clear"/>
+              <w:spacing w:after="36" w:before="36" w:line="240" w:lineRule="auto"/>
+              <w:ind w:left="0" w:right="0" w:firstLine="0"/>
+              <w:jc w:val="left"/>
+              <w:rPr>
+                <w:rFonts w:ascii="Aptos" w:cs="Aptos" w:eastAsia="Aptos" w:hAnsi="Aptos"/>
+                <w:b w:val="0"/>
+                <w:bCs w:val="0"/>
+                <w:i w:val="0"/>
+                <w:iCs w:val="0"/>
+                <w:smallCaps w:val="0"/>
+                <w:strike w:val="0"/>
+                <w:color w:val="000000"/>
+                <w:sz w:val="24"/>
+                <w:szCs w:val="24"/>
+                <w:u w:val="none"/>
+                <w:shd w:fill="auto" w:val="clear"/>
+                <w:vertAlign w:val="baseline"/>
+              </w:rPr>
             </w:pPr>
             <w:r>
+              <w:rPr>
+                <w:rFonts w:ascii="Aptos" w:cs="Aptos" w:eastAsia="Aptos" w:hAnsi="Aptos"/>
+                <w:b w:val="0"/>
+                <w:bCs w:val="0"/>
+                <w:i w:val="0"/>
+                <w:iCs w:val="0"/>
+                <w:smallCaps w:val="0"/>
+                <w:strike w:val="0"/>
+                <w:color w:val="000000"/>
+                <w:sz w:val="24"/>
+                <w:szCs w:val="24"/>
+                <w:u w:val="none"/>
+                <w:shd w:fill="auto" w:val="clear"/>
+                <w:vertAlign w:val="baseline"/>
+                <w:rtl w:val="0"/>
+              </w:rPr>
               <w:t xml:space="preserve">pp. 112 e 118</w:t>
             </w:r>
           </w:p>
@@ -234,22 +1036,116 @@
           <w:tcPr/>
           <w:p>
             <w:pPr>
-              <w:pStyle w:val="Compact"/>
+              <w:keepNext w:val="0"/>
+              <w:keepLines w:val="0"/>
+              <w:pageBreakBefore w:val="0"/>
+              <w:widowControl w:val="1"/>
+              <w:pBdr>
+                <w:top w:space="0" w:sz="0" w:val="nil"/>
+                <w:left w:space="0" w:sz="0" w:val="nil"/>
+                <w:bottom w:space="0" w:sz="0" w:val="nil"/>
+                <w:right w:space="0" w:sz="0" w:val="nil"/>
+                <w:between w:space="0" w:sz="0" w:val="nil"/>
+              </w:pBdr>
+              <w:shd w:fill="auto" w:val="clear"/>
+              <w:spacing w:after="36" w:before="36" w:line="240" w:lineRule="auto"/>
+              <w:ind w:left="0" w:right="0" w:firstLine="0"/>
+              <w:jc w:val="left"/>
+              <w:rPr>
+                <w:rFonts w:ascii="Aptos" w:cs="Aptos" w:eastAsia="Aptos" w:hAnsi="Aptos"/>
+                <w:b w:val="0"/>
+                <w:bCs w:val="0"/>
+                <w:i w:val="0"/>
+                <w:iCs w:val="0"/>
+                <w:smallCaps w:val="0"/>
+                <w:strike w:val="0"/>
+                <w:color w:val="000000"/>
+                <w:sz w:val="24"/>
+                <w:szCs w:val="24"/>
+                <w:u w:val="none"/>
+                <w:shd w:fill="auto" w:val="clear"/>
+                <w:vertAlign w:val="baseline"/>
+              </w:rPr>
             </w:pPr>
             <w:r>
+              <w:rPr>
+                <w:rFonts w:ascii="Aptos" w:cs="Aptos" w:eastAsia="Aptos" w:hAnsi="Aptos"/>
+                <w:b w:val="0"/>
+                <w:bCs w:val="0"/>
+                <w:i w:val="0"/>
+                <w:iCs w:val="0"/>
+                <w:smallCaps w:val="0"/>
+                <w:strike w:val="0"/>
+                <w:color w:val="000000"/>
+                <w:sz w:val="24"/>
+                <w:szCs w:val="24"/>
+                <w:u w:val="none"/>
+                <w:shd w:fill="auto" w:val="clear"/>
+                <w:vertAlign w:val="baseline"/>
+                <w:rtl w:val="0"/>
+              </w:rPr>
               <w:t xml:space="preserve">pp. 23–36</w:t>
             </w:r>
           </w:p>
         </w:tc>
       </w:tr>
       <w:tr>
+        <w:trPr>
+          <w:cantSplit w:val="0"/>
+          <w:tblHeader w:val="0"/>
+        </w:trPr>
         <w:tc>
           <w:tcPr/>
           <w:p>
             <w:pPr>
-              <w:pStyle w:val="Compact"/>
+              <w:keepNext w:val="0"/>
+              <w:keepLines w:val="0"/>
+              <w:pageBreakBefore w:val="0"/>
+              <w:widowControl w:val="1"/>
+              <w:pBdr>
+                <w:top w:space="0" w:sz="0" w:val="nil"/>
+                <w:left w:space="0" w:sz="0" w:val="nil"/>
+                <w:bottom w:space="0" w:sz="0" w:val="nil"/>
+                <w:right w:space="0" w:sz="0" w:val="nil"/>
+                <w:between w:space="0" w:sz="0" w:val="nil"/>
+              </w:pBdr>
+              <w:shd w:fill="auto" w:val="clear"/>
+              <w:spacing w:after="36" w:before="36" w:line="240" w:lineRule="auto"/>
+              <w:ind w:left="0" w:right="0" w:firstLine="0"/>
+              <w:jc w:val="left"/>
+              <w:rPr>
+                <w:rFonts w:ascii="Aptos" w:cs="Aptos" w:eastAsia="Aptos" w:hAnsi="Aptos"/>
+                <w:b w:val="0"/>
+                <w:bCs w:val="0"/>
+                <w:i w:val="0"/>
+                <w:iCs w:val="0"/>
+                <w:smallCaps w:val="0"/>
+                <w:strike w:val="0"/>
+                <w:color w:val="000000"/>
+                <w:sz w:val="24"/>
+                <w:szCs w:val="24"/>
+                <w:u w:val="none"/>
+                <w:shd w:fill="auto" w:val="clear"/>
+                <w:vertAlign w:val="baseline"/>
+              </w:rPr>
             </w:pPr>
             <w:r>
+              <w:rPr>
+                <w:rFonts w:ascii="Aptos" w:cs="Aptos" w:eastAsia="Aptos" w:hAnsi="Aptos"/>
+                <w:b w:val="0"/>
+                <w:bCs w:val="0"/>
+                <w:i w:val="0"/>
+                <w:iCs w:val="0"/>
+                <w:smallCaps w:val="0"/>
+                <w:strike w:val="0"/>
+                <w:color w:val="000000"/>
+                <w:sz w:val="24"/>
+                <w:szCs w:val="24"/>
+                <w:u w:val="none"/>
+                <w:shd w:fill="auto" w:val="clear"/>
+                <w:vertAlign w:val="baseline"/>
+                <w:rtl w:val="0"/>
+              </w:rPr>
               <w:t xml:space="preserve">5ºA</w:t>
             </w:r>
           </w:p>
@@ -258,9 +1154,54 @@
           <w:tcPr/>
           <w:p>
             <w:pPr>
-              <w:pStyle w:val="Compact"/>
+              <w:keepNext w:val="0"/>
+              <w:keepLines w:val="0"/>
+              <w:pageBreakBefore w:val="0"/>
+              <w:widowControl w:val="1"/>
+              <w:pBdr>
+                <w:top w:space="0" w:sz="0" w:val="nil"/>
+                <w:left w:space="0" w:sz="0" w:val="nil"/>
+                <w:bottom w:space="0" w:sz="0" w:val="nil"/>
+                <w:right w:space="0" w:sz="0" w:val="nil"/>
+                <w:between w:space="0" w:sz="0" w:val="nil"/>
+              </w:pBdr>
+              <w:shd w:fill="auto" w:val="clear"/>
+              <w:spacing w:after="36" w:before="36" w:line="240" w:lineRule="auto"/>
+              <w:ind w:left="0" w:right="0" w:firstLine="0"/>
+              <w:jc w:val="left"/>
+              <w:rPr>
+                <w:rFonts w:ascii="Aptos" w:cs="Aptos" w:eastAsia="Aptos" w:hAnsi="Aptos"/>
+                <w:b w:val="0"/>
+                <w:bCs w:val="0"/>
+                <w:i w:val="0"/>
+                <w:iCs w:val="0"/>
+                <w:smallCaps w:val="0"/>
+                <w:strike w:val="0"/>
+                <w:color w:val="000000"/>
+                <w:sz w:val="24"/>
+                <w:szCs w:val="24"/>
+                <w:u w:val="none"/>
+                <w:shd w:fill="auto" w:val="clear"/>
+                <w:vertAlign w:val="baseline"/>
+              </w:rPr>
             </w:pPr>
             <w:r>
+              <w:rPr>
+                <w:rFonts w:ascii="Aptos" w:cs="Aptos" w:eastAsia="Aptos" w:hAnsi="Aptos"/>
+                <w:b w:val="0"/>
+                <w:bCs w:val="0"/>
+                <w:i w:val="0"/>
+                <w:iCs w:val="0"/>
+                <w:smallCaps w:val="0"/>
+                <w:strike w:val="0"/>
+                <w:color w:val="000000"/>
+                <w:sz w:val="24"/>
+                <w:szCs w:val="24"/>
+                <w:u w:val="none"/>
+                <w:shd w:fill="auto" w:val="clear"/>
+                <w:vertAlign w:val="baseline"/>
+                <w:rtl w:val="0"/>
+              </w:rPr>
               <w:t xml:space="preserve">02/10, 07:15–08:55</w:t>
             </w:r>
           </w:p>
@@ -269,9 +1210,54 @@
           <w:tcPr/>
           <w:p>
             <w:pPr>
-              <w:pStyle w:val="Compact"/>
+              <w:keepNext w:val="0"/>
+              <w:keepLines w:val="0"/>
+              <w:pageBreakBefore w:val="0"/>
+              <w:widowControl w:val="1"/>
+              <w:pBdr>
+                <w:top w:space="0" w:sz="0" w:val="nil"/>
+                <w:left w:space="0" w:sz="0" w:val="nil"/>
+                <w:bottom w:space="0" w:sz="0" w:val="nil"/>
+                <w:right w:space="0" w:sz="0" w:val="nil"/>
+                <w:between w:space="0" w:sz="0" w:val="nil"/>
+              </w:pBdr>
+              <w:shd w:fill="auto" w:val="clear"/>
+              <w:spacing w:after="36" w:before="36" w:line="240" w:lineRule="auto"/>
+              <w:ind w:left="0" w:right="0" w:firstLine="0"/>
+              <w:jc w:val="left"/>
+              <w:rPr>
+                <w:rFonts w:ascii="Aptos" w:cs="Aptos" w:eastAsia="Aptos" w:hAnsi="Aptos"/>
+                <w:b w:val="0"/>
+                <w:bCs w:val="0"/>
+                <w:i w:val="0"/>
+                <w:iCs w:val="0"/>
+                <w:smallCaps w:val="0"/>
+                <w:strike w:val="0"/>
+                <w:color w:val="000000"/>
+                <w:sz w:val="24"/>
+                <w:szCs w:val="24"/>
+                <w:u w:val="none"/>
+                <w:shd w:fill="auto" w:val="clear"/>
+                <w:vertAlign w:val="baseline"/>
+              </w:rPr>
             </w:pPr>
             <w:r>
+              <w:rPr>
+                <w:rFonts w:ascii="Aptos" w:cs="Aptos" w:eastAsia="Aptos" w:hAnsi="Aptos"/>
+                <w:b w:val="0"/>
+                <w:bCs w:val="0"/>
+                <w:i w:val="0"/>
+                <w:iCs w:val="0"/>
+                <w:smallCaps w:val="0"/>
+                <w:strike w:val="0"/>
+                <w:color w:val="000000"/>
+                <w:sz w:val="24"/>
+                <w:szCs w:val="24"/>
+                <w:u w:val="none"/>
+                <w:shd w:fill="auto" w:val="clear"/>
+                <w:vertAlign w:val="baseline"/>
+                <w:rtl w:val="0"/>
+              </w:rPr>
               <w:t xml:space="preserve">Sistema respiratório</w:t>
             </w:r>
           </w:p>
@@ -280,9 +1266,54 @@
           <w:tcPr/>
           <w:p>
             <w:pPr>
-              <w:pStyle w:val="Compact"/>
+              <w:keepNext w:val="0"/>
+              <w:keepLines w:val="0"/>
+              <w:pageBreakBefore w:val="0"/>
+              <w:widowControl w:val="1"/>
+              <w:pBdr>
+                <w:top w:space="0" w:sz="0" w:val="nil"/>
+                <w:left w:space="0" w:sz="0" w:val="nil"/>
+                <w:bottom w:space="0" w:sz="0" w:val="nil"/>
+                <w:right w:space="0" w:sz="0" w:val="nil"/>
+                <w:between w:space="0" w:sz="0" w:val="nil"/>
+              </w:pBdr>
+              <w:shd w:fill="auto" w:val="clear"/>
+              <w:spacing w:after="36" w:before="36" w:line="240" w:lineRule="auto"/>
+              <w:ind w:left="0" w:right="0" w:firstLine="0"/>
+              <w:jc w:val="left"/>
+              <w:rPr>
+                <w:rFonts w:ascii="Aptos" w:cs="Aptos" w:eastAsia="Aptos" w:hAnsi="Aptos"/>
+                <w:b w:val="0"/>
+                <w:bCs w:val="0"/>
+                <w:i w:val="0"/>
+                <w:iCs w:val="0"/>
+                <w:smallCaps w:val="0"/>
+                <w:strike w:val="0"/>
+                <w:color w:val="000000"/>
+                <w:sz w:val="24"/>
+                <w:szCs w:val="24"/>
+                <w:u w:val="none"/>
+                <w:shd w:fill="auto" w:val="clear"/>
+                <w:vertAlign w:val="baseline"/>
+              </w:rPr>
             </w:pPr>
             <w:r>
+              <w:rPr>
+                <w:rFonts w:ascii="Aptos" w:cs="Aptos" w:eastAsia="Aptos" w:hAnsi="Aptos"/>
+                <w:b w:val="0"/>
+                <w:bCs w:val="0"/>
+                <w:i w:val="0"/>
+                <w:iCs w:val="0"/>
+                <w:smallCaps w:val="0"/>
+                <w:strike w:val="0"/>
+                <w:color w:val="000000"/>
+                <w:sz w:val="24"/>
+                <w:szCs w:val="24"/>
+                <w:u w:val="none"/>
+                <w:shd w:fill="auto" w:val="clear"/>
+                <w:vertAlign w:val="baseline"/>
+                <w:rtl w:val="0"/>
+              </w:rPr>
               <w:t xml:space="preserve">Desafio de Bem-estar</w:t>
             </w:r>
           </w:p>
@@ -291,9 +1322,54 @@
           <w:tcPr/>
           <w:p>
             <w:pPr>
-              <w:pStyle w:val="Compact"/>
+              <w:keepNext w:val="0"/>
+              <w:keepLines w:val="0"/>
+              <w:pageBreakBefore w:val="0"/>
+              <w:widowControl w:val="1"/>
+              <w:pBdr>
+                <w:top w:space="0" w:sz="0" w:val="nil"/>
+                <w:left w:space="0" w:sz="0" w:val="nil"/>
+                <w:bottom w:space="0" w:sz="0" w:val="nil"/>
+                <w:right w:space="0" w:sz="0" w:val="nil"/>
+                <w:between w:space="0" w:sz="0" w:val="nil"/>
+              </w:pBdr>
+              <w:shd w:fill="auto" w:val="clear"/>
+              <w:spacing w:after="36" w:before="36" w:line="240" w:lineRule="auto"/>
+              <w:ind w:left="0" w:right="0" w:firstLine="0"/>
+              <w:jc w:val="left"/>
+              <w:rPr>
+                <w:rFonts w:ascii="Aptos" w:cs="Aptos" w:eastAsia="Aptos" w:hAnsi="Aptos"/>
+                <w:b w:val="0"/>
+                <w:bCs w:val="0"/>
+                <w:i w:val="0"/>
+                <w:iCs w:val="0"/>
+                <w:smallCaps w:val="0"/>
+                <w:strike w:val="0"/>
+                <w:color w:val="000000"/>
+                <w:sz w:val="24"/>
+                <w:szCs w:val="24"/>
+                <w:u w:val="none"/>
+                <w:shd w:fill="auto" w:val="clear"/>
+                <w:vertAlign w:val="baseline"/>
+              </w:rPr>
             </w:pPr>
             <w:r>
+              <w:rPr>
+                <w:rFonts w:ascii="Aptos" w:cs="Aptos" w:eastAsia="Aptos" w:hAnsi="Aptos"/>
+                <w:b w:val="0"/>
+                <w:bCs w:val="0"/>
+                <w:i w:val="0"/>
+                <w:iCs w:val="0"/>
+                <w:smallCaps w:val="0"/>
+                <w:strike w:val="0"/>
+                <w:color w:val="000000"/>
+                <w:sz w:val="24"/>
+                <w:szCs w:val="24"/>
+                <w:u w:val="none"/>
+                <w:shd w:fill="auto" w:val="clear"/>
+                <w:vertAlign w:val="baseline"/>
+                <w:rtl w:val="0"/>
+              </w:rPr>
               <w:t xml:space="preserve">p. 234</w:t>
             </w:r>
           </w:p>
@@ -302,47 +1378,152 @@
           <w:tcPr/>
           <w:p>
             <w:pPr>
-              <w:pStyle w:val="Compact"/>
+              <w:keepNext w:val="0"/>
+              <w:keepLines w:val="0"/>
+              <w:pageBreakBefore w:val="0"/>
+              <w:widowControl w:val="1"/>
+              <w:pBdr>
+                <w:top w:space="0" w:sz="0" w:val="nil"/>
+                <w:left w:space="0" w:sz="0" w:val="nil"/>
+                <w:bottom w:space="0" w:sz="0" w:val="nil"/>
+                <w:right w:space="0" w:sz="0" w:val="nil"/>
+                <w:between w:space="0" w:sz="0" w:val="nil"/>
+              </w:pBdr>
+              <w:shd w:fill="auto" w:val="clear"/>
+              <w:spacing w:after="36" w:before="36" w:line="240" w:lineRule="auto"/>
+              <w:ind w:left="0" w:right="0" w:firstLine="0"/>
+              <w:jc w:val="left"/>
+              <w:rPr>
+                <w:rFonts w:ascii="Aptos" w:cs="Aptos" w:eastAsia="Aptos" w:hAnsi="Aptos"/>
+                <w:b w:val="0"/>
+                <w:bCs w:val="0"/>
+                <w:i w:val="0"/>
+                <w:iCs w:val="0"/>
+                <w:smallCaps w:val="0"/>
+                <w:strike w:val="0"/>
+                <w:color w:val="000000"/>
+                <w:sz w:val="24"/>
+                <w:szCs w:val="24"/>
+                <w:u w:val="none"/>
+                <w:shd w:fill="auto" w:val="clear"/>
+                <w:vertAlign w:val="baseline"/>
+              </w:rPr>
             </w:pPr>
             <w:r>
+              <w:rPr>
+                <w:rFonts w:ascii="Aptos" w:cs="Aptos" w:eastAsia="Aptos" w:hAnsi="Aptos"/>
+                <w:b w:val="0"/>
+                <w:bCs w:val="0"/>
+                <w:i w:val="0"/>
+                <w:iCs w:val="0"/>
+                <w:smallCaps w:val="0"/>
+                <w:strike w:val="0"/>
+                <w:color w:val="000000"/>
+                <w:sz w:val="24"/>
+                <w:szCs w:val="24"/>
+                <w:u w:val="none"/>
+                <w:shd w:fill="auto" w:val="clear"/>
+                <w:vertAlign w:val="baseline"/>
+                <w:rtl w:val="0"/>
+              </w:rPr>
               <w:t xml:space="preserve">p. 195</w:t>
             </w:r>
           </w:p>
         </w:tc>
       </w:tr>
     </w:tbl>
-    <w:bookmarkEnd w:id="9"/>
-    <w:bookmarkStart w:id="10" w:name="quantitativo-de-alunos-e-cópias"/>
+    <w:bookmarkStart w:colFirst="0" w:colLast="0" w:name="bookmark=id.kqzuk0l6ky2g" w:id="2"/>
+    <w:bookmarkEnd w:id="2"/>
     <w:p>
       <w:pPr>
         <w:pStyle w:val="Heading2"/>
+        <w:rPr/>
       </w:pPr>
       <w:r>
+        <w:rPr>
+          <w:rtl w:val="0"/>
+        </w:rPr>
         <w:t xml:space="preserve">Quantitativo de alunos e cópias</w:t>
       </w:r>
     </w:p>
     <w:tbl>
       <w:tblPr>
-        <w:tblStyle w:val="Table"/>
-        <w:tblW w:type="auto" w:w="0"/>
-        <w:tblLook w:firstRow="1" w:lastRow="0" w:firstColumn="0" w:lastColumn="0" w:noHBand="0" w:noVBand="0" w:val="0020"/>
+        <w:tblStyle w:val="Table2"/>
+        <w:tblW w:w="7920.0" w:type="dxa"/>
+        <w:jc w:val="left"/>
+        <w:tblInd w:w="-108.0" w:type="dxa"/>
+        <w:tblLayout w:type="fixed"/>
+        <w:tblLook w:val="0020"/>
       </w:tblPr>
       <w:tblGrid>
         <w:gridCol w:w="2640"/>
         <w:gridCol w:w="2640"/>
         <w:gridCol w:w="2640"/>
+        <w:tblGridChange w:id="0">
+          <w:tblGrid>
+            <w:gridCol w:w="2640"/>
+            <w:gridCol w:w="2640"/>
+            <w:gridCol w:w="2640"/>
+          </w:tblGrid>
+        </w:tblGridChange>
       </w:tblGrid>
       <w:tr>
         <w:trPr>
-          <w:tblHeader w:val="on"/>
+          <w:cantSplit w:val="0"/>
+          <w:tblHeader w:val="1"/>
         </w:trPr>
         <w:tc>
           <w:tcPr/>
           <w:p>
             <w:pPr>
-              <w:pStyle w:val="Compact"/>
+              <w:keepNext w:val="0"/>
+              <w:keepLines w:val="0"/>
+              <w:pageBreakBefore w:val="0"/>
+              <w:widowControl w:val="1"/>
+              <w:pBdr>
+                <w:top w:space="0" w:sz="0" w:val="nil"/>
+                <w:left w:space="0" w:sz="0" w:val="nil"/>
+                <w:bottom w:space="0" w:sz="0" w:val="nil"/>
+                <w:right w:space="0" w:sz="0" w:val="nil"/>
+                <w:between w:space="0" w:sz="0" w:val="nil"/>
+              </w:pBdr>
+              <w:shd w:fill="auto" w:val="clear"/>
+              <w:spacing w:after="36" w:before="36" w:line="240" w:lineRule="auto"/>
+              <w:ind w:left="0" w:right="0" w:firstLine="0"/>
+              <w:jc w:val="left"/>
+              <w:rPr>
+                <w:rFonts w:ascii="Aptos" w:cs="Aptos" w:eastAsia="Aptos" w:hAnsi="Aptos"/>
+                <w:b w:val="0"/>
+                <w:bCs w:val="0"/>
+                <w:i w:val="0"/>
+                <w:iCs w:val="0"/>
+                <w:smallCaps w:val="0"/>
+                <w:strike w:val="0"/>
+                <w:color w:val="000000"/>
+                <w:sz w:val="24"/>
+                <w:szCs w:val="24"/>
+                <w:u w:val="none"/>
+                <w:shd w:fill="auto" w:val="clear"/>
+                <w:vertAlign w:val="baseline"/>
+              </w:rPr>
             </w:pPr>
             <w:r>
+              <w:rPr>
+                <w:rFonts w:ascii="Aptos" w:cs="Aptos" w:eastAsia="Aptos" w:hAnsi="Aptos"/>
+                <w:b w:val="0"/>
+                <w:bCs w:val="0"/>
+                <w:i w:val="0"/>
+                <w:iCs w:val="0"/>
+                <w:smallCaps w:val="0"/>
+                <w:strike w:val="0"/>
+                <w:color w:val="000000"/>
+                <w:sz w:val="24"/>
+                <w:szCs w:val="24"/>
+                <w:u w:val="none"/>
+                <w:shd w:fill="auto" w:val="clear"/>
+                <w:vertAlign w:val="baseline"/>
+                <w:rtl w:val="0"/>
+              </w:rPr>
               <w:t xml:space="preserve">Turma</w:t>
             </w:r>
           </w:p>
@@ -351,10 +1532,54 @@
           <w:tcPr/>
           <w:p>
             <w:pPr>
-              <w:pStyle w:val="Compact"/>
+              <w:keepNext w:val="0"/>
+              <w:keepLines w:val="0"/>
+              <w:pageBreakBefore w:val="0"/>
+              <w:widowControl w:val="1"/>
+              <w:pBdr>
+                <w:top w:space="0" w:sz="0" w:val="nil"/>
+                <w:left w:space="0" w:sz="0" w:val="nil"/>
+                <w:bottom w:space="0" w:sz="0" w:val="nil"/>
+                <w:right w:space="0" w:sz="0" w:val="nil"/>
+                <w:between w:space="0" w:sz="0" w:val="nil"/>
+              </w:pBdr>
+              <w:shd w:fill="auto" w:val="clear"/>
+              <w:spacing w:after="36" w:before="36" w:line="240" w:lineRule="auto"/>
+              <w:ind w:left="0" w:right="0" w:firstLine="0"/>
               <w:jc w:val="right"/>
+              <w:rPr>
+                <w:rFonts w:ascii="Aptos" w:cs="Aptos" w:eastAsia="Aptos" w:hAnsi="Aptos"/>
+                <w:b w:val="0"/>
+                <w:bCs w:val="0"/>
+                <w:i w:val="0"/>
+                <w:iCs w:val="0"/>
+                <w:smallCaps w:val="0"/>
+                <w:strike w:val="0"/>
+                <w:color w:val="000000"/>
+                <w:sz w:val="24"/>
+                <w:szCs w:val="24"/>
+                <w:u w:val="none"/>
+                <w:shd w:fill="auto" w:val="clear"/>
+                <w:vertAlign w:val="baseline"/>
+              </w:rPr>
             </w:pPr>
             <w:r>
+              <w:rPr>
+                <w:rFonts w:ascii="Aptos" w:cs="Aptos" w:eastAsia="Aptos" w:hAnsi="Aptos"/>
+                <w:b w:val="0"/>
+                <w:bCs w:val="0"/>
+                <w:i w:val="0"/>
+                <w:iCs w:val="0"/>
+                <w:smallCaps w:val="0"/>
+                <w:strike w:val="0"/>
+                <w:color w:val="000000"/>
+                <w:sz w:val="24"/>
+                <w:szCs w:val="24"/>
+                <w:u w:val="none"/>
+                <w:shd w:fill="auto" w:val="clear"/>
+                <w:vertAlign w:val="baseline"/>
+                <w:rtl w:val="0"/>
+              </w:rPr>
               <w:t xml:space="preserve">Alunos</w:t>
             </w:r>
           </w:p>
@@ -363,22 +1588,116 @@
           <w:tcPr/>
           <w:p>
             <w:pPr>
-              <w:pStyle w:val="Compact"/>
+              <w:keepNext w:val="0"/>
+              <w:keepLines w:val="0"/>
+              <w:pageBreakBefore w:val="0"/>
+              <w:widowControl w:val="1"/>
+              <w:pBdr>
+                <w:top w:space="0" w:sz="0" w:val="nil"/>
+                <w:left w:space="0" w:sz="0" w:val="nil"/>
+                <w:bottom w:space="0" w:sz="0" w:val="nil"/>
+                <w:right w:space="0" w:sz="0" w:val="nil"/>
+                <w:between w:space="0" w:sz="0" w:val="nil"/>
+              </w:pBdr>
+              <w:shd w:fill="auto" w:val="clear"/>
+              <w:spacing w:after="36" w:before="36" w:line="240" w:lineRule="auto"/>
+              <w:ind w:left="0" w:right="0" w:firstLine="0"/>
+              <w:jc w:val="left"/>
+              <w:rPr>
+                <w:rFonts w:ascii="Aptos" w:cs="Aptos" w:eastAsia="Aptos" w:hAnsi="Aptos"/>
+                <w:b w:val="0"/>
+                <w:bCs w:val="0"/>
+                <w:i w:val="0"/>
+                <w:iCs w:val="0"/>
+                <w:smallCaps w:val="0"/>
+                <w:strike w:val="0"/>
+                <w:color w:val="000000"/>
+                <w:sz w:val="24"/>
+                <w:szCs w:val="24"/>
+                <w:u w:val="none"/>
+                <w:shd w:fill="auto" w:val="clear"/>
+                <w:vertAlign w:val="baseline"/>
+              </w:rPr>
             </w:pPr>
             <w:r>
+              <w:rPr>
+                <w:rFonts w:ascii="Aptos" w:cs="Aptos" w:eastAsia="Aptos" w:hAnsi="Aptos"/>
+                <w:b w:val="0"/>
+                <w:bCs w:val="0"/>
+                <w:i w:val="0"/>
+                <w:iCs w:val="0"/>
+                <w:smallCaps w:val="0"/>
+                <w:strike w:val="0"/>
+                <w:color w:val="000000"/>
+                <w:sz w:val="24"/>
+                <w:szCs w:val="24"/>
+                <w:u w:val="none"/>
+                <w:shd w:fill="auto" w:val="clear"/>
+                <w:vertAlign w:val="baseline"/>
+                <w:rtl w:val="0"/>
+              </w:rPr>
               <w:t xml:space="preserve">Cópias avulsas para preparar</w:t>
             </w:r>
           </w:p>
         </w:tc>
       </w:tr>
       <w:tr>
+        <w:trPr>
+          <w:cantSplit w:val="0"/>
+          <w:tblHeader w:val="0"/>
+        </w:trPr>
         <w:tc>
           <w:tcPr/>
           <w:p>
             <w:pPr>
-              <w:pStyle w:val="Compact"/>
+              <w:keepNext w:val="0"/>
+              <w:keepLines w:val="0"/>
+              <w:pageBreakBefore w:val="0"/>
+              <w:widowControl w:val="1"/>
+              <w:pBdr>
+                <w:top w:space="0" w:sz="0" w:val="nil"/>
+                <w:left w:space="0" w:sz="0" w:val="nil"/>
+                <w:bottom w:space="0" w:sz="0" w:val="nil"/>
+                <w:right w:space="0" w:sz="0" w:val="nil"/>
+                <w:between w:space="0" w:sz="0" w:val="nil"/>
+              </w:pBdr>
+              <w:shd w:fill="auto" w:val="clear"/>
+              <w:spacing w:after="36" w:before="36" w:line="240" w:lineRule="auto"/>
+              <w:ind w:left="0" w:right="0" w:firstLine="0"/>
+              <w:jc w:val="left"/>
+              <w:rPr>
+                <w:rFonts w:ascii="Aptos" w:cs="Aptos" w:eastAsia="Aptos" w:hAnsi="Aptos"/>
+                <w:b w:val="0"/>
+                <w:bCs w:val="0"/>
+                <w:i w:val="0"/>
+                <w:iCs w:val="0"/>
+                <w:smallCaps w:val="0"/>
+                <w:strike w:val="0"/>
+                <w:color w:val="000000"/>
+                <w:sz w:val="24"/>
+                <w:szCs w:val="24"/>
+                <w:u w:val="none"/>
+                <w:shd w:fill="auto" w:val="clear"/>
+                <w:vertAlign w:val="baseline"/>
+              </w:rPr>
             </w:pPr>
             <w:r>
+              <w:rPr>
+                <w:rFonts w:ascii="Aptos" w:cs="Aptos" w:eastAsia="Aptos" w:hAnsi="Aptos"/>
+                <w:b w:val="0"/>
+                <w:bCs w:val="0"/>
+                <w:i w:val="0"/>
+                <w:iCs w:val="0"/>
+                <w:smallCaps w:val="0"/>
+                <w:strike w:val="0"/>
+                <w:color w:val="000000"/>
+                <w:sz w:val="24"/>
+                <w:szCs w:val="24"/>
+                <w:u w:val="none"/>
+                <w:shd w:fill="auto" w:val="clear"/>
+                <w:vertAlign w:val="baseline"/>
+                <w:rtl w:val="0"/>
+              </w:rPr>
               <w:t xml:space="preserve">3ºC</w:t>
             </w:r>
           </w:p>
@@ -387,10 +1706,54 @@
           <w:tcPr/>
           <w:p>
             <w:pPr>
-              <w:pStyle w:val="Compact"/>
+              <w:keepNext w:val="0"/>
+              <w:keepLines w:val="0"/>
+              <w:pageBreakBefore w:val="0"/>
+              <w:widowControl w:val="1"/>
+              <w:pBdr>
+                <w:top w:space="0" w:sz="0" w:val="nil"/>
+                <w:left w:space="0" w:sz="0" w:val="nil"/>
+                <w:bottom w:space="0" w:sz="0" w:val="nil"/>
+                <w:right w:space="0" w:sz="0" w:val="nil"/>
+                <w:between w:space="0" w:sz="0" w:val="nil"/>
+              </w:pBdr>
+              <w:shd w:fill="auto" w:val="clear"/>
+              <w:spacing w:after="36" w:before="36" w:line="240" w:lineRule="auto"/>
+              <w:ind w:left="0" w:right="0" w:firstLine="0"/>
               <w:jc w:val="right"/>
+              <w:rPr>
+                <w:rFonts w:ascii="Aptos" w:cs="Aptos" w:eastAsia="Aptos" w:hAnsi="Aptos"/>
+                <w:b w:val="0"/>
+                <w:bCs w:val="0"/>
+                <w:i w:val="0"/>
+                <w:iCs w:val="0"/>
+                <w:smallCaps w:val="0"/>
+                <w:strike w:val="0"/>
+                <w:color w:val="000000"/>
+                <w:sz w:val="24"/>
+                <w:szCs w:val="24"/>
+                <w:u w:val="none"/>
+                <w:shd w:fill="auto" w:val="clear"/>
+                <w:vertAlign w:val="baseline"/>
+              </w:rPr>
             </w:pPr>
             <w:r>
+              <w:rPr>
+                <w:rFonts w:ascii="Aptos" w:cs="Aptos" w:eastAsia="Aptos" w:hAnsi="Aptos"/>
+                <w:b w:val="0"/>
+                <w:bCs w:val="0"/>
+                <w:i w:val="0"/>
+                <w:iCs w:val="0"/>
+                <w:smallCaps w:val="0"/>
+                <w:strike w:val="0"/>
+                <w:color w:val="000000"/>
+                <w:sz w:val="24"/>
+                <w:szCs w:val="24"/>
+                <w:u w:val="none"/>
+                <w:shd w:fill="auto" w:val="clear"/>
+                <w:vertAlign w:val="baseline"/>
+                <w:rtl w:val="0"/>
+              </w:rPr>
               <w:t xml:space="preserve">15</w:t>
             </w:r>
           </w:p>
@@ -399,22 +1762,116 @@
           <w:tcPr/>
           <w:p>
             <w:pPr>
-              <w:pStyle w:val="Compact"/>
+              <w:keepNext w:val="0"/>
+              <w:keepLines w:val="0"/>
+              <w:pageBreakBefore w:val="0"/>
+              <w:widowControl w:val="1"/>
+              <w:pBdr>
+                <w:top w:space="0" w:sz="0" w:val="nil"/>
+                <w:left w:space="0" w:sz="0" w:val="nil"/>
+                <w:bottom w:space="0" w:sz="0" w:val="nil"/>
+                <w:right w:space="0" w:sz="0" w:val="nil"/>
+                <w:between w:space="0" w:sz="0" w:val="nil"/>
+              </w:pBdr>
+              <w:shd w:fill="auto" w:val="clear"/>
+              <w:spacing w:after="36" w:before="36" w:line="240" w:lineRule="auto"/>
+              <w:ind w:left="0" w:right="0" w:firstLine="0"/>
+              <w:jc w:val="left"/>
+              <w:rPr>
+                <w:rFonts w:ascii="Aptos" w:cs="Aptos" w:eastAsia="Aptos" w:hAnsi="Aptos"/>
+                <w:b w:val="0"/>
+                <w:bCs w:val="0"/>
+                <w:i w:val="0"/>
+                <w:iCs w:val="0"/>
+                <w:smallCaps w:val="0"/>
+                <w:strike w:val="0"/>
+                <w:color w:val="000000"/>
+                <w:sz w:val="24"/>
+                <w:szCs w:val="24"/>
+                <w:u w:val="none"/>
+                <w:shd w:fill="auto" w:val="clear"/>
+                <w:vertAlign w:val="baseline"/>
+              </w:rPr>
             </w:pPr>
             <w:r>
+              <w:rPr>
+                <w:rFonts w:ascii="Aptos" w:cs="Aptos" w:eastAsia="Aptos" w:hAnsi="Aptos"/>
+                <w:b w:val="0"/>
+                <w:bCs w:val="0"/>
+                <w:i w:val="0"/>
+                <w:iCs w:val="0"/>
+                <w:smallCaps w:val="0"/>
+                <w:strike w:val="0"/>
+                <w:color w:val="000000"/>
+                <w:sz w:val="24"/>
+                <w:szCs w:val="24"/>
+                <w:u w:val="none"/>
+                <w:shd w:fill="auto" w:val="clear"/>
+                <w:vertAlign w:val="baseline"/>
+                <w:rtl w:val="0"/>
+              </w:rPr>
               <w:t xml:space="preserve">a especificar no material da aula</w:t>
             </w:r>
           </w:p>
         </w:tc>
       </w:tr>
       <w:tr>
+        <w:trPr>
+          <w:cantSplit w:val="0"/>
+          <w:tblHeader w:val="0"/>
+        </w:trPr>
         <w:tc>
           <w:tcPr/>
           <w:p>
             <w:pPr>
-              <w:pStyle w:val="Compact"/>
+              <w:keepNext w:val="0"/>
+              <w:keepLines w:val="0"/>
+              <w:pageBreakBefore w:val="0"/>
+              <w:widowControl w:val="1"/>
+              <w:pBdr>
+                <w:top w:space="0" w:sz="0" w:val="nil"/>
+                <w:left w:space="0" w:sz="0" w:val="nil"/>
+                <w:bottom w:space="0" w:sz="0" w:val="nil"/>
+                <w:right w:space="0" w:sz="0" w:val="nil"/>
+                <w:between w:space="0" w:sz="0" w:val="nil"/>
+              </w:pBdr>
+              <w:shd w:fill="auto" w:val="clear"/>
+              <w:spacing w:after="36" w:before="36" w:line="240" w:lineRule="auto"/>
+              <w:ind w:left="0" w:right="0" w:firstLine="0"/>
+              <w:jc w:val="left"/>
+              <w:rPr>
+                <w:rFonts w:ascii="Aptos" w:cs="Aptos" w:eastAsia="Aptos" w:hAnsi="Aptos"/>
+                <w:b w:val="0"/>
+                <w:bCs w:val="0"/>
+                <w:i w:val="0"/>
+                <w:iCs w:val="0"/>
+                <w:smallCaps w:val="0"/>
+                <w:strike w:val="0"/>
+                <w:color w:val="000000"/>
+                <w:sz w:val="24"/>
+                <w:szCs w:val="24"/>
+                <w:u w:val="none"/>
+                <w:shd w:fill="auto" w:val="clear"/>
+                <w:vertAlign w:val="baseline"/>
+              </w:rPr>
             </w:pPr>
             <w:r>
+              <w:rPr>
+                <w:rFonts w:ascii="Aptos" w:cs="Aptos" w:eastAsia="Aptos" w:hAnsi="Aptos"/>
+                <w:b w:val="0"/>
+                <w:bCs w:val="0"/>
+                <w:i w:val="0"/>
+                <w:iCs w:val="0"/>
+                <w:smallCaps w:val="0"/>
+                <w:strike w:val="0"/>
+                <w:color w:val="000000"/>
+                <w:sz w:val="24"/>
+                <w:szCs w:val="24"/>
+                <w:u w:val="none"/>
+                <w:shd w:fill="auto" w:val="clear"/>
+                <w:vertAlign w:val="baseline"/>
+                <w:rtl w:val="0"/>
+              </w:rPr>
               <w:t xml:space="preserve">1ºB</w:t>
             </w:r>
           </w:p>
@@ -423,10 +1880,54 @@
           <w:tcPr/>
           <w:p>
             <w:pPr>
-              <w:pStyle w:val="Compact"/>
+              <w:keepNext w:val="0"/>
+              <w:keepLines w:val="0"/>
+              <w:pageBreakBefore w:val="0"/>
+              <w:widowControl w:val="1"/>
+              <w:pBdr>
+                <w:top w:space="0" w:sz="0" w:val="nil"/>
+                <w:left w:space="0" w:sz="0" w:val="nil"/>
+                <w:bottom w:space="0" w:sz="0" w:val="nil"/>
+                <w:right w:space="0" w:sz="0" w:val="nil"/>
+                <w:between w:space="0" w:sz="0" w:val="nil"/>
+              </w:pBdr>
+              <w:shd w:fill="auto" w:val="clear"/>
+              <w:spacing w:after="36" w:before="36" w:line="240" w:lineRule="auto"/>
+              <w:ind w:left="0" w:right="0" w:firstLine="0"/>
               <w:jc w:val="right"/>
+              <w:rPr>
+                <w:rFonts w:ascii="Aptos" w:cs="Aptos" w:eastAsia="Aptos" w:hAnsi="Aptos"/>
+                <w:b w:val="0"/>
+                <w:bCs w:val="0"/>
+                <w:i w:val="0"/>
+                <w:iCs w:val="0"/>
+                <w:smallCaps w:val="0"/>
+                <w:strike w:val="0"/>
+                <w:color w:val="000000"/>
+                <w:sz w:val="24"/>
+                <w:szCs w:val="24"/>
+                <w:u w:val="none"/>
+                <w:shd w:fill="auto" w:val="clear"/>
+                <w:vertAlign w:val="baseline"/>
+              </w:rPr>
             </w:pPr>
             <w:r>
+              <w:rPr>
+                <w:rFonts w:ascii="Aptos" w:cs="Aptos" w:eastAsia="Aptos" w:hAnsi="Aptos"/>
+                <w:b w:val="0"/>
+                <w:bCs w:val="0"/>
+                <w:i w:val="0"/>
+                <w:iCs w:val="0"/>
+                <w:smallCaps w:val="0"/>
+                <w:strike w:val="0"/>
+                <w:color w:val="000000"/>
+                <w:sz w:val="24"/>
+                <w:szCs w:val="24"/>
+                <w:u w:val="none"/>
+                <w:shd w:fill="auto" w:val="clear"/>
+                <w:vertAlign w:val="baseline"/>
+                <w:rtl w:val="0"/>
+              </w:rPr>
               <w:t xml:space="preserve">15</w:t>
             </w:r>
           </w:p>
@@ -435,22 +1936,116 @@
           <w:tcPr/>
           <w:p>
             <w:pPr>
-              <w:pStyle w:val="Compact"/>
+              <w:keepNext w:val="0"/>
+              <w:keepLines w:val="0"/>
+              <w:pageBreakBefore w:val="0"/>
+              <w:widowControl w:val="1"/>
+              <w:pBdr>
+                <w:top w:space="0" w:sz="0" w:val="nil"/>
+                <w:left w:space="0" w:sz="0" w:val="nil"/>
+                <w:bottom w:space="0" w:sz="0" w:val="nil"/>
+                <w:right w:space="0" w:sz="0" w:val="nil"/>
+                <w:between w:space="0" w:sz="0" w:val="nil"/>
+              </w:pBdr>
+              <w:shd w:fill="auto" w:val="clear"/>
+              <w:spacing w:after="36" w:before="36" w:line="240" w:lineRule="auto"/>
+              <w:ind w:left="0" w:right="0" w:firstLine="0"/>
+              <w:jc w:val="left"/>
+              <w:rPr>
+                <w:rFonts w:ascii="Aptos" w:cs="Aptos" w:eastAsia="Aptos" w:hAnsi="Aptos"/>
+                <w:b w:val="0"/>
+                <w:bCs w:val="0"/>
+                <w:i w:val="0"/>
+                <w:iCs w:val="0"/>
+                <w:smallCaps w:val="0"/>
+                <w:strike w:val="0"/>
+                <w:color w:val="000000"/>
+                <w:sz w:val="24"/>
+                <w:szCs w:val="24"/>
+                <w:u w:val="none"/>
+                <w:shd w:fill="auto" w:val="clear"/>
+                <w:vertAlign w:val="baseline"/>
+              </w:rPr>
             </w:pPr>
             <w:r>
+              <w:rPr>
+                <w:rFonts w:ascii="Aptos" w:cs="Aptos" w:eastAsia="Aptos" w:hAnsi="Aptos"/>
+                <w:b w:val="0"/>
+                <w:bCs w:val="0"/>
+                <w:i w:val="0"/>
+                <w:iCs w:val="0"/>
+                <w:smallCaps w:val="0"/>
+                <w:strike w:val="0"/>
+                <w:color w:val="000000"/>
+                <w:sz w:val="24"/>
+                <w:szCs w:val="24"/>
+                <w:u w:val="none"/>
+                <w:shd w:fill="auto" w:val="clear"/>
+                <w:vertAlign w:val="baseline"/>
+                <w:rtl w:val="0"/>
+              </w:rPr>
               <w:t xml:space="preserve">a especificar no material da aula</w:t>
             </w:r>
           </w:p>
         </w:tc>
       </w:tr>
       <w:tr>
+        <w:trPr>
+          <w:cantSplit w:val="0"/>
+          <w:tblHeader w:val="0"/>
+        </w:trPr>
         <w:tc>
           <w:tcPr/>
           <w:p>
             <w:pPr>
-              <w:pStyle w:val="Compact"/>
+              <w:keepNext w:val="0"/>
+              <w:keepLines w:val="0"/>
+              <w:pageBreakBefore w:val="0"/>
+              <w:widowControl w:val="1"/>
+              <w:pBdr>
+                <w:top w:space="0" w:sz="0" w:val="nil"/>
+                <w:left w:space="0" w:sz="0" w:val="nil"/>
+                <w:bottom w:space="0" w:sz="0" w:val="nil"/>
+                <w:right w:space="0" w:sz="0" w:val="nil"/>
+                <w:between w:space="0" w:sz="0" w:val="nil"/>
+              </w:pBdr>
+              <w:shd w:fill="auto" w:val="clear"/>
+              <w:spacing w:after="36" w:before="36" w:line="240" w:lineRule="auto"/>
+              <w:ind w:left="0" w:right="0" w:firstLine="0"/>
+              <w:jc w:val="left"/>
+              <w:rPr>
+                <w:rFonts w:ascii="Aptos" w:cs="Aptos" w:eastAsia="Aptos" w:hAnsi="Aptos"/>
+                <w:b w:val="0"/>
+                <w:bCs w:val="0"/>
+                <w:i w:val="0"/>
+                <w:iCs w:val="0"/>
+                <w:smallCaps w:val="0"/>
+                <w:strike w:val="0"/>
+                <w:color w:val="000000"/>
+                <w:sz w:val="24"/>
+                <w:szCs w:val="24"/>
+                <w:u w:val="none"/>
+                <w:shd w:fill="auto" w:val="clear"/>
+                <w:vertAlign w:val="baseline"/>
+              </w:rPr>
             </w:pPr>
             <w:r>
+              <w:rPr>
+                <w:rFonts w:ascii="Aptos" w:cs="Aptos" w:eastAsia="Aptos" w:hAnsi="Aptos"/>
+                <w:b w:val="0"/>
+                <w:bCs w:val="0"/>
+                <w:i w:val="0"/>
+                <w:iCs w:val="0"/>
+                <w:smallCaps w:val="0"/>
+                <w:strike w:val="0"/>
+                <w:color w:val="000000"/>
+                <w:sz w:val="24"/>
+                <w:szCs w:val="24"/>
+                <w:u w:val="none"/>
+                <w:shd w:fill="auto" w:val="clear"/>
+                <w:vertAlign w:val="baseline"/>
+                <w:rtl w:val="0"/>
+              </w:rPr>
               <w:t xml:space="preserve">5ºA</w:t>
             </w:r>
           </w:p>
@@ -459,10 +2054,54 @@
           <w:tcPr/>
           <w:p>
             <w:pPr>
-              <w:pStyle w:val="Compact"/>
+              <w:keepNext w:val="0"/>
+              <w:keepLines w:val="0"/>
+              <w:pageBreakBefore w:val="0"/>
+              <w:widowControl w:val="1"/>
+              <w:pBdr>
+                <w:top w:space="0" w:sz="0" w:val="nil"/>
+                <w:left w:space="0" w:sz="0" w:val="nil"/>
+                <w:bottom w:space="0" w:sz="0" w:val="nil"/>
+                <w:right w:space="0" w:sz="0" w:val="nil"/>
+                <w:between w:space="0" w:sz="0" w:val="nil"/>
+              </w:pBdr>
+              <w:shd w:fill="auto" w:val="clear"/>
+              <w:spacing w:after="36" w:before="36" w:line="240" w:lineRule="auto"/>
+              <w:ind w:left="0" w:right="0" w:firstLine="0"/>
               <w:jc w:val="right"/>
+              <w:rPr>
+                <w:rFonts w:ascii="Aptos" w:cs="Aptos" w:eastAsia="Aptos" w:hAnsi="Aptos"/>
+                <w:b w:val="0"/>
+                <w:bCs w:val="0"/>
+                <w:i w:val="0"/>
+                <w:iCs w:val="0"/>
+                <w:smallCaps w:val="0"/>
+                <w:strike w:val="0"/>
+                <w:color w:val="000000"/>
+                <w:sz w:val="24"/>
+                <w:szCs w:val="24"/>
+                <w:u w:val="none"/>
+                <w:shd w:fill="auto" w:val="clear"/>
+                <w:vertAlign w:val="baseline"/>
+              </w:rPr>
             </w:pPr>
             <w:r>
+              <w:rPr>
+                <w:rFonts w:ascii="Aptos" w:cs="Aptos" w:eastAsia="Aptos" w:hAnsi="Aptos"/>
+                <w:b w:val="0"/>
+                <w:bCs w:val="0"/>
+                <w:i w:val="0"/>
+                <w:iCs w:val="0"/>
+                <w:smallCaps w:val="0"/>
+                <w:strike w:val="0"/>
+                <w:color w:val="000000"/>
+                <w:sz w:val="24"/>
+                <w:szCs w:val="24"/>
+                <w:u w:val="none"/>
+                <w:shd w:fill="auto" w:val="clear"/>
+                <w:vertAlign w:val="baseline"/>
+                <w:rtl w:val="0"/>
+              </w:rPr>
               <w:t xml:space="preserve">22</w:t>
             </w:r>
           </w:p>
@@ -471,27 +2110,122 @@
           <w:tcPr/>
           <w:p>
             <w:pPr>
-              <w:pStyle w:val="Compact"/>
+              <w:keepNext w:val="0"/>
+              <w:keepLines w:val="0"/>
+              <w:pageBreakBefore w:val="0"/>
+              <w:widowControl w:val="1"/>
+              <w:pBdr>
+                <w:top w:space="0" w:sz="0" w:val="nil"/>
+                <w:left w:space="0" w:sz="0" w:val="nil"/>
+                <w:bottom w:space="0" w:sz="0" w:val="nil"/>
+                <w:right w:space="0" w:sz="0" w:val="nil"/>
+                <w:between w:space="0" w:sz="0" w:val="nil"/>
+              </w:pBdr>
+              <w:shd w:fill="auto" w:val="clear"/>
+              <w:spacing w:after="36" w:before="36" w:line="240" w:lineRule="auto"/>
+              <w:ind w:left="0" w:right="0" w:firstLine="0"/>
+              <w:jc w:val="left"/>
+              <w:rPr>
+                <w:rFonts w:ascii="Aptos" w:cs="Aptos" w:eastAsia="Aptos" w:hAnsi="Aptos"/>
+                <w:b w:val="0"/>
+                <w:bCs w:val="0"/>
+                <w:i w:val="0"/>
+                <w:iCs w:val="0"/>
+                <w:smallCaps w:val="0"/>
+                <w:strike w:val="0"/>
+                <w:color w:val="000000"/>
+                <w:sz w:val="24"/>
+                <w:szCs w:val="24"/>
+                <w:u w:val="none"/>
+                <w:shd w:fill="auto" w:val="clear"/>
+                <w:vertAlign w:val="baseline"/>
+              </w:rPr>
             </w:pPr>
             <w:r>
+              <w:rPr>
+                <w:rFonts w:ascii="Aptos" w:cs="Aptos" w:eastAsia="Aptos" w:hAnsi="Aptos"/>
+                <w:b w:val="0"/>
+                <w:bCs w:val="0"/>
+                <w:i w:val="0"/>
+                <w:iCs w:val="0"/>
+                <w:smallCaps w:val="0"/>
+                <w:strike w:val="0"/>
+                <w:color w:val="000000"/>
+                <w:sz w:val="24"/>
+                <w:szCs w:val="24"/>
+                <w:u w:val="none"/>
+                <w:shd w:fill="auto" w:val="clear"/>
+                <w:vertAlign w:val="baseline"/>
+                <w:rtl w:val="0"/>
+              </w:rPr>
               <w:t xml:space="preserve">a especificar no material da aula</w:t>
             </w:r>
           </w:p>
         </w:tc>
       </w:tr>
       <w:tr>
+        <w:trPr>
+          <w:cantSplit w:val="0"/>
+          <w:tblHeader w:val="0"/>
+        </w:trPr>
         <w:tc>
           <w:tcPr/>
           <w:p>
             <w:pPr>
-              <w:pStyle w:val="Compact"/>
+              <w:keepNext w:val="0"/>
+              <w:keepLines w:val="0"/>
+              <w:pageBreakBefore w:val="0"/>
+              <w:widowControl w:val="1"/>
+              <w:pBdr>
+                <w:top w:space="0" w:sz="0" w:val="nil"/>
+                <w:left w:space="0" w:sz="0" w:val="nil"/>
+                <w:bottom w:space="0" w:sz="0" w:val="nil"/>
+                <w:right w:space="0" w:sz="0" w:val="nil"/>
+                <w:between w:space="0" w:sz="0" w:val="nil"/>
+              </w:pBdr>
+              <w:shd w:fill="auto" w:val="clear"/>
+              <w:spacing w:after="36" w:before="36" w:line="240" w:lineRule="auto"/>
+              <w:ind w:left="0" w:right="0" w:firstLine="0"/>
+              <w:jc w:val="left"/>
+              <w:rPr>
+                <w:rFonts w:ascii="Aptos" w:cs="Aptos" w:eastAsia="Aptos" w:hAnsi="Aptos"/>
+                <w:b w:val="0"/>
+                <w:bCs w:val="0"/>
+                <w:i w:val="0"/>
+                <w:iCs w:val="0"/>
+                <w:smallCaps w:val="0"/>
+                <w:strike w:val="0"/>
+                <w:color w:val="000000"/>
+                <w:sz w:val="24"/>
+                <w:szCs w:val="24"/>
+                <w:u w:val="none"/>
+                <w:shd w:fill="auto" w:val="clear"/>
+                <w:vertAlign w:val="baseline"/>
+              </w:rPr>
             </w:pPr>
             <w:r>
               <w:rPr>
-                <w:b/>
-                <w:bCs/>
+                <w:rFonts w:ascii="Aptos" w:cs="Aptos" w:eastAsia="Aptos" w:hAnsi="Aptos"/>
+                <w:b w:val="1"/>
+                <w:bCs w:val="1"/>
+                <w:i w:val="0"/>
+                <w:iCs w:val="0"/>
+                <w:smallCaps w:val="0"/>
+                <w:strike w:val="0"/>
+                <w:color w:val="000000"/>
+                <w:sz w:val="24"/>
+                <w:szCs w:val="24"/>
+                <w:u w:val="none"/>
+                <w:shd w:fill="auto" w:val="clear"/>
+                <w:vertAlign w:val="baseline"/>
+                <w:rtl w:val="0"/>
               </w:rPr>
               <w:t xml:space="preserve">Total</w:t>
+            </w:r>
+            <w:r>
+              <w:rPr>
+                <w:rtl w:val="0"/>
+              </w:rPr>
             </w:r>
           </w:p>
         </w:tc>
@@ -499,15 +2233,60 @@
           <w:tcPr/>
           <w:p>
             <w:pPr>
-              <w:pStyle w:val="Compact"/>
+              <w:keepNext w:val="0"/>
+              <w:keepLines w:val="0"/>
+              <w:pageBreakBefore w:val="0"/>
+              <w:widowControl w:val="1"/>
+              <w:pBdr>
+                <w:top w:space="0" w:sz="0" w:val="nil"/>
+                <w:left w:space="0" w:sz="0" w:val="nil"/>
+                <w:bottom w:space="0" w:sz="0" w:val="nil"/>
+                <w:right w:space="0" w:sz="0" w:val="nil"/>
+                <w:between w:space="0" w:sz="0" w:val="nil"/>
+              </w:pBdr>
+              <w:shd w:fill="auto" w:val="clear"/>
+              <w:spacing w:after="36" w:before="36" w:line="240" w:lineRule="auto"/>
+              <w:ind w:left="0" w:right="0" w:firstLine="0"/>
               <w:jc w:val="right"/>
+              <w:rPr>
+                <w:rFonts w:ascii="Aptos" w:cs="Aptos" w:eastAsia="Aptos" w:hAnsi="Aptos"/>
+                <w:b w:val="0"/>
+                <w:bCs w:val="0"/>
+                <w:i w:val="0"/>
+                <w:iCs w:val="0"/>
+                <w:smallCaps w:val="0"/>
+                <w:strike w:val="0"/>
+                <w:color w:val="000000"/>
+                <w:sz w:val="24"/>
+                <w:szCs w:val="24"/>
+                <w:u w:val="none"/>
+                <w:shd w:fill="auto" w:val="clear"/>
+                <w:vertAlign w:val="baseline"/>
+              </w:rPr>
             </w:pPr>
             <w:r>
               <w:rPr>
-                <w:b/>
-                <w:bCs/>
+                <w:rFonts w:ascii="Aptos" w:cs="Aptos" w:eastAsia="Aptos" w:hAnsi="Aptos"/>
+                <w:b w:val="1"/>
+                <w:bCs w:val="1"/>
+                <w:i w:val="0"/>
+                <w:iCs w:val="0"/>
+                <w:smallCaps w:val="0"/>
+                <w:strike w:val="0"/>
+                <w:color w:val="000000"/>
+                <w:sz w:val="24"/>
+                <w:szCs w:val="24"/>
+                <w:u w:val="none"/>
+                <w:shd w:fill="auto" w:val="clear"/>
+                <w:vertAlign w:val="baseline"/>
+                <w:rtl w:val="0"/>
               </w:rPr>
               <w:t xml:space="preserve">52</w:t>
+            </w:r>
+            <w:r>
+              <w:rPr>
+                <w:rtl w:val="0"/>
+              </w:rPr>
             </w:r>
           </w:p>
         </w:tc>
@@ -515,333 +2294,608 @@
           <w:tcPr/>
           <w:p>
             <w:pPr>
-              <w:pStyle w:val="Compact"/>
+              <w:keepNext w:val="0"/>
+              <w:keepLines w:val="0"/>
+              <w:pageBreakBefore w:val="0"/>
+              <w:widowControl w:val="1"/>
+              <w:pBdr>
+                <w:top w:space="0" w:sz="0" w:val="nil"/>
+                <w:left w:space="0" w:sz="0" w:val="nil"/>
+                <w:bottom w:space="0" w:sz="0" w:val="nil"/>
+                <w:right w:space="0" w:sz="0" w:val="nil"/>
+                <w:between w:space="0" w:sz="0" w:val="nil"/>
+              </w:pBdr>
+              <w:shd w:fill="auto" w:val="clear"/>
+              <w:spacing w:after="36" w:before="36" w:line="240" w:lineRule="auto"/>
+              <w:ind w:left="0" w:right="0" w:firstLine="0"/>
+              <w:jc w:val="left"/>
+              <w:rPr>
+                <w:rFonts w:ascii="Aptos" w:cs="Aptos" w:eastAsia="Aptos" w:hAnsi="Aptos"/>
+                <w:b w:val="0"/>
+                <w:bCs w:val="0"/>
+                <w:i w:val="0"/>
+                <w:iCs w:val="0"/>
+                <w:smallCaps w:val="0"/>
+                <w:strike w:val="0"/>
+                <w:color w:val="000000"/>
+                <w:sz w:val="24"/>
+                <w:szCs w:val="24"/>
+                <w:u w:val="none"/>
+                <w:shd w:fill="auto" w:val="clear"/>
+                <w:vertAlign w:val="baseline"/>
+              </w:rPr>
             </w:pPr>
             <w:r>
+              <w:rPr>
+                <w:rFonts w:ascii="Aptos" w:cs="Aptos" w:eastAsia="Aptos" w:hAnsi="Aptos"/>
+                <w:b w:val="0"/>
+                <w:bCs w:val="0"/>
+                <w:i w:val="0"/>
+                <w:iCs w:val="0"/>
+                <w:smallCaps w:val="0"/>
+                <w:strike w:val="0"/>
+                <w:color w:val="000000"/>
+                <w:sz w:val="24"/>
+                <w:szCs w:val="24"/>
+                <w:u w:val="none"/>
+                <w:shd w:fill="auto" w:val="clear"/>
+                <w:vertAlign w:val="baseline"/>
+                <w:rtl w:val="0"/>
+              </w:rPr>
               <w:t xml:space="preserve">confirmar fichas avulsas por atividade</w:t>
             </w:r>
           </w:p>
         </w:tc>
       </w:tr>
     </w:tbl>
-    <w:bookmarkEnd w:id="10"/>
-    <w:bookmarkStart w:id="14" w:name="roteiros-compartilhados"/>
+    <w:bookmarkStart w:colFirst="0" w:colLast="0" w:name="bookmark=id.ll9b4442cy65" w:id="3"/>
+    <w:bookmarkEnd w:id="3"/>
     <w:p>
       <w:pPr>
         <w:pStyle w:val="Heading2"/>
+        <w:rPr/>
       </w:pPr>
       <w:r>
+        <w:rPr>
+          <w:rtl w:val="0"/>
+        </w:rPr>
         <w:t xml:space="preserve">Roteiros compartilhados</w:t>
       </w:r>
     </w:p>
-    <w:bookmarkStart w:id="11" w:name="º-ano-carros-malucos-desfile"/>
+    <w:bookmarkStart w:colFirst="0" w:colLast="0" w:name="bookmark=id.r9faglk9tpya" w:id="4"/>
+    <w:bookmarkEnd w:id="4"/>
     <w:p>
       <w:pPr>
         <w:pStyle w:val="Heading3"/>
+        <w:rPr/>
       </w:pPr>
       <w:r>
+        <w:rPr>
+          <w:rtl w:val="0"/>
+        </w:rPr>
         <w:t xml:space="preserve">1º ano — Carros malucos + Desfile</w:t>
       </w:r>
     </w:p>
     <w:p>
       <w:pPr>
-        <w:pStyle w:val="Compact"/>
+        <w:keepNext w:val="0"/>
+        <w:keepLines w:val="0"/>
+        <w:pageBreakBefore w:val="0"/>
+        <w:widowControl w:val="1"/>
         <w:numPr>
           <w:ilvl w:val="0"/>
-          <w:numId w:val="1001"/>
+          <w:numId w:val="1"/>
         </w:numPr>
+        <w:pBdr>
+          <w:top w:space="0" w:sz="0" w:val="nil"/>
+          <w:left w:space="0" w:sz="0" w:val="nil"/>
+          <w:bottom w:space="0" w:sz="0" w:val="nil"/>
+          <w:right w:space="0" w:sz="0" w:val="nil"/>
+          <w:between w:space="0" w:sz="0" w:val="nil"/>
+        </w:pBdr>
+        <w:shd w:fill="auto" w:val="clear"/>
+        <w:spacing w:after="36" w:before="36" w:line="240" w:lineRule="auto"/>
+        <w:ind w:left="720" w:right="0" w:hanging="360"/>
+        <w:jc w:val="left"/>
+        <w:rPr/>
       </w:pPr>
       <w:r>
+        <w:rPr>
+          <w:rFonts w:ascii="Aptos" w:cs="Aptos" w:eastAsia="Aptos" w:hAnsi="Aptos"/>
+          <w:b w:val="0"/>
+          <w:bCs w:val="0"/>
+          <w:i w:val="0"/>
+          <w:iCs w:val="0"/>
+          <w:smallCaps w:val="0"/>
+          <w:strike w:val="0"/>
+          <w:color w:val="000000"/>
+          <w:sz w:val="24"/>
+          <w:szCs w:val="24"/>
+          <w:u w:val="none"/>
+          <w:shd w:fill="auto" w:val="clear"/>
+          <w:vertAlign w:val="baseline"/>
+          <w:rtl w:val="0"/>
+        </w:rPr>
         <w:t xml:space="preserve">Objetivo: programar, testar e apresentar um carro maluco em uma pista criada pela turma.</w:t>
       </w:r>
     </w:p>
     <w:p>
       <w:pPr>
-        <w:pStyle w:val="Compact"/>
+        <w:keepNext w:val="0"/>
+        <w:keepLines w:val="0"/>
+        <w:pageBreakBefore w:val="0"/>
+        <w:widowControl w:val="1"/>
         <w:numPr>
           <w:ilvl w:val="0"/>
-          <w:numId w:val="1001"/>
+          <w:numId w:val="1"/>
         </w:numPr>
+        <w:pBdr>
+          <w:top w:space="0" w:sz="0" w:val="nil"/>
+          <w:left w:space="0" w:sz="0" w:val="nil"/>
+          <w:bottom w:space="0" w:sz="0" w:val="nil"/>
+          <w:right w:space="0" w:sz="0" w:val="nil"/>
+          <w:between w:space="0" w:sz="0" w:val="nil"/>
+        </w:pBdr>
+        <w:shd w:fill="auto" w:val="clear"/>
+        <w:spacing w:after="36" w:before="36" w:line="240" w:lineRule="auto"/>
+        <w:ind w:left="720" w:right="0" w:hanging="360"/>
+        <w:jc w:val="left"/>
+        <w:rPr/>
       </w:pPr>
       <w:r>
+        <w:rPr>
+          <w:rFonts w:ascii="Aptos" w:cs="Aptos" w:eastAsia="Aptos" w:hAnsi="Aptos"/>
+          <w:b w:val="0"/>
+          <w:bCs w:val="0"/>
+          <w:i w:val="0"/>
+          <w:iCs w:val="0"/>
+          <w:smallCaps w:val="0"/>
+          <w:strike w:val="0"/>
+          <w:color w:val="000000"/>
+          <w:sz w:val="24"/>
+          <w:szCs w:val="24"/>
+          <w:u w:val="none"/>
+          <w:shd w:fill="auto" w:val="clear"/>
+          <w:vertAlign w:val="baseline"/>
+          <w:rtl w:val="0"/>
+        </w:rPr>
         <w:t xml:space="preserve">Referências: professor pp. 112 e 118; aluno pp. 23–36.</w:t>
       </w:r>
     </w:p>
     <w:p>
       <w:pPr>
-        <w:pStyle w:val="Compact"/>
+        <w:keepNext w:val="0"/>
+        <w:keepLines w:val="0"/>
+        <w:pageBreakBefore w:val="0"/>
+        <w:widowControl w:val="1"/>
         <w:numPr>
           <w:ilvl w:val="0"/>
-          <w:numId w:val="1001"/>
+          <w:numId w:val="1"/>
         </w:numPr>
+        <w:pBdr>
+          <w:top w:space="0" w:sz="0" w:val="nil"/>
+          <w:left w:space="0" w:sz="0" w:val="nil"/>
+          <w:bottom w:space="0" w:sz="0" w:val="nil"/>
+          <w:right w:space="0" w:sz="0" w:val="nil"/>
+          <w:between w:space="0" w:sz="0" w:val="nil"/>
+        </w:pBdr>
+        <w:shd w:fill="auto" w:val="clear"/>
+        <w:spacing w:after="36" w:before="36" w:line="240" w:lineRule="auto"/>
+        <w:ind w:left="720" w:right="0" w:hanging="360"/>
+        <w:jc w:val="left"/>
+        <w:rPr/>
       </w:pPr>
       <w:r>
+        <w:rPr>
+          <w:rFonts w:ascii="Aptos" w:cs="Aptos" w:eastAsia="Aptos" w:hAnsi="Aptos"/>
+          <w:b w:val="0"/>
+          <w:bCs w:val="0"/>
+          <w:i w:val="0"/>
+          <w:iCs w:val="0"/>
+          <w:smallCaps w:val="0"/>
+          <w:strike w:val="0"/>
+          <w:color w:val="000000"/>
+          <w:sz w:val="24"/>
+          <w:szCs w:val="24"/>
+          <w:u w:val="none"/>
+          <w:shd w:fill="auto" w:val="clear"/>
+          <w:vertAlign w:val="baseline"/>
+          <w:rtl w:val="0"/>
+        </w:rPr>
         <w:t xml:space="preserve">Condução: retomada de comandos; Carros malucos; preparação e teste do Desfile; apresentação e registro do ajuste principal.</w:t>
       </w:r>
     </w:p>
-    <w:bookmarkEnd w:id="11"/>
-    <w:bookmarkStart w:id="12" w:name="X94726b371eb6b37fc86d74a83e3a76829bbb8b5"/>
+    <w:bookmarkStart w:colFirst="0" w:colLast="0" w:name="bookmark=id.d11bvyvr377n" w:id="5"/>
+    <w:bookmarkEnd w:id="5"/>
     <w:p>
       <w:pPr>
         <w:pStyle w:val="Heading4"/>
+        <w:rPr/>
       </w:pPr>
       <w:r>
-        <w:t>Resumo do Encontro</w:t>
+        <w:rPr>
+          <w:rtl w:val="0"/>
+        </w:rPr>
+        <w:t xml:space="preserve">Resumo do Encontro</w:t>
       </w:r>
     </w:p>
     <w:p>
-      <w:pPr/>
+      <w:pPr>
+        <w:rPr/>
+      </w:pPr>
       <w:r>
-        <w:t>Mensagem de rotina para as famílias: Hoje a turma criou e programou um carro maluco para percorrer uma pista elaborada coletivamente. As crianças planejaram trajetos, organizaram os comandos, testaram as sequências e ajustaram a programação até que o carro cumprisse o desafio. No desfile final, puderam apresentar suas soluções e celebrar as descobertas da turma.</w:t>
+        <w:rPr>
+          <w:rtl w:val="0"/>
+        </w:rPr>
+        <w:t xml:space="preserve">Mensagem de rotina para as famílias: Hoje a turma criou e programou um carro maluco para percorrer uma pista elaborada coletivamente. As crianças planejaram trajetos, organizaram os comandos, testaram as sequências e ajustaram a programação até que o carro cumprisse o desafio. No desfile final, puderam apresentar suas soluções e celebrar as descobertas da turma.</w:t>
       </w:r>
     </w:p>
     <w:p>
       <w:pPr>
         <w:pStyle w:val="Heading3"/>
+        <w:rPr/>
       </w:pPr>
       <w:r>
+        <w:rPr>
+          <w:rtl w:val="0"/>
+        </w:rPr>
         <w:t xml:space="preserve">3º ano — Desafio de Cores + Robô batedor de asas</w:t>
       </w:r>
     </w:p>
     <w:p>
       <w:pPr>
-        <w:pStyle w:val="Compact"/>
+        <w:keepNext w:val="0"/>
+        <w:keepLines w:val="0"/>
+        <w:pageBreakBefore w:val="0"/>
+        <w:widowControl w:val="1"/>
         <w:numPr>
           <w:ilvl w:val="0"/>
-          <w:numId w:val="1002"/>
+          <w:numId w:val="2"/>
         </w:numPr>
+        <w:pBdr>
+          <w:top w:space="0" w:sz="0" w:val="nil"/>
+          <w:left w:space="0" w:sz="0" w:val="nil"/>
+          <w:bottom w:space="0" w:sz="0" w:val="nil"/>
+          <w:right w:space="0" w:sz="0" w:val="nil"/>
+          <w:between w:space="0" w:sz="0" w:val="nil"/>
+        </w:pBdr>
+        <w:shd w:fill="auto" w:val="clear"/>
+        <w:spacing w:after="36" w:before="36" w:line="240" w:lineRule="auto"/>
+        <w:ind w:left="720" w:right="0" w:hanging="360"/>
+        <w:jc w:val="left"/>
+        <w:rPr/>
       </w:pPr>
       <w:r>
+        <w:rPr>
+          <w:rFonts w:ascii="Aptos" w:cs="Aptos" w:eastAsia="Aptos" w:hAnsi="Aptos"/>
+          <w:b w:val="0"/>
+          <w:bCs w:val="0"/>
+          <w:i w:val="0"/>
+          <w:iCs w:val="0"/>
+          <w:smallCaps w:val="0"/>
+          <w:strike w:val="0"/>
+          <w:color w:val="000000"/>
+          <w:sz w:val="24"/>
+          <w:szCs w:val="24"/>
+          <w:u w:val="none"/>
+          <w:shd w:fill="auto" w:val="clear"/>
+          <w:vertAlign w:val="baseline"/>
+          <w:rtl w:val="0"/>
+        </w:rPr>
         <w:t xml:space="preserve">Objetivo: aplicar conhecimentos sobre cores e construir/testar o mecanismo de asas.</w:t>
       </w:r>
     </w:p>
     <w:p>
       <w:pPr>
-        <w:pStyle w:val="Compact"/>
+        <w:keepNext w:val="0"/>
+        <w:keepLines w:val="0"/>
+        <w:pageBreakBefore w:val="0"/>
+        <w:widowControl w:val="1"/>
         <w:numPr>
           <w:ilvl w:val="0"/>
-          <w:numId w:val="1002"/>
+          <w:numId w:val="2"/>
         </w:numPr>
+        <w:pBdr>
+          <w:top w:space="0" w:sz="0" w:val="nil"/>
+          <w:left w:space="0" w:sz="0" w:val="nil"/>
+          <w:bottom w:space="0" w:sz="0" w:val="nil"/>
+          <w:right w:space="0" w:sz="0" w:val="nil"/>
+          <w:between w:space="0" w:sz="0" w:val="nil"/>
+        </w:pBdr>
+        <w:shd w:fill="auto" w:val="clear"/>
+        <w:spacing w:after="36" w:before="36" w:line="240" w:lineRule="auto"/>
+        <w:ind w:left="720" w:right="0" w:hanging="360"/>
+        <w:jc w:val="left"/>
+        <w:rPr/>
       </w:pPr>
       <w:r>
+        <w:rPr>
+          <w:rFonts w:ascii="Aptos" w:cs="Aptos" w:eastAsia="Aptos" w:hAnsi="Aptos"/>
+          <w:b w:val="0"/>
+          <w:bCs w:val="0"/>
+          <w:i w:val="0"/>
+          <w:iCs w:val="0"/>
+          <w:smallCaps w:val="0"/>
+          <w:strike w:val="0"/>
+          <w:color w:val="000000"/>
+          <w:sz w:val="24"/>
+          <w:szCs w:val="24"/>
+          <w:u w:val="none"/>
+          <w:shd w:fill="auto" w:val="clear"/>
+          <w:vertAlign w:val="baseline"/>
+          <w:rtl w:val="0"/>
+        </w:rPr>
         <w:t xml:space="preserve">Referências: professor pp. 140 e 164; aluno pp. 111 e 131.</w:t>
       </w:r>
     </w:p>
     <w:p>
       <w:pPr>
-        <w:pStyle w:val="Compact"/>
+        <w:keepNext w:val="0"/>
+        <w:keepLines w:val="0"/>
+        <w:pageBreakBefore w:val="0"/>
+        <w:widowControl w:val="1"/>
         <w:numPr>
           <w:ilvl w:val="0"/>
-          <w:numId w:val="1002"/>
+          <w:numId w:val="2"/>
         </w:numPr>
+        <w:pBdr>
+          <w:top w:space="0" w:sz="0" w:val="nil"/>
+          <w:left w:space="0" w:sz="0" w:val="nil"/>
+          <w:bottom w:space="0" w:sz="0" w:val="nil"/>
+          <w:right w:space="0" w:sz="0" w:val="nil"/>
+          <w:between w:space="0" w:sz="0" w:val="nil"/>
+        </w:pBdr>
+        <w:shd w:fill="auto" w:val="clear"/>
+        <w:spacing w:after="36" w:before="36" w:line="240" w:lineRule="auto"/>
+        <w:ind w:left="720" w:right="0" w:hanging="360"/>
+        <w:jc w:val="left"/>
+        <w:rPr/>
       </w:pPr>
       <w:r>
+        <w:rPr>
+          <w:rFonts w:ascii="Aptos" w:cs="Aptos" w:eastAsia="Aptos" w:hAnsi="Aptos"/>
+          <w:b w:val="0"/>
+          <w:bCs w:val="0"/>
+          <w:i w:val="0"/>
+          <w:iCs w:val="0"/>
+          <w:smallCaps w:val="0"/>
+          <w:strike w:val="0"/>
+          <w:color w:val="000000"/>
+          <w:sz w:val="24"/>
+          <w:szCs w:val="24"/>
+          <w:u w:val="none"/>
+          <w:shd w:fill="auto" w:val="clear"/>
+          <w:vertAlign w:val="baseline"/>
+          <w:rtl w:val="0"/>
+        </w:rPr>
         <w:t xml:space="preserve">Condução: retomada de cores; desafio; montagem e teste do robô; registro de como o movimento é produzido.</w:t>
       </w:r>
     </w:p>
-    <w:bookmarkEnd w:id="12"/>
-    <w:bookmarkStart w:id="13" w:name="º-ano-desafio-de-bem-estar"/>
+    <w:bookmarkStart w:colFirst="0" w:colLast="0" w:name="bookmark=id.ndzcum41ykpj" w:id="6"/>
+    <w:bookmarkEnd w:id="6"/>
     <w:p>
       <w:pPr>
         <w:pStyle w:val="Heading4"/>
+        <w:rPr/>
       </w:pPr>
       <w:r>
-        <w:t>Resumo do Encontro</w:t>
+        <w:rPr>
+          <w:rtl w:val="0"/>
+        </w:rPr>
+        <w:t xml:space="preserve">Resumo do Encontro</w:t>
       </w:r>
     </w:p>
     <w:p>
-      <w:pPr/>
+      <w:pPr>
+        <w:rPr/>
+      </w:pPr>
       <w:r>
-        <w:t>Mensagem de rotina para as famílias: Hoje a turma retomou os estudos sobre cores e construiu o Robô batedor de asas. Durante a montagem, as crianças observaram como as peças formam um mecanismo, testaram o movimento das asas e fizeram ajustes quando necessário. A atividade uniu investigação, criatividade e trabalho em equipe.</w:t>
+        <w:rPr>
+          <w:rtl w:val="0"/>
+        </w:rPr>
+        <w:t xml:space="preserve">Mensagem de rotina para as famílias: Hoje a turma retomou os estudos sobre cores e construiu o Robô batedor de asas. Durante a montagem, as crianças observaram como as peças formam um mecanismo, testaram o movimento das asas e fizeram ajustes quando necessário. A atividade uniu investigação, criatividade e trabalho em equipe.</w:t>
       </w:r>
     </w:p>
     <w:p>
       <w:pPr>
         <w:pStyle w:val="Heading3"/>
+        <w:rPr/>
       </w:pPr>
       <w:r>
+        <w:rPr>
+          <w:rtl w:val="0"/>
+        </w:rPr>
         <w:t xml:space="preserve">5º ano — Desafio de Bem-estar</w:t>
       </w:r>
     </w:p>
     <w:p>
       <w:pPr>
-        <w:pStyle w:val="Compact"/>
+        <w:keepNext w:val="0"/>
+        <w:keepLines w:val="0"/>
+        <w:pageBreakBefore w:val="0"/>
+        <w:widowControl w:val="1"/>
         <w:numPr>
           <w:ilvl w:val="0"/>
-          <w:numId w:val="1003"/>
+          <w:numId w:val="3"/>
         </w:numPr>
+        <w:pBdr>
+          <w:top w:space="0" w:sz="0" w:val="nil"/>
+          <w:left w:space="0" w:sz="0" w:val="nil"/>
+          <w:bottom w:space="0" w:sz="0" w:val="nil"/>
+          <w:right w:space="0" w:sz="0" w:val="nil"/>
+          <w:between w:space="0" w:sz="0" w:val="nil"/>
+        </w:pBdr>
+        <w:shd w:fill="auto" w:val="clear"/>
+        <w:spacing w:after="36" w:before="36" w:line="240" w:lineRule="auto"/>
+        <w:ind w:left="720" w:right="0" w:hanging="360"/>
+        <w:jc w:val="left"/>
+        <w:rPr/>
       </w:pPr>
       <w:r>
+        <w:rPr>
+          <w:rFonts w:ascii="Aptos" w:cs="Aptos" w:eastAsia="Aptos" w:hAnsi="Aptos"/>
+          <w:b w:val="0"/>
+          <w:bCs w:val="0"/>
+          <w:i w:val="0"/>
+          <w:iCs w:val="0"/>
+          <w:smallCaps w:val="0"/>
+          <w:strike w:val="0"/>
+          <w:color w:val="000000"/>
+          <w:sz w:val="24"/>
+          <w:szCs w:val="24"/>
+          <w:u w:val="none"/>
+          <w:shd w:fill="auto" w:val="clear"/>
+          <w:vertAlign w:val="baseline"/>
+          <w:rtl w:val="0"/>
+        </w:rPr>
         <w:t xml:space="preserve">Objetivo: aplicar o estudo do Sistema respiratório em uma investigação de bem-estar.</w:t>
       </w:r>
     </w:p>
     <w:p>
       <w:pPr>
-        <w:pStyle w:val="Compact"/>
+        <w:keepNext w:val="0"/>
+        <w:keepLines w:val="0"/>
+        <w:pageBreakBefore w:val="0"/>
+        <w:widowControl w:val="1"/>
         <w:numPr>
           <w:ilvl w:val="0"/>
-          <w:numId w:val="1003"/>
+          <w:numId w:val="3"/>
         </w:numPr>
+        <w:pBdr>
+          <w:top w:space="0" w:sz="0" w:val="nil"/>
+          <w:left w:space="0" w:sz="0" w:val="nil"/>
+          <w:bottom w:space="0" w:sz="0" w:val="nil"/>
+          <w:right w:space="0" w:sz="0" w:val="nil"/>
+          <w:between w:space="0" w:sz="0" w:val="nil"/>
+        </w:pBdr>
+        <w:shd w:fill="auto" w:val="clear"/>
+        <w:spacing w:after="36" w:before="36" w:line="240" w:lineRule="auto"/>
+        <w:ind w:left="720" w:right="0" w:hanging="360"/>
+        <w:jc w:val="left"/>
+        <w:rPr/>
       </w:pPr>
       <w:r>
+        <w:rPr>
+          <w:rFonts w:ascii="Aptos" w:cs="Aptos" w:eastAsia="Aptos" w:hAnsi="Aptos"/>
+          <w:b w:val="0"/>
+          <w:bCs w:val="0"/>
+          <w:i w:val="0"/>
+          <w:iCs w:val="0"/>
+          <w:smallCaps w:val="0"/>
+          <w:strike w:val="0"/>
+          <w:color w:val="000000"/>
+          <w:sz w:val="24"/>
+          <w:szCs w:val="24"/>
+          <w:u w:val="none"/>
+          <w:shd w:fill="auto" w:val="clear"/>
+          <w:vertAlign w:val="baseline"/>
+          <w:rtl w:val="0"/>
+        </w:rPr>
         <w:t xml:space="preserve">Referências: professor p. 234; aluno p. 195.</w:t>
       </w:r>
     </w:p>
     <w:p>
       <w:pPr>
-        <w:pStyle w:val="Compact"/>
+        <w:keepNext w:val="0"/>
+        <w:keepLines w:val="0"/>
+        <w:pageBreakBefore w:val="0"/>
+        <w:widowControl w:val="1"/>
         <w:numPr>
           <w:ilvl w:val="0"/>
-          <w:numId w:val="1003"/>
+          <w:numId w:val="3"/>
         </w:numPr>
+        <w:pBdr>
+          <w:top w:space="0" w:sz="0" w:val="nil"/>
+          <w:left w:space="0" w:sz="0" w:val="nil"/>
+          <w:bottom w:space="0" w:sz="0" w:val="nil"/>
+          <w:right w:space="0" w:sz="0" w:val="nil"/>
+          <w:between w:space="0" w:sz="0" w:val="nil"/>
+        </w:pBdr>
+        <w:shd w:fill="auto" w:val="clear"/>
+        <w:spacing w:after="36" w:before="36" w:line="240" w:lineRule="auto"/>
+        <w:ind w:left="720" w:right="0" w:hanging="360"/>
+        <w:jc w:val="left"/>
+        <w:rPr/>
       </w:pPr>
       <w:r>
+        <w:rPr>
+          <w:rFonts w:ascii="Aptos" w:cs="Aptos" w:eastAsia="Aptos" w:hAnsi="Aptos"/>
+          <w:b w:val="0"/>
+          <w:bCs w:val="0"/>
+          <w:i w:val="0"/>
+          <w:iCs w:val="0"/>
+          <w:smallCaps w:val="0"/>
+          <w:strike w:val="0"/>
+          <w:color w:val="000000"/>
+          <w:sz w:val="24"/>
+          <w:szCs w:val="24"/>
+          <w:u w:val="none"/>
+          <w:shd w:fill="auto" w:val="clear"/>
+          <w:vertAlign w:val="baseline"/>
+          <w:rtl w:val="0"/>
+        </w:rPr>
         <w:t xml:space="preserve">Condução: retomada do modelo respiratório; desafio em equipes; socialização das evidências; registro de uma prática de bem-estar.</w:t>
       </w:r>
     </w:p>
-    <w:bookmarkEnd w:id="13"/>
-    <w:bookmarkEnd w:id="14"/>
-    <w:bookmarkEnd w:id="15"/>
     <w:p>
       <w:pPr>
         <w:pStyle w:val="Heading4"/>
+        <w:rPr/>
       </w:pPr>
       <w:r>
-        <w:t>Resumo do Encontro</w:t>
+        <w:rPr>
+          <w:rtl w:val="0"/>
+        </w:rPr>
+        <w:t xml:space="preserve">Resumo do Encontro</w:t>
       </w:r>
     </w:p>
     <w:p>
-      <w:pPr/>
+      <w:pPr>
+        <w:rPr/>
+      </w:pPr>
       <w:r>
-        <w:t>Mensagem de rotina para as famílias: Hoje a turma participou de um desafio de bem-estar a partir do que estudou sobre o sistema respiratório. As crianças analisaram situações do cotidiano, relacionaram respiração, movimento e cuidados com o corpo e compartilharam suas conclusões. Foi um momento de investigar como os conhecimentos científicos também ajudam nas escolhas do dia a dia.</w:t>
+        <w:rPr>
+          <w:rtl w:val="0"/>
+        </w:rPr>
+        <w:t xml:space="preserve">Mensagem de rotina para as famílias: Hoje a turma participou de um desafio de bem-estar a partir do que estudou sobre o sistema respiratório. As crianças analisaram situações do cotidiano, relacionaram respiração, movimento e cuidados com o corpo e compartilharam suas conclusões. Foi um momento de investigar como os conhecimentos científicos também ajudam nas escolhas do dia a dia.</w:t>
       </w:r>
     </w:p>
-    <w:p/>
+    <w:p>
+      <w:pPr>
+        <w:rPr/>
+      </w:pPr>
+      <w:r>
+        <w:rPr>
+          <w:rtl w:val="0"/>
+        </w:rPr>
+      </w:r>
+    </w:p>
     <w:sectPr>
-      <w:footnotePr>
-        <w:numRestart w:val="eachSect"/>
-      </w:footnotePr>
+      <w:pgSz w:h="15840" w:w="12240" w:orient="portrait"/>
+      <w:pgMar w:bottom="1440" w:top="1440" w:left="1440" w:right="1440" w:header="360" w:footer="360"/>
+      <w:pgNumType w:start="1"/>
     </w:sectPr>
   </w:body>
 </w:document>
 </file>
 
-<file path=word/comments.xml><?xml version="1.0" encoding="utf-8"?>
-<w:comments xmlns:w="http://schemas.openxmlformats.org/wordprocessingml/2006/main" xmlns:m="http://schemas.openxmlformats.org/officeDocument/2006/math" xmlns:r="http://schemas.openxmlformats.org/officeDocument/2006/relationships" xmlns:o="urn:schemas-microsoft-com:office:office" xmlns:v="urn:schemas-microsoft-com:vml" xmlns:w10="urn:schemas-microsoft-com:office:word" xmlns:a="http://schemas.openxmlformats.org/drawingml/2006/main" xmlns:pic="http://schemas.openxmlformats.org/drawingml/2006/picture" xmlns:wp="http://schemas.openxmlformats.org/drawingml/2006/wordprocessingDrawing"/>
-</file>
-
-<file path=word/footnotes.xml><?xml version="1.0" encoding="utf-8"?>
-<w:footnotes xmlns:w="http://schemas.openxmlformats.org/wordprocessingml/2006/main" xmlns:m="http://schemas.openxmlformats.org/officeDocument/2006/math" xmlns:r="http://schemas.openxmlformats.org/officeDocument/2006/relationships" xmlns:o="urn:schemas-microsoft-com:office:office" xmlns:v="urn:schemas-microsoft-com:vml" xmlns:w10="urn:schemas-microsoft-com:office:word" xmlns:a="http://schemas.openxmlformats.org/drawingml/2006/main" xmlns:pic="http://schemas.openxmlformats.org/drawingml/2006/picture" xmlns:wp="http://schemas.openxmlformats.org/drawingml/2006/wordprocessingDrawing">
-  <w:footnote w:type="continuationSeparator" w:id="0">
-    <w:p>
-      <w:r>
-        <w:continuationSeparator/>
-      </w:r>
-    </w:p>
-  </w:footnote>
-  <w:footnote w:type="separator" w:id="-1">
-    <w:p>
-      <w:r>
-        <w:separator/>
-      </w:r>
-    </w:p>
-  </w:footnote>
-</w:footnotes>
-</file>
-
 <file path=word/numbering.xml><?xml version="1.0" encoding="utf-8"?>
-<w:numbering xmlns:w="http://schemas.openxmlformats.org/wordprocessingml/2006/main">
-  <w:abstractNum w:abstractNumId="990">
-    <w:nsid w:val="0000A990"/>
-    <w:multiLevelType w:val="multilevel"/>
+<w:numbering xmlns:mc="http://schemas.openxmlformats.org/markup-compatibility/2006" xmlns:o="urn:schemas-microsoft-com:office:office" xmlns:r="http://schemas.openxmlformats.org/officeDocument/2006/relationships" xmlns:m="http://schemas.openxmlformats.org/officeDocument/2006/math" xmlns:v="urn:schemas-microsoft-com:vml" xmlns:wp="http://schemas.openxmlformats.org/drawingml/2006/wordprocessingDrawing" xmlns:w10="urn:schemas-microsoft-com:office:word" xmlns:w="http://schemas.openxmlformats.org/wordprocessingml/2006/main" xmlns:wne="http://schemas.microsoft.com/office/word/2006/wordml" xmlns:sl="http://schemas.openxmlformats.org/schemaLibrary/2006/main" xmlns:a="http://schemas.openxmlformats.org/drawingml/2006/main" xmlns:pic="http://schemas.openxmlformats.org/drawingml/2006/picture" xmlns:c="http://schemas.openxmlformats.org/drawingml/2006/chart" xmlns:lc="http://schemas.openxmlformats.org/drawingml/2006/lockedCanvas" xmlns:dgm="http://schemas.openxmlformats.org/drawingml/2006/diagram" xmlns:wps="http://schemas.microsoft.com/office/word/2010/wordprocessingShape" xmlns:wpg="http://schemas.microsoft.com/office/word/2010/wordprocessingGroup" xmlns:w14="http://schemas.microsoft.com/office/word/2010/wordml" xmlns:w15="http://schemas.microsoft.com/office/word/2012/wordml" xmlns:w16="http://schemas.microsoft.com/office/word/2018/wordml" xmlns:w16cex="http://schemas.microsoft.com/office/word/2018/wordml/cex" xmlns:w16cid="http://schemas.microsoft.com/office/word/2016/wordml/cid" xmlns="http://schemas.microsoft.com/office/tasks/2019/documenttasks" xmlns:cr="http://schemas.microsoft.com/office/comments/2020/reactions">
+  <w:abstractNum w:abstractNumId="1">
     <w:lvl w:ilvl="0">
+      <w:start w:val="0"/>
       <w:numFmt w:val="bullet"/>
-      <w:lvlText w:val=" "/>
+      <w:lvlText w:val="●"/>
       <w:lvlJc w:val="left"/>
       <w:pPr>
         <w:ind w:left="720" w:hanging="360"/>
       </w:pPr>
-    </w:lvl>
-    <w:lvl w:ilvl="1">
-      <w:numFmt w:val="bullet"/>
-      <w:lvlText w:val=" "/>
-      <w:lvlJc w:val="left"/>
-      <w:pPr>
-        <w:ind w:left="1440" w:hanging="360"/>
-      </w:pPr>
-    </w:lvl>
-    <w:lvl w:ilvl="2">
-      <w:numFmt w:val="bullet"/>
-      <w:lvlText w:val=" "/>
-      <w:lvlJc w:val="left"/>
-      <w:pPr>
-        <w:ind w:left="2160" w:hanging="360"/>
-      </w:pPr>
-    </w:lvl>
-    <w:lvl w:ilvl="3">
-      <w:numFmt w:val="bullet"/>
-      <w:lvlText w:val=" "/>
-      <w:lvlJc w:val="left"/>
-      <w:pPr>
-        <w:ind w:left="2880" w:hanging="360"/>
-      </w:pPr>
-    </w:lvl>
-    <w:lvl w:ilvl="4">
-      <w:numFmt w:val="bullet"/>
-      <w:lvlText w:val=" "/>
-      <w:lvlJc w:val="left"/>
-      <w:pPr>
-        <w:ind w:left="3600" w:hanging="360"/>
-      </w:pPr>
-    </w:lvl>
-    <w:lvl w:ilvl="5">
-      <w:numFmt w:val="bullet"/>
-      <w:lvlText w:val=" "/>
-      <w:lvlJc w:val="left"/>
-      <w:pPr>
-        <w:ind w:left="4320" w:hanging="360"/>
-      </w:pPr>
-    </w:lvl>
-    <w:lvl w:ilvl="6">
-      <w:numFmt w:val="bullet"/>
-      <w:lvlText w:val=" "/>
-      <w:lvlJc w:val="left"/>
-      <w:pPr>
-        <w:ind w:left="5040" w:hanging="360"/>
-      </w:pPr>
-    </w:lvl>
-    <w:lvl w:ilvl="7">
-      <w:numFmt w:val="bullet"/>
-      <w:lvlText w:val=" "/>
-      <w:lvlJc w:val="left"/>
-      <w:pPr>
-        <w:ind w:left="5760" w:hanging="360"/>
-      </w:pPr>
-    </w:lvl>
-    <w:lvl w:ilvl="8">
-      <w:numFmt w:val="bullet"/>
-      <w:lvlText w:val=" "/>
-      <w:lvlJc w:val="left"/>
-      <w:pPr>
-        <w:ind w:left="6480" w:hanging="360"/>
-      </w:pPr>
-    </w:lvl>
-  </w:abstractNum>
-  <w:abstractNum w:abstractNumId="991">
-    <w:nsid w:val="0000A991"/>
-    <w:multiLevelType w:val="multilevel"/>
-    <w:lvl w:ilvl="0">
-      <w:numFmt w:val="bullet"/>
-      <w:lvlText w:val=""/>
-      <w:lvlJc w:val="left"/>
-      <w:pPr>
-        <w:ind w:left="720" w:hanging="360"/>
-      </w:pPr>
       <w:rPr>
-        <w:rFonts w:ascii="Symbol" w:hAnsi="Symbol" w:cs="Symbol" w:hint="default"/>
+        <w:rFonts w:ascii="Noto Sans Symbols" w:cs="Noto Sans Symbols" w:eastAsia="Noto Sans Symbols" w:hAnsi="Noto Sans Symbols"/>
       </w:rPr>
     </w:lvl>
     <w:lvl w:ilvl="1">
+      <w:start w:val="0"/>
       <w:numFmt w:val="bullet"/>
       <w:lvlText w:val="o"/>
       <w:lvlJc w:val="left"/>
@@ -849,32 +2903,35 @@
         <w:ind w:left="1440" w:hanging="360"/>
       </w:pPr>
       <w:rPr>
-        <w:rFonts w:ascii="Courier New" w:hAnsi="Courier New" w:cs="Courier New" w:hint="default"/>
+        <w:rFonts w:ascii="Courier New" w:cs="Courier New" w:eastAsia="Courier New" w:hAnsi="Courier New"/>
       </w:rPr>
     </w:lvl>
     <w:lvl w:ilvl="2">
+      <w:start w:val="0"/>
       <w:numFmt w:val="bullet"/>
-      <w:lvlText w:val=""/>
+      <w:lvlText w:val="▪"/>
       <w:lvlJc w:val="left"/>
       <w:pPr>
         <w:ind w:left="2160" w:hanging="360"/>
       </w:pPr>
       <w:rPr>
-        <w:rFonts w:ascii="Wingdings" w:hAnsi="Wingdings" w:cs="Wingdings" w:hint="default"/>
+        <w:rFonts w:ascii="Noto Sans Symbols" w:cs="Noto Sans Symbols" w:eastAsia="Noto Sans Symbols" w:hAnsi="Noto Sans Symbols"/>
       </w:rPr>
     </w:lvl>
     <w:lvl w:ilvl="3">
+      <w:start w:val="0"/>
       <w:numFmt w:val="bullet"/>
-      <w:lvlText w:val=""/>
+      <w:lvlText w:val="●"/>
       <w:lvlJc w:val="left"/>
       <w:pPr>
         <w:ind w:left="2880" w:hanging="360"/>
       </w:pPr>
       <w:rPr>
-        <w:rFonts w:ascii="Symbol" w:hAnsi="Symbol" w:cs="Symbol" w:hint="default"/>
+        <w:rFonts w:ascii="Noto Sans Symbols" w:cs="Noto Sans Symbols" w:eastAsia="Noto Sans Symbols" w:hAnsi="Noto Sans Symbols"/>
       </w:rPr>
     </w:lvl>
     <w:lvl w:ilvl="4">
+      <w:start w:val="0"/>
       <w:numFmt w:val="bullet"/>
       <w:lvlText w:val="o"/>
       <w:lvlJc w:val="left"/>
@@ -882,32 +2939,35 @@
         <w:ind w:left="3600" w:hanging="360"/>
       </w:pPr>
       <w:rPr>
-        <w:rFonts w:ascii="Courier New" w:hAnsi="Courier New" w:cs="Courier New" w:hint="default"/>
+        <w:rFonts w:ascii="Courier New" w:cs="Courier New" w:eastAsia="Courier New" w:hAnsi="Courier New"/>
       </w:rPr>
     </w:lvl>
     <w:lvl w:ilvl="5">
+      <w:start w:val="0"/>
       <w:numFmt w:val="bullet"/>
-      <w:lvlText w:val=""/>
+      <w:lvlText w:val="▪"/>
       <w:lvlJc w:val="left"/>
       <w:pPr>
         <w:ind w:left="4320" w:hanging="360"/>
       </w:pPr>
       <w:rPr>
-        <w:rFonts w:ascii="Wingdings" w:hAnsi="Wingdings" w:cs="Wingdings" w:hint="default"/>
+        <w:rFonts w:ascii="Noto Sans Symbols" w:cs="Noto Sans Symbols" w:eastAsia="Noto Sans Symbols" w:hAnsi="Noto Sans Symbols"/>
       </w:rPr>
     </w:lvl>
     <w:lvl w:ilvl="6">
+      <w:start w:val="0"/>
       <w:numFmt w:val="bullet"/>
-      <w:lvlText w:val=""/>
+      <w:lvlText w:val="●"/>
       <w:lvlJc w:val="left"/>
       <w:pPr>
         <w:ind w:left="5040" w:hanging="360"/>
       </w:pPr>
       <w:rPr>
-        <w:rFonts w:ascii="Symbol" w:hAnsi="Symbol" w:cs="Symbol" w:hint="default"/>
+        <w:rFonts w:ascii="Noto Sans Symbols" w:cs="Noto Sans Symbols" w:eastAsia="Noto Sans Symbols" w:hAnsi="Noto Sans Symbols"/>
       </w:rPr>
     </w:lvl>
     <w:lvl w:ilvl="7">
+      <w:start w:val="0"/>
       <w:numFmt w:val="bullet"/>
       <w:lvlText w:val="o"/>
       <w:lvlJc w:val="left"/>
@@ -915,101 +2975,413 @@
         <w:ind w:left="5760" w:hanging="360"/>
       </w:pPr>
       <w:rPr>
-        <w:rFonts w:ascii="Courier New" w:hAnsi="Courier New" w:cs="Courier New" w:hint="default"/>
+        <w:rFonts w:ascii="Courier New" w:cs="Courier New" w:eastAsia="Courier New" w:hAnsi="Courier New"/>
       </w:rPr>
     </w:lvl>
     <w:lvl w:ilvl="8">
+      <w:start w:val="0"/>
       <w:numFmt w:val="bullet"/>
-      <w:lvlText w:val=""/>
+      <w:lvlText w:val="▪"/>
       <w:lvlJc w:val="left"/>
       <w:pPr>
         <w:ind w:left="6480" w:hanging="360"/>
       </w:pPr>
       <w:rPr>
-        <w:rFonts w:ascii="Wingdings" w:hAnsi="Wingdings" w:cs="Wingdings" w:hint="default"/>
+        <w:rFonts w:ascii="Noto Sans Symbols" w:cs="Noto Sans Symbols" w:eastAsia="Noto Sans Symbols" w:hAnsi="Noto Sans Symbols"/>
       </w:rPr>
     </w:lvl>
   </w:abstractNum>
-  <w:num w:numId="1000">
-    <w:abstractNumId w:val="990"/>
+  <w:abstractNum w:abstractNumId="2">
+    <w:lvl w:ilvl="0">
+      <w:start w:val="0"/>
+      <w:numFmt w:val="bullet"/>
+      <w:lvlText w:val="●"/>
+      <w:lvlJc w:val="left"/>
+      <w:pPr>
+        <w:ind w:left="720" w:hanging="360"/>
+      </w:pPr>
+      <w:rPr>
+        <w:rFonts w:ascii="Noto Sans Symbols" w:cs="Noto Sans Symbols" w:eastAsia="Noto Sans Symbols" w:hAnsi="Noto Sans Symbols"/>
+      </w:rPr>
+    </w:lvl>
+    <w:lvl w:ilvl="1">
+      <w:start w:val="0"/>
+      <w:numFmt w:val="bullet"/>
+      <w:lvlText w:val="o"/>
+      <w:lvlJc w:val="left"/>
+      <w:pPr>
+        <w:ind w:left="1440" w:hanging="360"/>
+      </w:pPr>
+      <w:rPr>
+        <w:rFonts w:ascii="Courier New" w:cs="Courier New" w:eastAsia="Courier New" w:hAnsi="Courier New"/>
+      </w:rPr>
+    </w:lvl>
+    <w:lvl w:ilvl="2">
+      <w:start w:val="0"/>
+      <w:numFmt w:val="bullet"/>
+      <w:lvlText w:val="▪"/>
+      <w:lvlJc w:val="left"/>
+      <w:pPr>
+        <w:ind w:left="2160" w:hanging="360"/>
+      </w:pPr>
+      <w:rPr>
+        <w:rFonts w:ascii="Noto Sans Symbols" w:cs="Noto Sans Symbols" w:eastAsia="Noto Sans Symbols" w:hAnsi="Noto Sans Symbols"/>
+      </w:rPr>
+    </w:lvl>
+    <w:lvl w:ilvl="3">
+      <w:start w:val="0"/>
+      <w:numFmt w:val="bullet"/>
+      <w:lvlText w:val="●"/>
+      <w:lvlJc w:val="left"/>
+      <w:pPr>
+        <w:ind w:left="2880" w:hanging="360"/>
+      </w:pPr>
+      <w:rPr>
+        <w:rFonts w:ascii="Noto Sans Symbols" w:cs="Noto Sans Symbols" w:eastAsia="Noto Sans Symbols" w:hAnsi="Noto Sans Symbols"/>
+      </w:rPr>
+    </w:lvl>
+    <w:lvl w:ilvl="4">
+      <w:start w:val="0"/>
+      <w:numFmt w:val="bullet"/>
+      <w:lvlText w:val="o"/>
+      <w:lvlJc w:val="left"/>
+      <w:pPr>
+        <w:ind w:left="3600" w:hanging="360"/>
+      </w:pPr>
+      <w:rPr>
+        <w:rFonts w:ascii="Courier New" w:cs="Courier New" w:eastAsia="Courier New" w:hAnsi="Courier New"/>
+      </w:rPr>
+    </w:lvl>
+    <w:lvl w:ilvl="5">
+      <w:start w:val="0"/>
+      <w:numFmt w:val="bullet"/>
+      <w:lvlText w:val="▪"/>
+      <w:lvlJc w:val="left"/>
+      <w:pPr>
+        <w:ind w:left="4320" w:hanging="360"/>
+      </w:pPr>
+      <w:rPr>
+        <w:rFonts w:ascii="Noto Sans Symbols" w:cs="Noto Sans Symbols" w:eastAsia="Noto Sans Symbols" w:hAnsi="Noto Sans Symbols"/>
+      </w:rPr>
+    </w:lvl>
+    <w:lvl w:ilvl="6">
+      <w:start w:val="0"/>
+      <w:numFmt w:val="bullet"/>
+      <w:lvlText w:val="●"/>
+      <w:lvlJc w:val="left"/>
+      <w:pPr>
+        <w:ind w:left="5040" w:hanging="360"/>
+      </w:pPr>
+      <w:rPr>
+        <w:rFonts w:ascii="Noto Sans Symbols" w:cs="Noto Sans Symbols" w:eastAsia="Noto Sans Symbols" w:hAnsi="Noto Sans Symbols"/>
+      </w:rPr>
+    </w:lvl>
+    <w:lvl w:ilvl="7">
+      <w:start w:val="0"/>
+      <w:numFmt w:val="bullet"/>
+      <w:lvlText w:val="o"/>
+      <w:lvlJc w:val="left"/>
+      <w:pPr>
+        <w:ind w:left="5760" w:hanging="360"/>
+      </w:pPr>
+      <w:rPr>
+        <w:rFonts w:ascii="Courier New" w:cs="Courier New" w:eastAsia="Courier New" w:hAnsi="Courier New"/>
+      </w:rPr>
+    </w:lvl>
+    <w:lvl w:ilvl="8">
+      <w:start w:val="0"/>
+      <w:numFmt w:val="bullet"/>
+      <w:lvlText w:val="▪"/>
+      <w:lvlJc w:val="left"/>
+      <w:pPr>
+        <w:ind w:left="6480" w:hanging="360"/>
+      </w:pPr>
+      <w:rPr>
+        <w:rFonts w:ascii="Noto Sans Symbols" w:cs="Noto Sans Symbols" w:eastAsia="Noto Sans Symbols" w:hAnsi="Noto Sans Symbols"/>
+      </w:rPr>
+    </w:lvl>
+  </w:abstractNum>
+  <w:abstractNum w:abstractNumId="3">
+    <w:lvl w:ilvl="0">
+      <w:start w:val="0"/>
+      <w:numFmt w:val="bullet"/>
+      <w:lvlText w:val="●"/>
+      <w:lvlJc w:val="left"/>
+      <w:pPr>
+        <w:ind w:left="720" w:hanging="360"/>
+      </w:pPr>
+      <w:rPr>
+        <w:rFonts w:ascii="Noto Sans Symbols" w:cs="Noto Sans Symbols" w:eastAsia="Noto Sans Symbols" w:hAnsi="Noto Sans Symbols"/>
+      </w:rPr>
+    </w:lvl>
+    <w:lvl w:ilvl="1">
+      <w:start w:val="0"/>
+      <w:numFmt w:val="bullet"/>
+      <w:lvlText w:val="o"/>
+      <w:lvlJc w:val="left"/>
+      <w:pPr>
+        <w:ind w:left="1440" w:hanging="360"/>
+      </w:pPr>
+      <w:rPr>
+        <w:rFonts w:ascii="Courier New" w:cs="Courier New" w:eastAsia="Courier New" w:hAnsi="Courier New"/>
+      </w:rPr>
+    </w:lvl>
+    <w:lvl w:ilvl="2">
+      <w:start w:val="0"/>
+      <w:numFmt w:val="bullet"/>
+      <w:lvlText w:val="▪"/>
+      <w:lvlJc w:val="left"/>
+      <w:pPr>
+        <w:ind w:left="2160" w:hanging="360"/>
+      </w:pPr>
+      <w:rPr>
+        <w:rFonts w:ascii="Noto Sans Symbols" w:cs="Noto Sans Symbols" w:eastAsia="Noto Sans Symbols" w:hAnsi="Noto Sans Symbols"/>
+      </w:rPr>
+    </w:lvl>
+    <w:lvl w:ilvl="3">
+      <w:start w:val="0"/>
+      <w:numFmt w:val="bullet"/>
+      <w:lvlText w:val="●"/>
+      <w:lvlJc w:val="left"/>
+      <w:pPr>
+        <w:ind w:left="2880" w:hanging="360"/>
+      </w:pPr>
+      <w:rPr>
+        <w:rFonts w:ascii="Noto Sans Symbols" w:cs="Noto Sans Symbols" w:eastAsia="Noto Sans Symbols" w:hAnsi="Noto Sans Symbols"/>
+      </w:rPr>
+    </w:lvl>
+    <w:lvl w:ilvl="4">
+      <w:start w:val="0"/>
+      <w:numFmt w:val="bullet"/>
+      <w:lvlText w:val="o"/>
+      <w:lvlJc w:val="left"/>
+      <w:pPr>
+        <w:ind w:left="3600" w:hanging="360"/>
+      </w:pPr>
+      <w:rPr>
+        <w:rFonts w:ascii="Courier New" w:cs="Courier New" w:eastAsia="Courier New" w:hAnsi="Courier New"/>
+      </w:rPr>
+    </w:lvl>
+    <w:lvl w:ilvl="5">
+      <w:start w:val="0"/>
+      <w:numFmt w:val="bullet"/>
+      <w:lvlText w:val="▪"/>
+      <w:lvlJc w:val="left"/>
+      <w:pPr>
+        <w:ind w:left="4320" w:hanging="360"/>
+      </w:pPr>
+      <w:rPr>
+        <w:rFonts w:ascii="Noto Sans Symbols" w:cs="Noto Sans Symbols" w:eastAsia="Noto Sans Symbols" w:hAnsi="Noto Sans Symbols"/>
+      </w:rPr>
+    </w:lvl>
+    <w:lvl w:ilvl="6">
+      <w:start w:val="0"/>
+      <w:numFmt w:val="bullet"/>
+      <w:lvlText w:val="●"/>
+      <w:lvlJc w:val="left"/>
+      <w:pPr>
+        <w:ind w:left="5040" w:hanging="360"/>
+      </w:pPr>
+      <w:rPr>
+        <w:rFonts w:ascii="Noto Sans Symbols" w:cs="Noto Sans Symbols" w:eastAsia="Noto Sans Symbols" w:hAnsi="Noto Sans Symbols"/>
+      </w:rPr>
+    </w:lvl>
+    <w:lvl w:ilvl="7">
+      <w:start w:val="0"/>
+      <w:numFmt w:val="bullet"/>
+      <w:lvlText w:val="o"/>
+      <w:lvlJc w:val="left"/>
+      <w:pPr>
+        <w:ind w:left="5760" w:hanging="360"/>
+      </w:pPr>
+      <w:rPr>
+        <w:rFonts w:ascii="Courier New" w:cs="Courier New" w:eastAsia="Courier New" w:hAnsi="Courier New"/>
+      </w:rPr>
+    </w:lvl>
+    <w:lvl w:ilvl="8">
+      <w:start w:val="0"/>
+      <w:numFmt w:val="bullet"/>
+      <w:lvlText w:val="▪"/>
+      <w:lvlJc w:val="left"/>
+      <w:pPr>
+        <w:ind w:left="6480" w:hanging="360"/>
+      </w:pPr>
+      <w:rPr>
+        <w:rFonts w:ascii="Noto Sans Symbols" w:cs="Noto Sans Symbols" w:eastAsia="Noto Sans Symbols" w:hAnsi="Noto Sans Symbols"/>
+      </w:rPr>
+    </w:lvl>
+  </w:abstractNum>
+  <w:num w:numId="1">
+    <w:abstractNumId w:val="1"/>
   </w:num>
-  <w:num w:numId="1001">
-    <w:abstractNumId w:val="991"/>
+  <w:num w:numId="2">
+    <w:abstractNumId w:val="2"/>
   </w:num>
-  <w:num w:numId="1002">
-    <w:abstractNumId w:val="991"/>
-  </w:num>
-  <w:num w:numId="1003">
-    <w:abstractNumId w:val="991"/>
+  <w:num w:numId="3">
+    <w:abstractNumId w:val="3"/>
   </w:num>
 </w:numbering>
 </file>
 
 <file path=word/styles.xml><?xml version="1.0" encoding="utf-8"?>
-<w:styles xmlns:r="http://schemas.openxmlformats.org/officeDocument/2006/relationships" xmlns:w="http://schemas.openxmlformats.org/wordprocessingml/2006/main">
+<w:styles xmlns:mc="http://schemas.openxmlformats.org/markup-compatibility/2006" xmlns:o="urn:schemas-microsoft-com:office:office" xmlns:r="http://schemas.openxmlformats.org/officeDocument/2006/relationships" xmlns:m="http://schemas.openxmlformats.org/officeDocument/2006/math" xmlns:v="urn:schemas-microsoft-com:vml" xmlns:wp="http://schemas.openxmlformats.org/drawingml/2006/wordprocessingDrawing" xmlns:w10="urn:schemas-microsoft-com:office:word" xmlns:w="http://schemas.openxmlformats.org/wordprocessingml/2006/main" xmlns:wne="http://schemas.microsoft.com/office/word/2006/wordml" xmlns:sl="http://schemas.openxmlformats.org/schemaLibrary/2006/main" xmlns:a="http://schemas.openxmlformats.org/drawingml/2006/main" xmlns:pic="http://schemas.openxmlformats.org/drawingml/2006/picture" xmlns:c="http://schemas.openxmlformats.org/drawingml/2006/chart" xmlns:lc="http://schemas.openxmlformats.org/drawingml/2006/lockedCanvas" xmlns:dgm="http://schemas.openxmlformats.org/drawingml/2006/diagram" xmlns:wps="http://schemas.microsoft.com/office/word/2010/wordprocessingShape" xmlns:wpg="http://schemas.microsoft.com/office/word/2010/wordprocessingGroup" xmlns:w14="http://schemas.microsoft.com/office/word/2010/wordml" xmlns:w15="http://schemas.microsoft.com/office/word/2012/wordml" xmlns:w16="http://schemas.microsoft.com/office/word/2018/wordml" xmlns:w16cex="http://schemas.microsoft.com/office/word/2018/wordml/cex" xmlns:w16cid="http://schemas.microsoft.com/office/word/2016/wordml/cid" xmlns="http://schemas.microsoft.com/office/tasks/2019/documenttasks" xmlns:cr="http://schemas.microsoft.com/office/comments/2020/reactions">
   <w:docDefaults>
     <w:rPrDefault>
       <w:rPr>
-        <w:rFonts w:asciiTheme="minorHAnsi" w:cstheme="minorBidi" w:eastAsiaTheme="minorEastAsia" w:hAnsiTheme="minorHAnsi"/>
+        <w:rFonts w:ascii="Aptos" w:cs="Aptos" w:eastAsia="Aptos" w:hAnsi="Aptos"/>
         <w:sz w:val="24"/>
         <w:szCs w:val="24"/>
-        <w:lang w:bidi="ar-SA" w:eastAsia="zh-CN" w:val="en-US"/>
+        <w:lang w:val="en"/>
       </w:rPr>
     </w:rPrDefault>
     <w:pPrDefault>
       <w:pPr>
-        <w:spacing w:after="200"/>
+        <w:spacing w:after="200" w:lineRule="auto"/>
       </w:pPr>
     </w:pPrDefault>
   </w:docDefaults>
-  <w:latentStyles w:count="276" w:defLockedState="0" w:defQFormat="0" w:defSemiHidden="0" w:defUIPriority="0" w:defUnhideWhenUsed="0"/>
-  <w:style w:default="1" w:styleId="Normal" w:type="paragraph">
-    <w:name w:val="Normal"/>
-    <w:qFormat/>
-  </w:style>
-  <w:style w:styleId="BodyText" w:type="paragraph">
+  <w:style w:type="table" w:styleId="TableNormal" w:default="1">
+    <w:name w:val="TableNormal"/>
+    <w:tblPr>
+      <w:tblCellMar>
+        <w:top w:w="100.0" w:type="dxa"/>
+        <w:left w:w="100.0" w:type="dxa"/>
+        <w:bottom w:w="100.0" w:type="dxa"/>
+        <w:right w:w="100.0" w:type="dxa"/>
+      </w:tblCellMar>
+    </w:tblPr>
+  </w:style>
+  <w:style w:type="paragraph" w:styleId="Normal" w:default="1">
+    <w:name w:val="normal"/>
+  </w:style>
+  <w:style w:type="paragraph" w:styleId="Heading1">
+    <w:name w:val="heading 1"/>
+    <w:basedOn w:val="Normal"/>
+    <w:next w:val="Normal"/>
+    <w:pPr>
+      <w:keepNext w:val="1"/>
+      <w:keepLines w:val="1"/>
+      <w:spacing w:after="80" w:before="360" w:lineRule="auto"/>
+    </w:pPr>
+    <w:rPr>
+      <w:rFonts w:ascii="Play" w:cs="Play" w:eastAsia="Play" w:hAnsi="Play"/>
+      <w:color w:val="0f4761"/>
+      <w:sz w:val="40"/>
+      <w:szCs w:val="40"/>
+    </w:rPr>
+  </w:style>
+  <w:style w:type="paragraph" w:styleId="Heading2">
+    <w:name w:val="heading 2"/>
+    <w:basedOn w:val="Normal"/>
+    <w:next w:val="Normal"/>
+    <w:pPr>
+      <w:keepNext w:val="1"/>
+      <w:keepLines w:val="1"/>
+      <w:spacing w:after="80" w:before="160" w:lineRule="auto"/>
+    </w:pPr>
+    <w:rPr>
+      <w:rFonts w:ascii="Play" w:cs="Play" w:eastAsia="Play" w:hAnsi="Play"/>
+      <w:color w:val="0f4761"/>
+      <w:sz w:val="32"/>
+      <w:szCs w:val="32"/>
+    </w:rPr>
+  </w:style>
+  <w:style w:type="paragraph" w:styleId="Heading3">
+    <w:name w:val="heading 3"/>
+    <w:basedOn w:val="Normal"/>
+    <w:next w:val="Normal"/>
+    <w:pPr>
+      <w:keepNext w:val="1"/>
+      <w:keepLines w:val="1"/>
+      <w:spacing w:after="80" w:before="160" w:lineRule="auto"/>
+    </w:pPr>
+    <w:rPr>
+      <w:color w:val="0f4761"/>
+      <w:sz w:val="28"/>
+      <w:szCs w:val="28"/>
+    </w:rPr>
+  </w:style>
+  <w:style w:type="paragraph" w:styleId="Heading4">
+    <w:name w:val="heading 4"/>
+    <w:basedOn w:val="Normal"/>
+    <w:next w:val="Normal"/>
+    <w:pPr>
+      <w:keepNext w:val="1"/>
+      <w:keepLines w:val="1"/>
+      <w:spacing w:after="40" w:before="80" w:lineRule="auto"/>
+    </w:pPr>
+    <w:rPr>
+      <w:i w:val="1"/>
+      <w:iCs w:val="1"/>
+      <w:color w:val="0f4761"/>
+    </w:rPr>
+  </w:style>
+  <w:style w:type="paragraph" w:styleId="Heading5">
+    <w:name w:val="heading 5"/>
+    <w:basedOn w:val="Normal"/>
+    <w:next w:val="Normal"/>
+    <w:pPr>
+      <w:keepNext w:val="1"/>
+      <w:keepLines w:val="1"/>
+      <w:spacing w:after="40" w:before="80" w:lineRule="auto"/>
+    </w:pPr>
+    <w:rPr>
+      <w:color w:val="0f4761"/>
+    </w:rPr>
+  </w:style>
+  <w:style w:type="paragraph" w:styleId="Heading6">
+    <w:name w:val="heading 6"/>
+    <w:basedOn w:val="Normal"/>
+    <w:next w:val="Normal"/>
+    <w:pPr>
+      <w:keepNext w:val="1"/>
+      <w:keepLines w:val="1"/>
+      <w:spacing w:after="0" w:before="40" w:lineRule="auto"/>
+    </w:pPr>
+    <w:rPr>
+      <w:i w:val="1"/>
+      <w:iCs w:val="1"/>
+      <w:color w:val="595959"/>
+    </w:rPr>
+  </w:style>
+  <w:style w:type="paragraph" w:styleId="Title">
+    <w:name w:val="Title"/>
+    <w:basedOn w:val="Normal"/>
+    <w:next w:val="Normal"/>
+    <w:pPr>
+      <w:spacing w:after="80" w:line="240" w:lineRule="auto"/>
+      <w:jc w:val="center"/>
+    </w:pPr>
+    <w:rPr>
+      <w:rFonts w:ascii="Play" w:cs="Play" w:eastAsia="Play" w:hAnsi="Play"/>
+      <w:sz w:val="56"/>
+      <w:szCs w:val="56"/>
+    </w:rPr>
+  </w:style>
+  <w:style w:type="paragraph" w:styleId="BodyText">
     <w:name w:val="Body Text"/>
     <w:basedOn w:val="Normal"/>
     <w:link w:val="BodyTextChar"/>
-    <w:qFormat/>
+    <w:qFormat w:val="1"/>
     <w:pPr>
       <w:spacing w:after="180" w:before="180"/>
     </w:pPr>
   </w:style>
-  <w:style w:customStyle="1" w:styleId="FirstParagraph" w:type="paragraph">
+  <w:style w:type="paragraph" w:styleId="FirstParagraph" w:customStyle="1">
     <w:name w:val="First Paragraph"/>
     <w:basedOn w:val="BodyText"/>
     <w:next w:val="BodyText"/>
-    <w:qFormat/>
-  </w:style>
-  <w:style w:customStyle="1" w:styleId="Compact" w:type="paragraph">
+    <w:qFormat w:val="1"/>
+  </w:style>
+  <w:style w:type="paragraph" w:styleId="Compact" w:customStyle="1">
     <w:name w:val="Compact"/>
     <w:basedOn w:val="BodyText"/>
-    <w:qFormat/>
+    <w:qFormat w:val="1"/>
     <w:pPr>
       <w:spacing w:after="36" w:before="36"/>
     </w:pPr>
   </w:style>
-  <w:style w:styleId="Title" w:type="paragraph">
-    <w:name w:val="Title"/>
-    <w:basedOn w:val="Normal"/>
-    <w:next w:val="BodyText"/>
-    <w:link w:val="TitleChar"/>
-    <w:uiPriority w:val="10"/>
-    <w:qFormat/>
-    <w:rsid w:val="00A10FD9"/>
-    <w:pPr>
-      <w:spacing w:after="80" w:line="240" w:lineRule="auto"/>
-      <w:contextualSpacing/>
-      <w:jc w:val="center"/>
-    </w:pPr>
-    <w:rPr>
-      <w:rFonts w:asciiTheme="majorHAnsi" w:cstheme="majorBidi" w:eastAsiaTheme="majorEastAsia" w:hAnsiTheme="majorHAnsi"/>
-      <w:sz w:val="56"/>
-      <w:szCs w:val="56"/>
-    </w:rPr>
-  </w:style>
-  <w:style w:customStyle="1" w:styleId="TitleChar" w:type="character">
+  <w:style w:type="character" w:styleId="TitleChar" w:customStyle="1">
     <w:name w:val="Title Char"/>
     <w:basedOn w:val="DefaultParagraphFont"/>
     <w:link w:val="Title"/>
@@ -1021,27 +3393,7 @@
       <w:szCs w:val="56"/>
     </w:rPr>
   </w:style>
-  <w:style w:styleId="Subtitle" w:type="paragraph">
-    <w:name w:val="Subtitle"/>
-    <w:basedOn w:val="Title"/>
-    <w:next w:val="BodyText"/>
-    <w:link w:val="SubtitleChar"/>
-    <w:uiPriority w:val="11"/>
-    <w:qFormat/>
-    <w:rsid w:val="00A10FD9"/>
-    <w:pPr>
-      <w:numPr>
-        <w:ilvl w:val="1"/>
-      </w:numPr>
-    </w:pPr>
-    <w:rPr>
-      <w:rFonts w:cstheme="majorBidi" w:eastAsiaTheme="majorEastAsia"/>
-      <w:spacing w:val="15"/>
-      <w:sz w:val="28"/>
-      <w:szCs w:val="28"/>
-    </w:rPr>
-  </w:style>
-  <w:style w:customStyle="1" w:styleId="SubtitleChar" w:type="character">
+  <w:style w:type="character" w:styleId="SubtitleChar" w:customStyle="1">
     <w:name w:val="Subtitle Char"/>
     <w:basedOn w:val="DefaultParagraphFont"/>
     <w:link w:val="Subtitle"/>
@@ -1049,65 +3401,65 @@
     <w:rsid w:val="00A10FD9"/>
     <w:rPr>
       <w:rFonts w:cstheme="majorBidi" w:eastAsiaTheme="majorEastAsia"/>
-      <w:color w:themeColor="text1" w:themeTint="A6" w:val="595959"/>
+      <w:color w:val="595959" w:themeColor="text1" w:themeTint="0000A6"/>
       <w:spacing w:val="15"/>
       <w:sz w:val="28"/>
       <w:szCs w:val="28"/>
     </w:rPr>
   </w:style>
-  <w:style w:customStyle="1" w:styleId="Author" w:type="paragraph">
+  <w:style w:type="paragraph" w:styleId="Author" w:customStyle="1">
     <w:name w:val="Author"/>
     <w:basedOn w:val="Title"/>
     <w:next w:val="BodyText"/>
-    <w:qFormat/>
+    <w:qFormat w:val="1"/>
     <w:pPr>
-      <w:keepNext/>
-      <w:keepLines/>
+      <w:keepNext w:val="1"/>
+      <w:keepLines w:val="1"/>
     </w:pPr>
     <w:rPr>
       <w:sz w:val="24"/>
       <w:szCs w:val="24"/>
     </w:rPr>
   </w:style>
-  <w:style w:styleId="Date" w:type="paragraph">
+  <w:style w:type="paragraph" w:styleId="Date">
     <w:name w:val="Date"/>
     <w:basedOn w:val="Title"/>
     <w:next w:val="BodyText"/>
-    <w:qFormat/>
+    <w:qFormat w:val="1"/>
     <w:pPr>
-      <w:keepNext/>
-      <w:keepLines/>
+      <w:keepNext w:val="1"/>
+      <w:keepLines w:val="1"/>
     </w:pPr>
     <w:rPr>
       <w:sz w:val="24"/>
       <w:szCs w:val="24"/>
     </w:rPr>
   </w:style>
-  <w:style w:customStyle="1" w:styleId="AbstractTitle" w:type="paragraph">
+  <w:style w:type="paragraph" w:styleId="AbstractTitle" w:customStyle="1">
     <w:name w:val="Abstract Title"/>
     <w:basedOn w:val="Normal"/>
     <w:next w:val="Abstract"/>
-    <w:qFormat/>
+    <w:qFormat w:val="1"/>
     <w:pPr>
-      <w:keepNext/>
-      <w:keepLines/>
+      <w:keepNext w:val="1"/>
+      <w:keepLines w:val="1"/>
       <w:spacing w:after="0" w:before="300"/>
       <w:jc w:val="center"/>
     </w:pPr>
     <w:rPr>
-      <w:b/>
+      <w:b w:val="1"/>
       <w:sz w:val="20"/>
       <w:szCs w:val="20"/>
     </w:rPr>
   </w:style>
-  <w:style w:customStyle="1" w:styleId="Abstract" w:type="paragraph">
+  <w:style w:type="paragraph" w:styleId="Abstract" w:customStyle="1">
     <w:name w:val="Abstract"/>
     <w:basedOn w:val="Normal"/>
     <w:next w:val="BodyText"/>
-    <w:qFormat/>
+    <w:qFormat w:val="1"/>
     <w:pPr>
-      <w:keepNext/>
-      <w:keepLines/>
+      <w:keepNext w:val="1"/>
+      <w:keepLines w:val="1"/>
       <w:spacing w:after="300" w:before="100"/>
     </w:pPr>
     <w:rPr>
@@ -1115,214 +3467,80 @@
       <w:szCs w:val="20"/>
     </w:rPr>
   </w:style>
-  <w:style w:styleId="Bibliography" w:type="paragraph">
+  <w:style w:type="paragraph" w:styleId="Bibliography">
     <w:name w:val="Bibliography"/>
     <w:basedOn w:val="Normal"/>
     <w:next w:val="Bibliography"/>
-    <w:qFormat/>
+    <w:qFormat w:val="1"/>
     <w:pPr/>
     <w:rPr/>
   </w:style>
-  <w:style w:styleId="Heading1" w:type="paragraph">
-    <w:name w:val="heading 1"/>
-    <w:basedOn w:val="Normal"/>
-    <w:next w:val="BodyText"/>
-    <w:link w:val="Heading1Char"/>
-    <w:uiPriority w:val="9"/>
-    <w:qFormat/>
-    <w:rsid w:val="00A10FD9"/>
-    <w:pPr>
-      <w:keepNext/>
-      <w:keepLines/>
-      <w:spacing w:after="80" w:before="360"/>
-      <w:outlineLvl w:val="0"/>
-    </w:pPr>
-    <w:rPr>
-      <w:rFonts w:asciiTheme="majorHAnsi" w:cstheme="majorBidi" w:eastAsiaTheme="majorEastAsia" w:hAnsiTheme="majorHAnsi"/>
-      <w:color w:themeColor="accent1" w:themeShade="BF" w:val="0F4761"/>
-      <w:sz w:val="40"/>
-      <w:szCs w:val="40"/>
-    </w:rPr>
-  </w:style>
-  <w:style w:styleId="Heading2" w:type="paragraph">
-    <w:name w:val="heading 2"/>
-    <w:basedOn w:val="Normal"/>
-    <w:next w:val="BodyText"/>
-    <w:link w:val="Heading2Char"/>
-    <w:uiPriority w:val="9"/>
-    <w:semiHidden/>
-    <w:unhideWhenUsed/>
-    <w:qFormat/>
-    <w:rsid w:val="00A10FD9"/>
-    <w:pPr>
-      <w:keepNext/>
-      <w:keepLines/>
-      <w:spacing w:after="80" w:before="160"/>
-      <w:outlineLvl w:val="1"/>
-    </w:pPr>
-    <w:rPr>
-      <w:rFonts w:asciiTheme="majorHAnsi" w:cstheme="majorBidi" w:eastAsiaTheme="majorEastAsia" w:hAnsiTheme="majorHAnsi"/>
-      <w:color w:themeColor="accent1" w:themeShade="BF" w:val="0F4761"/>
-      <w:sz w:val="32"/>
-      <w:szCs w:val="32"/>
-    </w:rPr>
-  </w:style>
-  <w:style w:styleId="Heading3" w:type="paragraph">
-    <w:name w:val="heading 3"/>
-    <w:basedOn w:val="Normal"/>
-    <w:next w:val="BodyText"/>
-    <w:link w:val="Heading3Char"/>
-    <w:uiPriority w:val="9"/>
-    <w:semiHidden/>
-    <w:unhideWhenUsed/>
-    <w:qFormat/>
-    <w:rsid w:val="00A10FD9"/>
-    <w:pPr>
-      <w:keepNext/>
-      <w:keepLines/>
-      <w:spacing w:after="80" w:before="160"/>
-      <w:outlineLvl w:val="2"/>
-    </w:pPr>
-    <w:rPr>
-      <w:rFonts w:cstheme="majorBidi" w:eastAsiaTheme="majorEastAsia"/>
-      <w:color w:themeColor="accent1" w:themeShade="BF" w:val="0F4761"/>
-      <w:sz w:val="28"/>
-      <w:szCs w:val="28"/>
-    </w:rPr>
-  </w:style>
-  <w:style w:styleId="Heading4" w:type="paragraph">
-    <w:name w:val="heading 4"/>
-    <w:basedOn w:val="Normal"/>
-    <w:next w:val="BodyText"/>
-    <w:link w:val="Heading4Char"/>
-    <w:uiPriority w:val="9"/>
-    <w:semiHidden/>
-    <w:unhideWhenUsed/>
-    <w:qFormat/>
-    <w:rsid w:val="00A10FD9"/>
-    <w:pPr>
-      <w:keepNext/>
-      <w:keepLines/>
-      <w:spacing w:after="40" w:before="80"/>
-      <w:outlineLvl w:val="3"/>
-    </w:pPr>
-    <w:rPr>
-      <w:rFonts w:cstheme="majorBidi" w:eastAsiaTheme="majorEastAsia"/>
-      <w:i/>
-      <w:iCs/>
-      <w:color w:themeColor="accent1" w:themeShade="BF" w:val="0F4761"/>
-    </w:rPr>
-  </w:style>
-  <w:style w:styleId="Heading5" w:type="paragraph">
-    <w:name w:val="heading 5"/>
-    <w:basedOn w:val="Normal"/>
-    <w:next w:val="BodyText"/>
-    <w:link w:val="Heading5Char"/>
-    <w:uiPriority w:val="9"/>
-    <w:semiHidden/>
-    <w:unhideWhenUsed/>
-    <w:qFormat/>
-    <w:rsid w:val="00A10FD9"/>
-    <w:pPr>
-      <w:keepNext/>
-      <w:keepLines/>
-      <w:spacing w:after="40" w:before="80"/>
-      <w:outlineLvl w:val="4"/>
-    </w:pPr>
-    <w:rPr>
-      <w:rFonts w:cstheme="majorBidi" w:eastAsiaTheme="majorEastAsia"/>
-      <w:color w:themeColor="accent1" w:themeShade="BF" w:val="0F4761"/>
-    </w:rPr>
-  </w:style>
-  <w:style w:styleId="Heading6" w:type="paragraph">
-    <w:name w:val="heading 6"/>
-    <w:basedOn w:val="Normal"/>
-    <w:next w:val="BodyText"/>
-    <w:link w:val="Heading6Char"/>
-    <w:uiPriority w:val="9"/>
-    <w:semiHidden/>
-    <w:unhideWhenUsed/>
-    <w:qFormat/>
-    <w:rsid w:val="00A10FD9"/>
-    <w:pPr>
-      <w:keepNext/>
-      <w:keepLines/>
-      <w:spacing w:after="0" w:before="40"/>
-      <w:outlineLvl w:val="5"/>
-    </w:pPr>
-    <w:rPr>
-      <w:rFonts w:cstheme="majorBidi" w:eastAsiaTheme="majorEastAsia"/>
-      <w:i/>
-      <w:iCs/>
-      <w:color w:themeColor="text1" w:themeTint="A6" w:val="595959"/>
-    </w:rPr>
-  </w:style>
-  <w:style w:styleId="Heading7" w:type="paragraph">
+  <w:style w:type="paragraph" w:styleId="Heading7">
     <w:name w:val="heading 7"/>
     <w:basedOn w:val="Normal"/>
     <w:next w:val="BodyText"/>
     <w:link w:val="Heading7Char"/>
     <w:uiPriority w:val="9"/>
-    <w:semiHidden/>
-    <w:unhideWhenUsed/>
-    <w:qFormat/>
+    <w:semiHidden w:val="1"/>
+    <w:unhideWhenUsed w:val="1"/>
+    <w:qFormat w:val="1"/>
     <w:rsid w:val="00A10FD9"/>
     <w:pPr>
-      <w:keepNext/>
-      <w:keepLines/>
+      <w:keepNext w:val="1"/>
+      <w:keepLines w:val="1"/>
       <w:spacing w:after="0" w:before="40"/>
       <w:outlineLvl w:val="6"/>
     </w:pPr>
     <w:rPr>
       <w:rFonts w:cstheme="majorBidi" w:eastAsiaTheme="majorEastAsia"/>
-      <w:color w:themeColor="text1" w:themeTint="A6" w:val="595959"/>
-    </w:rPr>
-  </w:style>
-  <w:style w:styleId="Heading8" w:type="paragraph">
+      <w:color w:val="595959" w:themeColor="text1" w:themeTint="0000A6"/>
+    </w:rPr>
+  </w:style>
+  <w:style w:type="paragraph" w:styleId="Heading8">
     <w:name w:val="heading 8"/>
     <w:basedOn w:val="Normal"/>
     <w:next w:val="BodyText"/>
     <w:link w:val="Heading8Char"/>
     <w:uiPriority w:val="9"/>
-    <w:semiHidden/>
-    <w:unhideWhenUsed/>
-    <w:qFormat/>
+    <w:semiHidden w:val="1"/>
+    <w:unhideWhenUsed w:val="1"/>
+    <w:qFormat w:val="1"/>
     <w:rsid w:val="00A10FD9"/>
     <w:pPr>
-      <w:keepNext/>
-      <w:keepLines/>
+      <w:keepNext w:val="1"/>
+      <w:keepLines w:val="1"/>
       <w:spacing w:after="0"/>
       <w:outlineLvl w:val="7"/>
     </w:pPr>
     <w:rPr>
       <w:rFonts w:cstheme="majorBidi" w:eastAsiaTheme="majorEastAsia"/>
-      <w:i/>
-      <w:iCs/>
-      <w:color w:themeColor="text1" w:themeTint="D8" w:val="272727"/>
-    </w:rPr>
-  </w:style>
-  <w:style w:styleId="Heading9" w:type="paragraph">
+      <w:i w:val="1"/>
+      <w:iCs w:val="1"/>
+      <w:color w:val="272727" w:themeColor="text1" w:themeTint="0000D8"/>
+    </w:rPr>
+  </w:style>
+  <w:style w:type="paragraph" w:styleId="Heading9">
     <w:name w:val="heading 9"/>
     <w:basedOn w:val="Normal"/>
     <w:next w:val="BodyText"/>
     <w:link w:val="Heading9Char"/>
     <w:uiPriority w:val="9"/>
-    <w:semiHidden/>
-    <w:unhideWhenUsed/>
-    <w:qFormat/>
+    <w:semiHidden w:val="1"/>
+    <w:unhideWhenUsed w:val="1"/>
+    <w:qFormat w:val="1"/>
     <w:rsid w:val="00A10FD9"/>
     <w:pPr>
-      <w:keepNext/>
-      <w:keepLines/>
+      <w:keepNext w:val="1"/>
+      <w:keepLines w:val="1"/>
       <w:spacing w:after="0"/>
       <w:outlineLvl w:val="8"/>
     </w:pPr>
     <w:rPr>
       <w:rFonts w:cstheme="majorBidi" w:eastAsiaTheme="majorEastAsia"/>
-      <w:color w:themeColor="text1" w:themeTint="D8" w:val="272727"/>
-    </w:rPr>
-  </w:style>
-  <w:style w:customStyle="1" w:styleId="Heading1Char" w:type="character">
+      <w:color w:val="272727" w:themeColor="text1" w:themeTint="0000D8"/>
+    </w:rPr>
+  </w:style>
+  <w:style w:type="character" w:styleId="Heading1Char" w:customStyle="1">
     <w:name w:val="Heading 1 Char"/>
     <w:basedOn w:val="DefaultParagraphFont"/>
     <w:link w:val="Heading1"/>
@@ -1330,196 +3548,196 @@
     <w:rsid w:val="00A10FD9"/>
     <w:rPr>
       <w:rFonts w:asciiTheme="majorHAnsi" w:cstheme="majorBidi" w:eastAsiaTheme="majorEastAsia" w:hAnsiTheme="majorHAnsi"/>
-      <w:color w:themeColor="accent1" w:themeShade="BF" w:val="0F4761"/>
+      <w:color w:val="0f4761" w:themeColor="accent1" w:themeShade="0000BF"/>
       <w:sz w:val="40"/>
       <w:szCs w:val="40"/>
     </w:rPr>
   </w:style>
-  <w:style w:customStyle="1" w:styleId="Heading2Char" w:type="character">
+  <w:style w:type="character" w:styleId="Heading2Char" w:customStyle="1">
     <w:name w:val="Heading 2 Char"/>
     <w:basedOn w:val="DefaultParagraphFont"/>
     <w:link w:val="Heading2"/>
     <w:uiPriority w:val="9"/>
-    <w:semiHidden/>
+    <w:semiHidden w:val="1"/>
     <w:rsid w:val="00A10FD9"/>
     <w:rPr>
       <w:rFonts w:asciiTheme="majorHAnsi" w:cstheme="majorBidi" w:eastAsiaTheme="majorEastAsia" w:hAnsiTheme="majorHAnsi"/>
-      <w:color w:themeColor="accent1" w:themeShade="BF" w:val="0F4761"/>
+      <w:color w:val="0f4761" w:themeColor="accent1" w:themeShade="0000BF"/>
       <w:sz w:val="32"/>
       <w:szCs w:val="32"/>
     </w:rPr>
   </w:style>
-  <w:style w:customStyle="1" w:styleId="Heading3Char" w:type="character">
+  <w:style w:type="character" w:styleId="Heading3Char" w:customStyle="1">
     <w:name w:val="Heading 3 Char"/>
     <w:basedOn w:val="DefaultParagraphFont"/>
     <w:link w:val="Heading3"/>
     <w:uiPriority w:val="9"/>
-    <w:semiHidden/>
+    <w:semiHidden w:val="1"/>
     <w:rsid w:val="00A10FD9"/>
     <w:rPr>
       <w:rFonts w:cstheme="majorBidi" w:eastAsiaTheme="majorEastAsia"/>
-      <w:color w:themeColor="accent1" w:themeShade="BF" w:val="0F4761"/>
+      <w:color w:val="0f4761" w:themeColor="accent1" w:themeShade="0000BF"/>
       <w:sz w:val="28"/>
       <w:szCs w:val="28"/>
     </w:rPr>
   </w:style>
-  <w:style w:customStyle="1" w:styleId="Heading4Char" w:type="character">
+  <w:style w:type="character" w:styleId="Heading4Char" w:customStyle="1">
     <w:name w:val="Heading 4 Char"/>
     <w:basedOn w:val="DefaultParagraphFont"/>
     <w:link w:val="Heading4"/>
     <w:uiPriority w:val="9"/>
-    <w:semiHidden/>
+    <w:semiHidden w:val="1"/>
     <w:rsid w:val="00A10FD9"/>
     <w:rPr>
       <w:rFonts w:cstheme="majorBidi" w:eastAsiaTheme="majorEastAsia"/>
-      <w:i/>
-      <w:iCs/>
-      <w:color w:themeColor="accent1" w:themeShade="BF" w:val="0F4761"/>
-    </w:rPr>
-  </w:style>
-  <w:style w:customStyle="1" w:styleId="Heading5Char" w:type="character">
+      <w:i w:val="1"/>
+      <w:iCs w:val="1"/>
+      <w:color w:val="0f4761" w:themeColor="accent1" w:themeShade="0000BF"/>
+    </w:rPr>
+  </w:style>
+  <w:style w:type="character" w:styleId="Heading5Char" w:customStyle="1">
     <w:name w:val="Heading 5 Char"/>
     <w:basedOn w:val="DefaultParagraphFont"/>
     <w:link w:val="Heading5"/>
     <w:uiPriority w:val="9"/>
-    <w:semiHidden/>
+    <w:semiHidden w:val="1"/>
     <w:rsid w:val="00A10FD9"/>
     <w:rPr>
       <w:rFonts w:cstheme="majorBidi" w:eastAsiaTheme="majorEastAsia"/>
-      <w:color w:themeColor="accent1" w:themeShade="BF" w:val="0F4761"/>
-    </w:rPr>
-  </w:style>
-  <w:style w:customStyle="1" w:styleId="Heading6Char" w:type="character">
+      <w:color w:val="0f4761" w:themeColor="accent1" w:themeShade="0000BF"/>
+    </w:rPr>
+  </w:style>
+  <w:style w:type="character" w:styleId="Heading6Char" w:customStyle="1">
     <w:name w:val="Heading 6 Char"/>
     <w:basedOn w:val="DefaultParagraphFont"/>
     <w:link w:val="Heading6"/>
     <w:uiPriority w:val="9"/>
-    <w:semiHidden/>
+    <w:semiHidden w:val="1"/>
     <w:rsid w:val="00A10FD9"/>
     <w:rPr>
       <w:rFonts w:cstheme="majorBidi" w:eastAsiaTheme="majorEastAsia"/>
-      <w:i/>
-      <w:iCs/>
-      <w:color w:themeColor="text1" w:themeTint="A6" w:val="595959"/>
-    </w:rPr>
-  </w:style>
-  <w:style w:customStyle="1" w:styleId="Heading7Char" w:type="character">
+      <w:i w:val="1"/>
+      <w:iCs w:val="1"/>
+      <w:color w:val="595959" w:themeColor="text1" w:themeTint="0000A6"/>
+    </w:rPr>
+  </w:style>
+  <w:style w:type="character" w:styleId="Heading7Char" w:customStyle="1">
     <w:name w:val="Heading 7 Char"/>
     <w:basedOn w:val="DefaultParagraphFont"/>
     <w:link w:val="Heading7"/>
     <w:uiPriority w:val="9"/>
-    <w:semiHidden/>
+    <w:semiHidden w:val="1"/>
     <w:rsid w:val="00A10FD9"/>
     <w:rPr>
       <w:rFonts w:cstheme="majorBidi" w:eastAsiaTheme="majorEastAsia"/>
-      <w:color w:themeColor="text1" w:themeTint="A6" w:val="595959"/>
-    </w:rPr>
-  </w:style>
-  <w:style w:customStyle="1" w:styleId="Heading8Char" w:type="character">
+      <w:color w:val="595959" w:themeColor="text1" w:themeTint="0000A6"/>
+    </w:rPr>
+  </w:style>
+  <w:style w:type="character" w:styleId="Heading8Char" w:customStyle="1">
     <w:name w:val="Heading 8 Char"/>
     <w:basedOn w:val="DefaultParagraphFont"/>
     <w:link w:val="Heading8"/>
     <w:uiPriority w:val="9"/>
-    <w:semiHidden/>
+    <w:semiHidden w:val="1"/>
     <w:rsid w:val="00A10FD9"/>
     <w:rPr>
       <w:rFonts w:cstheme="majorBidi" w:eastAsiaTheme="majorEastAsia"/>
-      <w:i/>
-      <w:iCs/>
-      <w:color w:themeColor="text1" w:themeTint="D8" w:val="272727"/>
-    </w:rPr>
-  </w:style>
-  <w:style w:customStyle="1" w:styleId="Heading9Char" w:type="character">
+      <w:i w:val="1"/>
+      <w:iCs w:val="1"/>
+      <w:color w:val="272727" w:themeColor="text1" w:themeTint="0000D8"/>
+    </w:rPr>
+  </w:style>
+  <w:style w:type="character" w:styleId="Heading9Char" w:customStyle="1">
     <w:name w:val="Heading 9 Char"/>
     <w:basedOn w:val="DefaultParagraphFont"/>
     <w:link w:val="Heading9"/>
     <w:uiPriority w:val="9"/>
-    <w:semiHidden/>
+    <w:semiHidden w:val="1"/>
     <w:rsid w:val="00A10FD9"/>
     <w:rPr>
       <w:rFonts w:cstheme="majorBidi" w:eastAsiaTheme="majorEastAsia"/>
-      <w:color w:themeColor="text1" w:themeTint="D8" w:val="272727"/>
-    </w:rPr>
-  </w:style>
-  <w:style w:styleId="BlockText" w:type="paragraph">
+      <w:color w:val="272727" w:themeColor="text1" w:themeTint="0000D8"/>
+    </w:rPr>
+  </w:style>
+  <w:style w:type="paragraph" w:styleId="BlockText">
     <w:name w:val="Block Text"/>
     <w:basedOn w:val="BodyText"/>
     <w:next w:val="BodyText"/>
     <w:uiPriority w:val="9"/>
-    <w:unhideWhenUsed/>
-    <w:qFormat/>
+    <w:unhideWhenUsed w:val="1"/>
+    <w:qFormat w:val="1"/>
     <w:pPr>
       <w:spacing w:after="100" w:before="100"/>
-      <w:ind w:firstLine="0" w:left="480" w:right="480"/>
+      <w:ind w:left="480" w:right="480" w:firstLine="0"/>
     </w:pPr>
   </w:style>
-  <w:style w:styleId="FootnoteText" w:type="paragraph">
+  <w:style w:type="paragraph" w:styleId="FootnoteText">
     <w:name w:val="Footnote Text"/>
     <w:basedOn w:val="Normal"/>
     <w:next w:val="FootnoteText"/>
     <w:uiPriority w:val="9"/>
-    <w:unhideWhenUsed/>
-    <w:qFormat/>
-  </w:style>
-  <w:style w:styleId="FootnoteBlockText" w:type="paragraph">
+    <w:unhideWhenUsed w:val="1"/>
+    <w:qFormat w:val="1"/>
+  </w:style>
+  <w:style w:type="paragraph" w:styleId="FootnoteBlockText">
     <w:name w:val="Footnote Block Text"/>
     <w:basedOn w:val="FootnoteText"/>
     <w:next w:val="FootnoteText"/>
     <w:uiPriority w:val="9"/>
-    <w:unhideWhenUsed/>
-    <w:qFormat/>
+    <w:unhideWhenUsed w:val="1"/>
+    <w:qFormat w:val="1"/>
     <w:pPr>
       <w:spacing w:after="100" w:before="100"/>
-      <w:ind w:firstLine="0" w:left="480" w:right="480"/>
+      <w:ind w:left="480" w:right="480" w:firstLine="0"/>
     </w:pPr>
   </w:style>
-  <w:style w:default="1" w:styleId="DefaultParagraphFont" w:type="character">
+  <w:style w:type="character" w:styleId="DefaultParagraphFont" w:default="1">
     <w:name w:val="Default Paragraph Font"/>
-    <w:semiHidden/>
-    <w:unhideWhenUsed/>
-  </w:style>
-  <w:style w:default="1" w:styleId="Table" w:type="table">
+    <w:semiHidden w:val="1"/>
+    <w:unhideWhenUsed w:val="1"/>
+  </w:style>
+  <w:style w:type="table" w:styleId="Table" w:default="1">
     <w:name w:val="Table"/>
     <w:basedOn w:val="TableNormal"/>
-    <w:semiHidden/>
-    <w:unhideWhenUsed/>
-    <w:qFormat/>
+    <w:semiHidden w:val="1"/>
+    <w:unhideWhenUsed w:val="1"/>
+    <w:qFormat w:val="1"/>
     <w:tblPr>
-      <w:tblInd w:type="dxa" w:w="0"/>
+      <w:tblInd w:w="0.0" w:type="dxa"/>
       <w:tblCellMar>
-        <w:top w:type="dxa" w:w="0"/>
-        <w:left w:type="dxa" w:w="108"/>
-        <w:bottom w:type="dxa" w:w="0"/>
-        <w:right w:type="dxa" w:w="108"/>
+        <w:top w:w="0.0" w:type="dxa"/>
+        <w:left w:w="108.0" w:type="dxa"/>
+        <w:bottom w:w="0.0" w:type="dxa"/>
+        <w:right w:w="108.0" w:type="dxa"/>
       </w:tblCellMar>
     </w:tblPr>
     <w:tblStylePr w:type="firstRow">
       <w:tcPr>
         <w:tcBorders>
-          <w:bottom w:val="single"/>
+          <w:bottom w:space="0" w:sz="0" w:val="single"/>
         </w:tcBorders>
         <w:vAlign w:val="bottom"/>
       </w:tcPr>
     </w:tblStylePr>
   </w:style>
-  <w:style w:customStyle="1" w:styleId="DefinitionTerm" w:type="paragraph">
+  <w:style w:type="paragraph" w:styleId="DefinitionTerm" w:customStyle="1">
     <w:name w:val="Definition Term"/>
     <w:basedOn w:val="Normal"/>
     <w:next w:val="Definition"/>
     <w:pPr>
-      <w:keepNext/>
-      <w:keepLines/>
+      <w:keepNext w:val="1"/>
+      <w:keepLines w:val="1"/>
       <w:spacing w:after="0"/>
     </w:pPr>
     <w:rPr>
-      <w:b/>
-    </w:rPr>
-  </w:style>
-  <w:style w:customStyle="1" w:styleId="Definition" w:type="paragraph">
+      <w:b w:val="1"/>
+    </w:rPr>
+  </w:style>
+  <w:style w:type="paragraph" w:styleId="Definition" w:customStyle="1">
     <w:name w:val="Definition"/>
     <w:basedOn w:val="Normal"/>
   </w:style>
-  <w:style w:styleId="Caption" w:type="paragraph">
+  <w:style w:type="paragraph" w:styleId="Caption">
     <w:name w:val="Caption"/>
     <w:basedOn w:val="Normal"/>
     <w:link w:val="BodyTextChar"/>
@@ -1527,37 +3745,37 @@
       <w:spacing w:after="120" w:before="0"/>
     </w:pPr>
     <w:rPr>
-      <w:i/>
-    </w:rPr>
-  </w:style>
-  <w:style w:customStyle="1" w:styleId="TableCaption" w:type="paragraph">
+      <w:i w:val="1"/>
+    </w:rPr>
+  </w:style>
+  <w:style w:type="paragraph" w:styleId="TableCaption" w:customStyle="1">
     <w:name w:val="Table Caption"/>
     <w:basedOn w:val="Caption"/>
     <w:pPr>
-      <w:keepNext/>
+      <w:keepNext w:val="1"/>
     </w:pPr>
   </w:style>
-  <w:style w:customStyle="1" w:styleId="ImageCaption" w:type="paragraph">
+  <w:style w:type="paragraph" w:styleId="ImageCaption" w:customStyle="1">
     <w:name w:val="Image Caption"/>
     <w:basedOn w:val="Caption"/>
   </w:style>
-  <w:style w:customStyle="1" w:styleId="Figure" w:type="paragraph">
+  <w:style w:type="paragraph" w:styleId="Figure" w:customStyle="1">
     <w:name w:val="Figure"/>
     <w:basedOn w:val="Normal"/>
   </w:style>
-  <w:style w:customStyle="1" w:styleId="CaptionedFigure" w:type="paragraph">
+  <w:style w:type="paragraph" w:styleId="CaptionedFigure" w:customStyle="1">
     <w:name w:val="Captioned Figure"/>
     <w:basedOn w:val="Figure"/>
     <w:pPr>
-      <w:keepNext/>
+      <w:keepNext w:val="1"/>
     </w:pPr>
   </w:style>
-  <w:style w:customStyle="1" w:styleId="BodyTextChar" w:type="character">
+  <w:style w:type="character" w:styleId="BodyTextChar" w:customStyle="1">
     <w:name w:val="Body Text Char"/>
     <w:basedOn w:val="DefaultParagraphFont"/>
     <w:link w:val="BodyText"/>
   </w:style>
-  <w:style w:customStyle="1" w:styleId="VerbatimChar" w:type="character">
+  <w:style w:type="character" w:styleId="VerbatimChar" w:customStyle="1">
     <w:name w:val="Verbatim Char"/>
     <w:basedOn w:val="BodyTextChar"/>
     <w:rPr>
@@ -1565,31 +3783,31 @@
       <w:sz w:val="22"/>
     </w:rPr>
   </w:style>
-  <w:style w:customStyle="1" w:styleId="SectionNumber" w:type="character">
+  <w:style w:type="character" w:styleId="SectionNumber" w:customStyle="1">
     <w:name w:val="Section Number"/>
     <w:basedOn w:val="BodyTextChar"/>
   </w:style>
-  <w:style w:styleId="FootnoteReference" w:type="character">
+  <w:style w:type="character" w:styleId="FootnoteReference">
     <w:name w:val="Footnote Reference"/>
     <w:basedOn w:val="BodyTextChar"/>
     <w:rPr>
       <w:vertAlign w:val="superscript"/>
     </w:rPr>
   </w:style>
-  <w:style w:styleId="Hyperlink" w:type="character">
+  <w:style w:type="character" w:styleId="Hyperlink">
     <w:name w:val="Hyperlink"/>
     <w:basedOn w:val="BodyTextChar"/>
     <w:rPr>
-      <w:color w:themeColor="accent1" w:val="4F81BD"/>
-    </w:rPr>
-  </w:style>
-  <w:style w:styleId="TOCHeading" w:type="paragraph">
+      <w:color w:val="4f81bd" w:themeColor="accent1"/>
+    </w:rPr>
+  </w:style>
+  <w:style w:type="paragraph" w:styleId="TOCHeading">
     <w:name w:val="TOC Heading"/>
     <w:basedOn w:val="Heading1"/>
     <w:next w:val="BodyText"/>
     <w:uiPriority w:val="39"/>
-    <w:unhideWhenUsed/>
-    <w:qFormat/>
+    <w:unhideWhenUsed w:val="1"/>
+    <w:qFormat w:val="1"/>
     <w:pPr>
       <w:spacing w:before="240" w:line="259" w:lineRule="auto"/>
       <w:outlineLvl w:val="9"/>
@@ -1598,242 +3816,298 @@
       <w:rFonts w:asciiTheme="majorHAnsi" w:cstheme="majorBidi" w:eastAsiaTheme="majorEastAsia" w:hAnsiTheme="majorHAnsi"/>
       <w:b w:val="0"/>
       <w:bCs w:val="0"/>
-      <w:color w:themeColor="accent1" w:themeShade="BF" w:val="365F91"/>
-    </w:rPr>
-  </w:style>
-  <w:style w:type="paragraph" w:customStyle="1" w:styleId="SourceCode">
+      <w:color w:val="365f91" w:themeColor="accent1" w:themeShade="0000BF"/>
+    </w:rPr>
+  </w:style>
+  <w:style w:type="paragraph" w:styleId="SourceCode" w:customStyle="1">
     <w:name w:val="Source Code"/>
     <w:basedOn w:val="Normal"/>
     <w:link w:val="VerbatimChar"/>
     <w:pPr>
-      <w:wordWrap w:val="off"/>
+      <w:wordWrap w:val="0"/>
     </w:pPr>
   </w:style>
-  <w:style w:type="character" w:customStyle="1" w:styleId="KeywordTok">
+  <w:style w:type="character" w:styleId="KeywordTok" w:customStyle="1">
     <w:name w:val="KeywordTok"/>
     <w:basedOn w:val="VerbatimChar"/>
     <w:rPr>
-      <w:b/>
+      <w:b w:val="1"/>
       <w:color w:val="007020"/>
     </w:rPr>
   </w:style>
-  <w:style w:type="character" w:customStyle="1" w:styleId="DataTypeTok">
+  <w:style w:type="character" w:styleId="DataTypeTok" w:customStyle="1">
     <w:name w:val="DataTypeTok"/>
     <w:basedOn w:val="VerbatimChar"/>
     <w:rPr>
       <w:color w:val="902000"/>
     </w:rPr>
   </w:style>
-  <w:style w:type="character" w:customStyle="1" w:styleId="DecValTok">
+  <w:style w:type="character" w:styleId="DecValTok" w:customStyle="1">
     <w:name w:val="DecValTok"/>
     <w:basedOn w:val="VerbatimChar"/>
     <w:rPr>
       <w:color w:val="40a070"/>
     </w:rPr>
   </w:style>
-  <w:style w:type="character" w:customStyle="1" w:styleId="BaseNTok">
+  <w:style w:type="character" w:styleId="BaseNTok" w:customStyle="1">
     <w:name w:val="BaseNTok"/>
     <w:basedOn w:val="VerbatimChar"/>
     <w:rPr>
       <w:color w:val="40a070"/>
     </w:rPr>
   </w:style>
-  <w:style w:type="character" w:customStyle="1" w:styleId="FloatTok">
+  <w:style w:type="character" w:styleId="FloatTok" w:customStyle="1">
     <w:name w:val="FloatTok"/>
     <w:basedOn w:val="VerbatimChar"/>
     <w:rPr>
       <w:color w:val="40a070"/>
     </w:rPr>
   </w:style>
-  <w:style w:type="character" w:customStyle="1" w:styleId="ConstantTok">
+  <w:style w:type="character" w:styleId="ConstantTok" w:customStyle="1">
     <w:name w:val="ConstantTok"/>
     <w:basedOn w:val="VerbatimChar"/>
     <w:rPr>
       <w:color w:val="880000"/>
     </w:rPr>
   </w:style>
-  <w:style w:type="character" w:customStyle="1" w:styleId="CharTok">
+  <w:style w:type="character" w:styleId="CharTok" w:customStyle="1">
     <w:name w:val="CharTok"/>
     <w:basedOn w:val="VerbatimChar"/>
     <w:rPr>
       <w:color w:val="4070a0"/>
     </w:rPr>
   </w:style>
-  <w:style w:type="character" w:customStyle="1" w:styleId="SpecialCharTok">
+  <w:style w:type="character" w:styleId="SpecialCharTok" w:customStyle="1">
     <w:name w:val="SpecialCharTok"/>
     <w:basedOn w:val="VerbatimChar"/>
     <w:rPr>
       <w:color w:val="4070a0"/>
     </w:rPr>
   </w:style>
-  <w:style w:type="character" w:customStyle="1" w:styleId="StringTok">
+  <w:style w:type="character" w:styleId="StringTok" w:customStyle="1">
     <w:name w:val="StringTok"/>
     <w:basedOn w:val="VerbatimChar"/>
     <w:rPr>
       <w:color w:val="4070a0"/>
     </w:rPr>
   </w:style>
-  <w:style w:type="character" w:customStyle="1" w:styleId="VerbatimStringTok">
+  <w:style w:type="character" w:styleId="VerbatimStringTok" w:customStyle="1">
     <w:name w:val="VerbatimStringTok"/>
     <w:basedOn w:val="VerbatimChar"/>
     <w:rPr>
       <w:color w:val="4070a0"/>
     </w:rPr>
   </w:style>
-  <w:style w:type="character" w:customStyle="1" w:styleId="SpecialStringTok">
+  <w:style w:type="character" w:styleId="SpecialStringTok" w:customStyle="1">
     <w:name w:val="SpecialStringTok"/>
     <w:basedOn w:val="VerbatimChar"/>
     <w:rPr>
       <w:color w:val="bb6688"/>
     </w:rPr>
   </w:style>
-  <w:style w:type="character" w:customStyle="1" w:styleId="ImportTok">
+  <w:style w:type="character" w:styleId="ImportTok" w:customStyle="1">
     <w:name w:val="ImportTok"/>
     <w:basedOn w:val="VerbatimChar"/>
     <w:rPr>
-      <w:b/>
+      <w:b w:val="1"/>
       <w:color w:val="008000"/>
     </w:rPr>
   </w:style>
-  <w:style w:type="character" w:customStyle="1" w:styleId="CommentTok">
+  <w:style w:type="character" w:styleId="CommentTok" w:customStyle="1">
     <w:name w:val="CommentTok"/>
     <w:basedOn w:val="VerbatimChar"/>
     <w:rPr>
-      <w:i/>
+      <w:i w:val="1"/>
       <w:color w:val="60a0b0"/>
     </w:rPr>
   </w:style>
-  <w:style w:type="character" w:customStyle="1" w:styleId="DocumentationTok">
+  <w:style w:type="character" w:styleId="DocumentationTok" w:customStyle="1">
     <w:name w:val="DocumentationTok"/>
     <w:basedOn w:val="VerbatimChar"/>
     <w:rPr>
-      <w:i/>
+      <w:i w:val="1"/>
       <w:color w:val="ba2121"/>
     </w:rPr>
   </w:style>
-  <w:style w:type="character" w:customStyle="1" w:styleId="AnnotationTok">
+  <w:style w:type="character" w:styleId="AnnotationTok" w:customStyle="1">
     <w:name w:val="AnnotationTok"/>
     <w:basedOn w:val="VerbatimChar"/>
     <w:rPr>
-      <w:b/>
-      <w:i/>
+      <w:b w:val="1"/>
+      <w:i w:val="1"/>
       <w:color w:val="60a0b0"/>
     </w:rPr>
   </w:style>
-  <w:style w:type="character" w:customStyle="1" w:styleId="CommentVarTok">
+  <w:style w:type="character" w:styleId="CommentVarTok" w:customStyle="1">
     <w:name w:val="CommentVarTok"/>
     <w:basedOn w:val="VerbatimChar"/>
     <w:rPr>
-      <w:b/>
-      <w:i/>
+      <w:b w:val="1"/>
+      <w:i w:val="1"/>
       <w:color w:val="60a0b0"/>
     </w:rPr>
   </w:style>
-  <w:style w:type="character" w:customStyle="1" w:styleId="OtherTok">
+  <w:style w:type="character" w:styleId="OtherTok" w:customStyle="1">
     <w:name w:val="OtherTok"/>
     <w:basedOn w:val="VerbatimChar"/>
     <w:rPr>
       <w:color w:val="007020"/>
     </w:rPr>
   </w:style>
-  <w:style w:type="character" w:customStyle="1" w:styleId="FunctionTok">
+  <w:style w:type="character" w:styleId="FunctionTok" w:customStyle="1">
     <w:name w:val="FunctionTok"/>
     <w:basedOn w:val="VerbatimChar"/>
     <w:rPr>
       <w:color w:val="06287e"/>
     </w:rPr>
   </w:style>
-  <w:style w:type="character" w:customStyle="1" w:styleId="VariableTok">
+  <w:style w:type="character" w:styleId="VariableTok" w:customStyle="1">
     <w:name w:val="VariableTok"/>
     <w:basedOn w:val="VerbatimChar"/>
     <w:rPr>
       <w:color w:val="19177c"/>
     </w:rPr>
   </w:style>
-  <w:style w:type="character" w:customStyle="1" w:styleId="ControlFlowTok">
+  <w:style w:type="character" w:styleId="ControlFlowTok" w:customStyle="1">
     <w:name w:val="ControlFlowTok"/>
     <w:basedOn w:val="VerbatimChar"/>
     <w:rPr>
-      <w:b/>
+      <w:b w:val="1"/>
       <w:color w:val="007020"/>
     </w:rPr>
   </w:style>
-  <w:style w:type="character" w:customStyle="1" w:styleId="OperatorTok">
+  <w:style w:type="character" w:styleId="OperatorTok" w:customStyle="1">
     <w:name w:val="OperatorTok"/>
     <w:basedOn w:val="VerbatimChar"/>
     <w:rPr>
       <w:color w:val="666666"/>
     </w:rPr>
   </w:style>
-  <w:style w:type="character" w:customStyle="1" w:styleId="BuiltInTok">
+  <w:style w:type="character" w:styleId="BuiltInTok" w:customStyle="1">
     <w:name w:val="BuiltInTok"/>
     <w:basedOn w:val="VerbatimChar"/>
     <w:rPr>
       <w:color w:val="008000"/>
     </w:rPr>
   </w:style>
-  <w:style w:type="character" w:customStyle="1" w:styleId="ExtensionTok">
+  <w:style w:type="character" w:styleId="ExtensionTok" w:customStyle="1">
     <w:name w:val="ExtensionTok"/>
     <w:basedOn w:val="VerbatimChar"/>
     <w:rPr/>
   </w:style>
-  <w:style w:type="character" w:customStyle="1" w:styleId="PreprocessorTok">
+  <w:style w:type="character" w:styleId="PreprocessorTok" w:customStyle="1">
     <w:name w:val="PreprocessorTok"/>
     <w:basedOn w:val="VerbatimChar"/>
     <w:rPr>
       <w:color w:val="bc7a00"/>
     </w:rPr>
   </w:style>
-  <w:style w:type="character" w:customStyle="1" w:styleId="AttributeTok">
+  <w:style w:type="character" w:styleId="AttributeTok" w:customStyle="1">
     <w:name w:val="AttributeTok"/>
     <w:basedOn w:val="VerbatimChar"/>
     <w:rPr>
       <w:color w:val="7d9029"/>
     </w:rPr>
   </w:style>
-  <w:style w:type="character" w:customStyle="1" w:styleId="RegionMarkerTok">
+  <w:style w:type="character" w:styleId="RegionMarkerTok" w:customStyle="1">
     <w:name w:val="RegionMarkerTok"/>
     <w:basedOn w:val="VerbatimChar"/>
     <w:rPr/>
   </w:style>
-  <w:style w:type="character" w:customStyle="1" w:styleId="InformationTok">
+  <w:style w:type="character" w:styleId="InformationTok" w:customStyle="1">
     <w:name w:val="InformationTok"/>
     <w:basedOn w:val="VerbatimChar"/>
     <w:rPr>
-      <w:b/>
-      <w:i/>
+      <w:b w:val="1"/>
+      <w:i w:val="1"/>
       <w:color w:val="60a0b0"/>
     </w:rPr>
   </w:style>
-  <w:style w:type="character" w:customStyle="1" w:styleId="WarningTok">
+  <w:style w:type="character" w:styleId="WarningTok" w:customStyle="1">
     <w:name w:val="WarningTok"/>
     <w:basedOn w:val="VerbatimChar"/>
     <w:rPr>
-      <w:b/>
-      <w:i/>
+      <w:b w:val="1"/>
+      <w:i w:val="1"/>
       <w:color w:val="60a0b0"/>
     </w:rPr>
   </w:style>
-  <w:style w:type="character" w:customStyle="1" w:styleId="AlertTok">
+  <w:style w:type="character" w:styleId="AlertTok" w:customStyle="1">
     <w:name w:val="AlertTok"/>
     <w:basedOn w:val="VerbatimChar"/>
     <w:rPr>
-      <w:b/>
+      <w:b w:val="1"/>
       <w:color w:val="ff0000"/>
     </w:rPr>
   </w:style>
-  <w:style w:type="character" w:customStyle="1" w:styleId="ErrorTok">
+  <w:style w:type="character" w:styleId="ErrorTok" w:customStyle="1">
     <w:name w:val="ErrorTok"/>
     <w:basedOn w:val="VerbatimChar"/>
     <w:rPr>
-      <w:b/>
+      <w:b w:val="1"/>
       <w:color w:val="ff0000"/>
     </w:rPr>
   </w:style>
-  <w:style w:type="character" w:customStyle="1" w:styleId="NormalTok">
+  <w:style w:type="character" w:styleId="NormalTok" w:customStyle="1">
     <w:name w:val="NormalTok"/>
     <w:basedOn w:val="VerbatimChar"/>
     <w:rPr/>
+  </w:style>
+  <w:style w:type="paragraph" w:styleId="Subtitle">
+    <w:name w:val="Subtitle"/>
+    <w:basedOn w:val="Normal"/>
+    <w:next w:val="Normal"/>
+    <w:pPr>
+      <w:spacing w:after="80" w:line="240" w:lineRule="auto"/>
+      <w:jc w:val="center"/>
+    </w:pPr>
+    <w:rPr>
+      <w:rFonts w:ascii="Play" w:cs="Play" w:eastAsia="Play" w:hAnsi="Play"/>
+      <w:sz w:val="28"/>
+      <w:szCs w:val="28"/>
+    </w:rPr>
+  </w:style>
+  <w:style w:type="table" w:styleId="Table1">
+    <w:basedOn w:val="TableNormal"/>
+    <w:tblPr>
+      <w:tblStyleRowBandSize w:val="1"/>
+      <w:tblStyleColBandSize w:val="1"/>
+      <w:tblCellMar>
+        <w:top w:w="0.0" w:type="dxa"/>
+        <w:left w:w="108.0" w:type="dxa"/>
+        <w:bottom w:w="0.0" w:type="dxa"/>
+        <w:right w:w="108.0" w:type="dxa"/>
+      </w:tblCellMar>
+    </w:tblPr>
+    <w:tblStylePr w:type="firstRow">
+      <w:tcPr>
+        <w:tcBorders>
+          <w:bottom w:color="000000" w:space="0" w:sz="0" w:val="nil"/>
+        </w:tcBorders>
+        <w:vAlign w:val="bottom"/>
+      </w:tcPr>
+    </w:tblStylePr>
+  </w:style>
+  <w:style w:type="table" w:styleId="Table2">
+    <w:basedOn w:val="TableNormal"/>
+    <w:tblPr>
+      <w:tblStyleRowBandSize w:val="1"/>
+      <w:tblStyleColBandSize w:val="1"/>
+      <w:tblCellMar>
+        <w:top w:w="0.0" w:type="dxa"/>
+        <w:left w:w="108.0" w:type="dxa"/>
+        <w:bottom w:w="0.0" w:type="dxa"/>
+        <w:right w:w="108.0" w:type="dxa"/>
+      </w:tblCellMar>
+    </w:tblPr>
+    <w:tblStylePr w:type="firstRow">
+      <w:tcPr>
+        <w:tcBorders>
+          <w:bottom w:color="000000" w:space="0" w:sz="0" w:val="nil"/>
+        </w:tcBorders>
+        <w:vAlign w:val="bottom"/>
+      </w:tcPr>
+    </w:tblStylePr>
   </w:style>
 </w:styles>
 </file>
@@ -2131,4 +4405,19 @@
     </a:ext>
   </a:extLst>
 </a:theme>
+</file>
+
+<file path=customXML/item1.xml><?xml version="1.0" encoding="utf-8"?>
+<go:gDocsCustomXmlDataStorage xmlns:go="http://customooxmlschemas.google.com/" xmlns:r="http://schemas.openxmlformats.org/officeDocument/2006/relationships" uri="GoogleDocsCustomDataVersion2">
+  <go:docsCustomData xmlns:go="http://customooxmlschemas.google.com/" roundtripDataSignature="AMtx7mitLBxNoJNHNo9Bd0vffdPK1QD9qw==">CgMxLjAyD2lkLmE0b3l6ejE1aW0yNjIPaWQuNG43NzFidXlxNnAyMg9pZC5rcXp1azBsNmt5MmcyD2lkLmxsOWI0NDQyY3k2NTIPaWQucjlmYWdsazl0cHlhMg9pZC5kMTFidnl2cjM3N24yD2lkLm5kemN1bTQxeWtwajgAciExcHRDTTV6Z2s1RC1Wcm14MTBlQThiSTNOR09BQnlHQnM=</go:docsCustomData>
+</go:gDocsCustomXmlDataStorage>
+</file>
+
+<file path=customXML/itemProps1.xml><?xml version="1.0" encoding="utf-8"?>
+<ds:datastoreItem xmlns:ds="http://schemas.openxmlformats.org/officeDocument/2006/customXml" ds:itemID="{11111111-1234-1234-1234-123412341234}">
+  <ds:schemaRefs>
+    <ds:schemaRef ds:uri="http://schemas.openxmlformats.org/officeDocument/2006/relationships"/>
+    <ds:schemaRef ds:uri="http://customooxmlschemas.google.com/"/>
+  </ds:schemaRefs>
+</ds:datastoreItem>
 </file>
</xml_diff>